<commit_message>
table writer fmea pu
</commit_message>
<xml_diff>
--- a/src/main/resources/templates/FMEA.docx
+++ b/src/main/resources/templates/FMEA.docx
@@ -1,6 +1,6 @@
 
 <file path=word/document.xml><?xml version="1.0" encoding="utf-8"?>
-<w:document xmlns:wpc="http://schemas.microsoft.com/office/word/2010/wordprocessingCanvas" xmlns:cx="http://schemas.microsoft.com/office/drawing/2014/chartex" xmlns:cx1="http://schemas.microsoft.com/office/drawing/2015/9/8/chartex" xmlns:cx2="http://schemas.microsoft.com/office/drawing/2015/10/21/chartex" xmlns:cx3="http://schemas.microsoft.com/office/drawing/2016/5/9/chartex" xmlns:cx4="http://schemas.microsoft.com/office/drawing/2016/5/10/chartex" xmlns:cx5="http://schemas.microsoft.com/office/drawing/2016/5/11/chartex" xmlns:cx6="http://schemas.microsoft.com/office/drawing/2016/5/12/chartex" xmlns:cx7="http://schemas.microsoft.com/office/drawing/2016/5/13/chartex" xmlns:cx8="http://schemas.microsoft.com/office/drawing/2016/5/14/chartex" xmlns:mc="http://schemas.openxmlformats.org/markup-compatibility/2006" xmlns:aink="http://schemas.microsoft.com/office/drawing/2016/ink" xmlns:am3d="http://schemas.microsoft.com/office/drawing/2017/model3d" xmlns:o="urn:schemas-microsoft-com:office:office" xmlns:oel="http://schemas.microsoft.com/office/2019/extlst" xmlns:r="http://schemas.openxmlformats.org/officeDocument/2006/relationships" xmlns:m="http://schemas.openxmlformats.org/officeDocument/2006/math" xmlns:v="urn:schemas-microsoft-com:vml" xmlns:wp14="http://schemas.microsoft.com/office/word/2010/wordprocessingDrawing" xmlns:wp="http://schemas.openxmlformats.org/drawingml/2006/wordprocessingDrawing" xmlns:w10="urn:schemas-microsoft-com:office:word" xmlns:w="http://schemas.openxmlformats.org/wordprocessingml/2006/main" xmlns:w14="http://schemas.microsoft.com/office/word/2010/wordml" xmlns:w15="http://schemas.microsoft.com/office/word/2012/wordml" xmlns:w16cex="http://schemas.microsoft.com/office/word/2018/wordml/cex" xmlns:w16cid="http://schemas.microsoft.com/office/word/2016/wordml/cid" xmlns:w16="http://schemas.microsoft.com/office/word/2018/wordml" xmlns:w16du="http://schemas.microsoft.com/office/word/2023/wordml/word16du" xmlns:w16sdtdh="http://schemas.microsoft.com/office/word/2020/wordml/sdtdatahash" xmlns:w16sdtfl="http://schemas.microsoft.com/office/word/2024/wordml/sdtformatlock" xmlns:w16se="http://schemas.microsoft.com/office/word/2015/wordml/symex" xmlns:wpg="http://schemas.microsoft.com/office/word/2010/wordprocessingGroup" xmlns:wpi="http://schemas.microsoft.com/office/word/2010/wordprocessingInk" xmlns:wne="http://schemas.microsoft.com/office/word/2006/wordml" xmlns:wps="http://schemas.microsoft.com/office/word/2010/wordprocessingShape" mc:Ignorable="w14 w15 w16se w16cid w16 w16cex w16sdtdh w16sdtfl w16du wp14">
+<w:document xmlns:wpc="http://schemas.microsoft.com/office/word/2010/wordprocessingCanvas" xmlns:cx="http://schemas.microsoft.com/office/drawing/2014/chartex" xmlns:cx1="http://schemas.microsoft.com/office/drawing/2015/9/8/chartex" xmlns:cx2="http://schemas.microsoft.com/office/drawing/2015/10/21/chartex" xmlns:cx3="http://schemas.microsoft.com/office/drawing/2016/5/9/chartex" xmlns:cx4="http://schemas.microsoft.com/office/drawing/2016/5/10/chartex" xmlns:cx5="http://schemas.microsoft.com/office/drawing/2016/5/11/chartex" xmlns:cx6="http://schemas.microsoft.com/office/drawing/2016/5/12/chartex" xmlns:cx7="http://schemas.microsoft.com/office/drawing/2016/5/13/chartex" xmlns:cx8="http://schemas.microsoft.com/office/drawing/2016/5/14/chartex" xmlns:mc="http://schemas.openxmlformats.org/markup-compatibility/2006" xmlns:aink="http://schemas.microsoft.com/office/drawing/2016/ink" xmlns:am3d="http://schemas.microsoft.com/office/drawing/2017/model3d" xmlns:o="urn:schemas-microsoft-com:office:office" xmlns:r="http://schemas.openxmlformats.org/officeDocument/2006/relationships" xmlns:m="http://schemas.openxmlformats.org/officeDocument/2006/math" xmlns:v="urn:schemas-microsoft-com:vml" xmlns:wp14="http://schemas.microsoft.com/office/word/2010/wordprocessingDrawing" xmlns:wp="http://schemas.openxmlformats.org/drawingml/2006/wordprocessingDrawing" xmlns:w10="urn:schemas-microsoft-com:office:word" xmlns:w="http://schemas.openxmlformats.org/wordprocessingml/2006/main" xmlns:w14="http://schemas.microsoft.com/office/word/2010/wordml" xmlns:w15="http://schemas.microsoft.com/office/word/2012/wordml" xmlns:w16cid="http://schemas.microsoft.com/office/word/2016/wordml/cid" xmlns:w16se="http://schemas.microsoft.com/office/word/2015/wordml/symex" xmlns:wpg="http://schemas.microsoft.com/office/word/2010/wordprocessingGroup" xmlns:wpi="http://schemas.microsoft.com/office/word/2010/wordprocessingInk" xmlns:wne="http://schemas.microsoft.com/office/word/2006/wordml" xmlns:wps="http://schemas.microsoft.com/office/word/2010/wordprocessingShape" mc:Ignorable="w14 w15 w16se w16cid wp14">
   <w:body>
     <w:tbl>
       <w:tblPr>
@@ -55,7 +55,10 @@
                 <w:rFonts w:ascii="Arial Narrow" w:hAnsi="Arial Narrow" w:cs="Tahoma"/>
               </w:rPr>
             </w:pPr>
+            <w:bookmarkStart w:id="0" w:name="_GoBack"/>
+            <w:bookmarkEnd w:id="0"/>
             <w:proofErr w:type="spellStart"/>
+            <w:proofErr w:type="gramStart"/>
             <w:r>
               <w:rPr>
                 <w:rFonts w:ascii="Arial Narrow" w:hAnsi="Arial Narrow" w:cs="Tahoma"/>
@@ -63,6 +66,7 @@
               <w:t>Посто-янное</w:t>
             </w:r>
             <w:proofErr w:type="spellEnd"/>
+            <w:proofErr w:type="gramEnd"/>
             <w:r>
               <w:rPr>
                 <w:rFonts w:ascii="Arial Narrow" w:hAnsi="Arial Narrow" w:cs="Tahoma"/>
@@ -275,7 +279,16 @@
                 <w:sz w:val="20"/>
                 <w:szCs w:val="20"/>
               </w:rPr>
-              <w:t>1. Едини-</w:t>
+              <w:t xml:space="preserve">1. </w:t>
+            </w:r>
+            <w:proofErr w:type="gramStart"/>
+            <w:r>
+              <w:rPr>
+                <w:rFonts w:ascii="Arial Narrow" w:hAnsi="Arial Narrow" w:cs="Tahoma"/>
+                <w:sz w:val="20"/>
+                <w:szCs w:val="20"/>
+              </w:rPr>
+              <w:t>Едини-</w:t>
             </w:r>
             <w:proofErr w:type="spellStart"/>
             <w:r>
@@ -287,6 +300,7 @@
               <w:t>ца</w:t>
             </w:r>
             <w:proofErr w:type="spellEnd"/>
+            <w:proofErr w:type="gramEnd"/>
             <w:r>
               <w:rPr>
                 <w:rFonts w:ascii="Arial Narrow" w:hAnsi="Arial Narrow" w:cs="Tahoma"/>
@@ -368,6 +382,7 @@
               <w:t xml:space="preserve">3.Эле мент </w:t>
             </w:r>
             <w:proofErr w:type="spellStart"/>
+            <w:proofErr w:type="gramStart"/>
             <w:r>
               <w:rPr>
                 <w:rFonts w:ascii="Arial Narrow" w:hAnsi="Arial Narrow" w:cs="Tahoma"/>
@@ -383,7 +398,16 @@
                 <w:sz w:val="20"/>
                 <w:szCs w:val="20"/>
               </w:rPr>
-              <w:t>-ты процесса вида 4М</w:t>
+              <w:t>-ты</w:t>
+            </w:r>
+            <w:proofErr w:type="gramEnd"/>
+            <w:r>
+              <w:rPr>
+                <w:rFonts w:ascii="Arial Narrow" w:hAnsi="Arial Narrow" w:cs="Tahoma"/>
+                <w:sz w:val="20"/>
+                <w:szCs w:val="20"/>
+              </w:rPr>
+              <w:t xml:space="preserve"> процесса вида 4М</w:t>
             </w:r>
           </w:p>
         </w:tc>
@@ -409,6 +433,7 @@
               <w:t xml:space="preserve">1. Функция единицы процесса. Функция системы, </w:t>
             </w:r>
             <w:proofErr w:type="spellStart"/>
+            <w:proofErr w:type="gramStart"/>
             <w:r>
               <w:rPr>
                 <w:rFonts w:ascii="Arial Narrow" w:hAnsi="Arial Narrow" w:cs="Tahoma"/>
@@ -424,7 +449,16 @@
                 <w:sz w:val="20"/>
                 <w:szCs w:val="20"/>
               </w:rPr>
-              <w:t>-мы, элемента части или процесса</w:t>
+              <w:t>-мы</w:t>
+            </w:r>
+            <w:proofErr w:type="gramEnd"/>
+            <w:r>
+              <w:rPr>
+                <w:rFonts w:ascii="Arial Narrow" w:hAnsi="Arial Narrow" w:cs="Tahoma"/>
+                <w:sz w:val="20"/>
+                <w:szCs w:val="20"/>
+              </w:rPr>
+              <w:t>, элемента части или процесса</w:t>
             </w:r>
           </w:p>
         </w:tc>
@@ -468,6 +502,7 @@
               <w:t xml:space="preserve"> продукции (количественное значение не </w:t>
             </w:r>
             <w:proofErr w:type="spellStart"/>
+            <w:proofErr w:type="gramStart"/>
             <w:r>
               <w:rPr>
                 <w:rFonts w:ascii="Arial Narrow" w:hAnsi="Arial Narrow" w:cs="Tahoma"/>
@@ -477,6 +512,7 @@
               <w:t>обя-зательно</w:t>
             </w:r>
             <w:proofErr w:type="spellEnd"/>
+            <w:proofErr w:type="gramEnd"/>
             <w:r>
               <w:rPr>
                 <w:rFonts w:ascii="Arial Narrow" w:hAnsi="Arial Narrow" w:cs="Tahoma"/>
@@ -778,6 +814,7 @@
               <w:t xml:space="preserve">Текущие меры управления по </w:t>
             </w:r>
             <w:proofErr w:type="spellStart"/>
+            <w:proofErr w:type="gramStart"/>
             <w:r>
               <w:rPr>
                 <w:rFonts w:ascii="Arial Narrow" w:hAnsi="Arial Narrow" w:cs="Tahoma"/>
@@ -787,6 +824,7 @@
               <w:t>обнаруже-нию</w:t>
             </w:r>
             <w:proofErr w:type="spellEnd"/>
+            <w:proofErr w:type="gramEnd"/>
             <w:r>
               <w:rPr>
                 <w:rFonts w:ascii="Arial Narrow" w:hAnsi="Arial Narrow" w:cs="Tahoma"/>
@@ -1035,6 +1073,7 @@
               <w:t xml:space="preserve">Предпринятые </w:t>
             </w:r>
             <w:proofErr w:type="spellStart"/>
+            <w:proofErr w:type="gramStart"/>
             <w:r>
               <w:rPr>
                 <w:rFonts w:ascii="Arial Narrow" w:hAnsi="Arial Narrow" w:cs="Tahoma"/>
@@ -1050,7 +1089,16 @@
                 <w:sz w:val="20"/>
                 <w:szCs w:val="20"/>
               </w:rPr>
-              <w:t xml:space="preserve">-вия с указателем на </w:t>
+              <w:t>-вия</w:t>
+            </w:r>
+            <w:proofErr w:type="gramEnd"/>
+            <w:r>
+              <w:rPr>
+                <w:rFonts w:ascii="Arial Narrow" w:hAnsi="Arial Narrow" w:cs="Tahoma"/>
+                <w:sz w:val="20"/>
+                <w:szCs w:val="20"/>
+              </w:rPr>
+              <w:t xml:space="preserve"> с указателем на </w:t>
             </w:r>
             <w:proofErr w:type="spellStart"/>
             <w:r>
@@ -1834,7 +1882,7 @@
 </file>
 
 <file path=word/endnotes.xml><?xml version="1.0" encoding="utf-8"?>
-<w:endnotes xmlns:wpc="http://schemas.microsoft.com/office/word/2010/wordprocessingCanvas" xmlns:cx="http://schemas.microsoft.com/office/drawing/2014/chartex" xmlns:cx1="http://schemas.microsoft.com/office/drawing/2015/9/8/chartex" xmlns:cx2="http://schemas.microsoft.com/office/drawing/2015/10/21/chartex" xmlns:cx3="http://schemas.microsoft.com/office/drawing/2016/5/9/chartex" xmlns:cx4="http://schemas.microsoft.com/office/drawing/2016/5/10/chartex" xmlns:cx5="http://schemas.microsoft.com/office/drawing/2016/5/11/chartex" xmlns:cx6="http://schemas.microsoft.com/office/drawing/2016/5/12/chartex" xmlns:cx7="http://schemas.microsoft.com/office/drawing/2016/5/13/chartex" xmlns:cx8="http://schemas.microsoft.com/office/drawing/2016/5/14/chartex" xmlns:mc="http://schemas.openxmlformats.org/markup-compatibility/2006" xmlns:aink="http://schemas.microsoft.com/office/drawing/2016/ink" xmlns:am3d="http://schemas.microsoft.com/office/drawing/2017/model3d" xmlns:o="urn:schemas-microsoft-com:office:office" xmlns:oel="http://schemas.microsoft.com/office/2019/extlst" xmlns:r="http://schemas.openxmlformats.org/officeDocument/2006/relationships" xmlns:m="http://schemas.openxmlformats.org/officeDocument/2006/math" xmlns:v="urn:schemas-microsoft-com:vml" xmlns:wp14="http://schemas.microsoft.com/office/word/2010/wordprocessingDrawing" xmlns:wp="http://schemas.openxmlformats.org/drawingml/2006/wordprocessingDrawing" xmlns:w10="urn:schemas-microsoft-com:office:word" xmlns:w="http://schemas.openxmlformats.org/wordprocessingml/2006/main" xmlns:w14="http://schemas.microsoft.com/office/word/2010/wordml" xmlns:w15="http://schemas.microsoft.com/office/word/2012/wordml" xmlns:w16cex="http://schemas.microsoft.com/office/word/2018/wordml/cex" xmlns:w16cid="http://schemas.microsoft.com/office/word/2016/wordml/cid" xmlns:w16="http://schemas.microsoft.com/office/word/2018/wordml" xmlns:w16du="http://schemas.microsoft.com/office/word/2023/wordml/word16du" xmlns:w16sdtdh="http://schemas.microsoft.com/office/word/2020/wordml/sdtdatahash" xmlns:w16sdtfl="http://schemas.microsoft.com/office/word/2024/wordml/sdtformatlock" xmlns:w16se="http://schemas.microsoft.com/office/word/2015/wordml/symex" xmlns:wpg="http://schemas.microsoft.com/office/word/2010/wordprocessingGroup" xmlns:wpi="http://schemas.microsoft.com/office/word/2010/wordprocessingInk" xmlns:wne="http://schemas.microsoft.com/office/word/2006/wordml" xmlns:wps="http://schemas.microsoft.com/office/word/2010/wordprocessingShape" mc:Ignorable="w14 w15 w16se w16cid w16 w16cex w16sdtdh w16sdtfl w16du wp14">
+<w:endnotes xmlns:wpc="http://schemas.microsoft.com/office/word/2010/wordprocessingCanvas" xmlns:cx="http://schemas.microsoft.com/office/drawing/2014/chartex" xmlns:cx1="http://schemas.microsoft.com/office/drawing/2015/9/8/chartex" xmlns:cx2="http://schemas.microsoft.com/office/drawing/2015/10/21/chartex" xmlns:cx3="http://schemas.microsoft.com/office/drawing/2016/5/9/chartex" xmlns:cx4="http://schemas.microsoft.com/office/drawing/2016/5/10/chartex" xmlns:cx5="http://schemas.microsoft.com/office/drawing/2016/5/11/chartex" xmlns:cx6="http://schemas.microsoft.com/office/drawing/2016/5/12/chartex" xmlns:cx7="http://schemas.microsoft.com/office/drawing/2016/5/13/chartex" xmlns:cx8="http://schemas.microsoft.com/office/drawing/2016/5/14/chartex" xmlns:mc="http://schemas.openxmlformats.org/markup-compatibility/2006" xmlns:aink="http://schemas.microsoft.com/office/drawing/2016/ink" xmlns:am3d="http://schemas.microsoft.com/office/drawing/2017/model3d" xmlns:o="urn:schemas-microsoft-com:office:office" xmlns:r="http://schemas.openxmlformats.org/officeDocument/2006/relationships" xmlns:m="http://schemas.openxmlformats.org/officeDocument/2006/math" xmlns:v="urn:schemas-microsoft-com:vml" xmlns:wp14="http://schemas.microsoft.com/office/word/2010/wordprocessingDrawing" xmlns:wp="http://schemas.openxmlformats.org/drawingml/2006/wordprocessingDrawing" xmlns:w10="urn:schemas-microsoft-com:office:word" xmlns:w="http://schemas.openxmlformats.org/wordprocessingml/2006/main" xmlns:w14="http://schemas.microsoft.com/office/word/2010/wordml" xmlns:w15="http://schemas.microsoft.com/office/word/2012/wordml" xmlns:w16cid="http://schemas.microsoft.com/office/word/2016/wordml/cid" xmlns:w16se="http://schemas.microsoft.com/office/word/2015/wordml/symex" xmlns:wpg="http://schemas.microsoft.com/office/word/2010/wordprocessingGroup" xmlns:wpi="http://schemas.microsoft.com/office/word/2010/wordprocessingInk" xmlns:wne="http://schemas.microsoft.com/office/word/2006/wordml" xmlns:wps="http://schemas.microsoft.com/office/word/2010/wordprocessingShape" mc:Ignorable="w14 w15 w16se w16cid wp14">
   <w:endnote w:type="separator" w:id="-1">
     <w:p>
       <w:pPr>
@@ -1859,7 +1907,7 @@
 </file>
 
 <file path=word/footnotes.xml><?xml version="1.0" encoding="utf-8"?>
-<w:footnotes xmlns:wpc="http://schemas.microsoft.com/office/word/2010/wordprocessingCanvas" xmlns:cx="http://schemas.microsoft.com/office/drawing/2014/chartex" xmlns:cx1="http://schemas.microsoft.com/office/drawing/2015/9/8/chartex" xmlns:cx2="http://schemas.microsoft.com/office/drawing/2015/10/21/chartex" xmlns:cx3="http://schemas.microsoft.com/office/drawing/2016/5/9/chartex" xmlns:cx4="http://schemas.microsoft.com/office/drawing/2016/5/10/chartex" xmlns:cx5="http://schemas.microsoft.com/office/drawing/2016/5/11/chartex" xmlns:cx6="http://schemas.microsoft.com/office/drawing/2016/5/12/chartex" xmlns:cx7="http://schemas.microsoft.com/office/drawing/2016/5/13/chartex" xmlns:cx8="http://schemas.microsoft.com/office/drawing/2016/5/14/chartex" xmlns:mc="http://schemas.openxmlformats.org/markup-compatibility/2006" xmlns:aink="http://schemas.microsoft.com/office/drawing/2016/ink" xmlns:am3d="http://schemas.microsoft.com/office/drawing/2017/model3d" xmlns:o="urn:schemas-microsoft-com:office:office" xmlns:oel="http://schemas.microsoft.com/office/2019/extlst" xmlns:r="http://schemas.openxmlformats.org/officeDocument/2006/relationships" xmlns:m="http://schemas.openxmlformats.org/officeDocument/2006/math" xmlns:v="urn:schemas-microsoft-com:vml" xmlns:wp14="http://schemas.microsoft.com/office/word/2010/wordprocessingDrawing" xmlns:wp="http://schemas.openxmlformats.org/drawingml/2006/wordprocessingDrawing" xmlns:w10="urn:schemas-microsoft-com:office:word" xmlns:w="http://schemas.openxmlformats.org/wordprocessingml/2006/main" xmlns:w14="http://schemas.microsoft.com/office/word/2010/wordml" xmlns:w15="http://schemas.microsoft.com/office/word/2012/wordml" xmlns:w16cex="http://schemas.microsoft.com/office/word/2018/wordml/cex" xmlns:w16cid="http://schemas.microsoft.com/office/word/2016/wordml/cid" xmlns:w16="http://schemas.microsoft.com/office/word/2018/wordml" xmlns:w16du="http://schemas.microsoft.com/office/word/2023/wordml/word16du" xmlns:w16sdtdh="http://schemas.microsoft.com/office/word/2020/wordml/sdtdatahash" xmlns:w16sdtfl="http://schemas.microsoft.com/office/word/2024/wordml/sdtformatlock" xmlns:w16se="http://schemas.microsoft.com/office/word/2015/wordml/symex" xmlns:wpg="http://schemas.microsoft.com/office/word/2010/wordprocessingGroup" xmlns:wpi="http://schemas.microsoft.com/office/word/2010/wordprocessingInk" xmlns:wne="http://schemas.microsoft.com/office/word/2006/wordml" xmlns:wps="http://schemas.microsoft.com/office/word/2010/wordprocessingShape" mc:Ignorable="w14 w15 w16se w16cid w16 w16cex w16sdtdh w16sdtfl w16du wp14">
+<w:footnotes xmlns:wpc="http://schemas.microsoft.com/office/word/2010/wordprocessingCanvas" xmlns:cx="http://schemas.microsoft.com/office/drawing/2014/chartex" xmlns:cx1="http://schemas.microsoft.com/office/drawing/2015/9/8/chartex" xmlns:cx2="http://schemas.microsoft.com/office/drawing/2015/10/21/chartex" xmlns:cx3="http://schemas.microsoft.com/office/drawing/2016/5/9/chartex" xmlns:cx4="http://schemas.microsoft.com/office/drawing/2016/5/10/chartex" xmlns:cx5="http://schemas.microsoft.com/office/drawing/2016/5/11/chartex" xmlns:cx6="http://schemas.microsoft.com/office/drawing/2016/5/12/chartex" xmlns:cx7="http://schemas.microsoft.com/office/drawing/2016/5/13/chartex" xmlns:cx8="http://schemas.microsoft.com/office/drawing/2016/5/14/chartex" xmlns:mc="http://schemas.openxmlformats.org/markup-compatibility/2006" xmlns:aink="http://schemas.microsoft.com/office/drawing/2016/ink" xmlns:am3d="http://schemas.microsoft.com/office/drawing/2017/model3d" xmlns:o="urn:schemas-microsoft-com:office:office" xmlns:r="http://schemas.openxmlformats.org/officeDocument/2006/relationships" xmlns:m="http://schemas.openxmlformats.org/officeDocument/2006/math" xmlns:v="urn:schemas-microsoft-com:vml" xmlns:wp14="http://schemas.microsoft.com/office/word/2010/wordprocessingDrawing" xmlns:wp="http://schemas.openxmlformats.org/drawingml/2006/wordprocessingDrawing" xmlns:w10="urn:schemas-microsoft-com:office:word" xmlns:w="http://schemas.openxmlformats.org/wordprocessingml/2006/main" xmlns:w14="http://schemas.microsoft.com/office/word/2010/wordml" xmlns:w15="http://schemas.microsoft.com/office/word/2012/wordml" xmlns:w16cid="http://schemas.microsoft.com/office/word/2016/wordml/cid" xmlns:w16se="http://schemas.microsoft.com/office/word/2015/wordml/symex" xmlns:wpg="http://schemas.microsoft.com/office/word/2010/wordprocessingGroup" xmlns:wpi="http://schemas.microsoft.com/office/word/2010/wordprocessingInk" xmlns:wne="http://schemas.microsoft.com/office/word/2006/wordml" xmlns:wps="http://schemas.microsoft.com/office/word/2010/wordprocessingShape" mc:Ignorable="w14 w15 w16se w16cid wp14">
   <w:footnote w:type="separator" w:id="-1">
     <w:p>
       <w:pPr>
@@ -1884,7 +1932,7 @@
 </file>
 
 <file path=word/header1.xml><?xml version="1.0" encoding="utf-8"?>
-<w:hdr xmlns:wpc="http://schemas.microsoft.com/office/word/2010/wordprocessingCanvas" xmlns:cx="http://schemas.microsoft.com/office/drawing/2014/chartex" xmlns:cx1="http://schemas.microsoft.com/office/drawing/2015/9/8/chartex" xmlns:cx2="http://schemas.microsoft.com/office/drawing/2015/10/21/chartex" xmlns:cx3="http://schemas.microsoft.com/office/drawing/2016/5/9/chartex" xmlns:cx4="http://schemas.microsoft.com/office/drawing/2016/5/10/chartex" xmlns:cx5="http://schemas.microsoft.com/office/drawing/2016/5/11/chartex" xmlns:cx6="http://schemas.microsoft.com/office/drawing/2016/5/12/chartex" xmlns:cx7="http://schemas.microsoft.com/office/drawing/2016/5/13/chartex" xmlns:cx8="http://schemas.microsoft.com/office/drawing/2016/5/14/chartex" xmlns:mc="http://schemas.openxmlformats.org/markup-compatibility/2006" xmlns:aink="http://schemas.microsoft.com/office/drawing/2016/ink" xmlns:am3d="http://schemas.microsoft.com/office/drawing/2017/model3d" xmlns:o="urn:schemas-microsoft-com:office:office" xmlns:oel="http://schemas.microsoft.com/office/2019/extlst" xmlns:r="http://schemas.openxmlformats.org/officeDocument/2006/relationships" xmlns:m="http://schemas.openxmlformats.org/officeDocument/2006/math" xmlns:v="urn:schemas-microsoft-com:vml" xmlns:wp14="http://schemas.microsoft.com/office/word/2010/wordprocessingDrawing" xmlns:wp="http://schemas.openxmlformats.org/drawingml/2006/wordprocessingDrawing" xmlns:w10="urn:schemas-microsoft-com:office:word" xmlns:w="http://schemas.openxmlformats.org/wordprocessingml/2006/main" xmlns:w14="http://schemas.microsoft.com/office/word/2010/wordml" xmlns:w15="http://schemas.microsoft.com/office/word/2012/wordml" xmlns:w16cex="http://schemas.microsoft.com/office/word/2018/wordml/cex" xmlns:w16cid="http://schemas.microsoft.com/office/word/2016/wordml/cid" xmlns:w16="http://schemas.microsoft.com/office/word/2018/wordml" xmlns:w16du="http://schemas.microsoft.com/office/word/2023/wordml/word16du" xmlns:w16sdtdh="http://schemas.microsoft.com/office/word/2020/wordml/sdtdatahash" xmlns:w16sdtfl="http://schemas.microsoft.com/office/word/2024/wordml/sdtformatlock" xmlns:w16se="http://schemas.microsoft.com/office/word/2015/wordml/symex" xmlns:wpg="http://schemas.microsoft.com/office/word/2010/wordprocessingGroup" xmlns:wpi="http://schemas.microsoft.com/office/word/2010/wordprocessingInk" xmlns:wne="http://schemas.microsoft.com/office/word/2006/wordml" xmlns:wps="http://schemas.microsoft.com/office/word/2010/wordprocessingShape" mc:Ignorable="w14 w15 w16se w16cid w16 w16cex w16sdtdh w16sdtfl w16du wp14">
+<w:hdr xmlns:wpc="http://schemas.microsoft.com/office/word/2010/wordprocessingCanvas" xmlns:cx="http://schemas.microsoft.com/office/drawing/2014/chartex" xmlns:cx1="http://schemas.microsoft.com/office/drawing/2015/9/8/chartex" xmlns:cx2="http://schemas.microsoft.com/office/drawing/2015/10/21/chartex" xmlns:cx3="http://schemas.microsoft.com/office/drawing/2016/5/9/chartex" xmlns:cx4="http://schemas.microsoft.com/office/drawing/2016/5/10/chartex" xmlns:cx5="http://schemas.microsoft.com/office/drawing/2016/5/11/chartex" xmlns:cx6="http://schemas.microsoft.com/office/drawing/2016/5/12/chartex" xmlns:cx7="http://schemas.microsoft.com/office/drawing/2016/5/13/chartex" xmlns:cx8="http://schemas.microsoft.com/office/drawing/2016/5/14/chartex" xmlns:mc="http://schemas.openxmlformats.org/markup-compatibility/2006" xmlns:aink="http://schemas.microsoft.com/office/drawing/2016/ink" xmlns:am3d="http://schemas.microsoft.com/office/drawing/2017/model3d" xmlns:o="urn:schemas-microsoft-com:office:office" xmlns:r="http://schemas.openxmlformats.org/officeDocument/2006/relationships" xmlns:m="http://schemas.openxmlformats.org/officeDocument/2006/math" xmlns:v="urn:schemas-microsoft-com:vml" xmlns:wp14="http://schemas.microsoft.com/office/word/2010/wordprocessingDrawing" xmlns:wp="http://schemas.openxmlformats.org/drawingml/2006/wordprocessingDrawing" xmlns:w10="urn:schemas-microsoft-com:office:word" xmlns:w="http://schemas.openxmlformats.org/wordprocessingml/2006/main" xmlns:w14="http://schemas.microsoft.com/office/word/2010/wordml" xmlns:w15="http://schemas.microsoft.com/office/word/2012/wordml" xmlns:w16cid="http://schemas.microsoft.com/office/word/2016/wordml/cid" xmlns:w16se="http://schemas.microsoft.com/office/word/2015/wordml/symex" xmlns:wpg="http://schemas.microsoft.com/office/word/2010/wordprocessingGroup" xmlns:wpi="http://schemas.microsoft.com/office/word/2010/wordprocessingInk" xmlns:wne="http://schemas.microsoft.com/office/word/2006/wordml" xmlns:wps="http://schemas.microsoft.com/office/word/2010/wordprocessingShape" mc:Ignorable="w14 w15 w16se w16cid wp14">
   <w:tbl>
     <w:tblPr>
       <w:tblStyle w:val="a7"/>
@@ -2639,6 +2687,7 @@
                     <w:docPartUnique/>
                   </w:docPartObj>
                 </w:sdtPr>
+                <w:sdtEndPr/>
                 <w:sdtContent>
                   <w:r>
                     <w:rPr>
@@ -3522,7 +3571,7 @@
 </file>
 
 <file path=word/header2.xml><?xml version="1.0" encoding="utf-8"?>
-<w:hdr xmlns:wpc="http://schemas.microsoft.com/office/word/2010/wordprocessingCanvas" xmlns:cx="http://schemas.microsoft.com/office/drawing/2014/chartex" xmlns:cx1="http://schemas.microsoft.com/office/drawing/2015/9/8/chartex" xmlns:cx2="http://schemas.microsoft.com/office/drawing/2015/10/21/chartex" xmlns:cx3="http://schemas.microsoft.com/office/drawing/2016/5/9/chartex" xmlns:cx4="http://schemas.microsoft.com/office/drawing/2016/5/10/chartex" xmlns:cx5="http://schemas.microsoft.com/office/drawing/2016/5/11/chartex" xmlns:cx6="http://schemas.microsoft.com/office/drawing/2016/5/12/chartex" xmlns:cx7="http://schemas.microsoft.com/office/drawing/2016/5/13/chartex" xmlns:cx8="http://schemas.microsoft.com/office/drawing/2016/5/14/chartex" xmlns:mc="http://schemas.openxmlformats.org/markup-compatibility/2006" xmlns:aink="http://schemas.microsoft.com/office/drawing/2016/ink" xmlns:am3d="http://schemas.microsoft.com/office/drawing/2017/model3d" xmlns:o="urn:schemas-microsoft-com:office:office" xmlns:oel="http://schemas.microsoft.com/office/2019/extlst" xmlns:r="http://schemas.openxmlformats.org/officeDocument/2006/relationships" xmlns:m="http://schemas.openxmlformats.org/officeDocument/2006/math" xmlns:v="urn:schemas-microsoft-com:vml" xmlns:wp14="http://schemas.microsoft.com/office/word/2010/wordprocessingDrawing" xmlns:wp="http://schemas.openxmlformats.org/drawingml/2006/wordprocessingDrawing" xmlns:w10="urn:schemas-microsoft-com:office:word" xmlns:w="http://schemas.openxmlformats.org/wordprocessingml/2006/main" xmlns:w14="http://schemas.microsoft.com/office/word/2010/wordml" xmlns:w15="http://schemas.microsoft.com/office/word/2012/wordml" xmlns:w16cex="http://schemas.microsoft.com/office/word/2018/wordml/cex" xmlns:w16cid="http://schemas.microsoft.com/office/word/2016/wordml/cid" xmlns:w16="http://schemas.microsoft.com/office/word/2018/wordml" xmlns:w16du="http://schemas.microsoft.com/office/word/2023/wordml/word16du" xmlns:w16sdtdh="http://schemas.microsoft.com/office/word/2020/wordml/sdtdatahash" xmlns:w16sdtfl="http://schemas.microsoft.com/office/word/2024/wordml/sdtformatlock" xmlns:w16se="http://schemas.microsoft.com/office/word/2015/wordml/symex" xmlns:wpg="http://schemas.microsoft.com/office/word/2010/wordprocessingGroup" xmlns:wpi="http://schemas.microsoft.com/office/word/2010/wordprocessingInk" xmlns:wne="http://schemas.microsoft.com/office/word/2006/wordml" xmlns:wps="http://schemas.microsoft.com/office/word/2010/wordprocessingShape" mc:Ignorable="w14 w15 w16se w16cid w16 w16cex w16sdtdh w16sdtfl w16du wp14">
+<w:hdr xmlns:wpc="http://schemas.microsoft.com/office/word/2010/wordprocessingCanvas" xmlns:cx="http://schemas.microsoft.com/office/drawing/2014/chartex" xmlns:cx1="http://schemas.microsoft.com/office/drawing/2015/9/8/chartex" xmlns:cx2="http://schemas.microsoft.com/office/drawing/2015/10/21/chartex" xmlns:cx3="http://schemas.microsoft.com/office/drawing/2016/5/9/chartex" xmlns:cx4="http://schemas.microsoft.com/office/drawing/2016/5/10/chartex" xmlns:cx5="http://schemas.microsoft.com/office/drawing/2016/5/11/chartex" xmlns:cx6="http://schemas.microsoft.com/office/drawing/2016/5/12/chartex" xmlns:cx7="http://schemas.microsoft.com/office/drawing/2016/5/13/chartex" xmlns:cx8="http://schemas.microsoft.com/office/drawing/2016/5/14/chartex" xmlns:mc="http://schemas.openxmlformats.org/markup-compatibility/2006" xmlns:aink="http://schemas.microsoft.com/office/drawing/2016/ink" xmlns:am3d="http://schemas.microsoft.com/office/drawing/2017/model3d" xmlns:o="urn:schemas-microsoft-com:office:office" xmlns:r="http://schemas.openxmlformats.org/officeDocument/2006/relationships" xmlns:m="http://schemas.openxmlformats.org/officeDocument/2006/math" xmlns:v="urn:schemas-microsoft-com:vml" xmlns:wp14="http://schemas.microsoft.com/office/word/2010/wordprocessingDrawing" xmlns:wp="http://schemas.openxmlformats.org/drawingml/2006/wordprocessingDrawing" xmlns:w10="urn:schemas-microsoft-com:office:word" xmlns:w="http://schemas.openxmlformats.org/wordprocessingml/2006/main" xmlns:w14="http://schemas.microsoft.com/office/word/2010/wordml" xmlns:w15="http://schemas.microsoft.com/office/word/2012/wordml" xmlns:w16cid="http://schemas.microsoft.com/office/word/2016/wordml/cid" xmlns:w16se="http://schemas.microsoft.com/office/word/2015/wordml/symex" xmlns:wpg="http://schemas.microsoft.com/office/word/2010/wordprocessingGroup" xmlns:wpi="http://schemas.microsoft.com/office/word/2010/wordprocessingInk" xmlns:wne="http://schemas.microsoft.com/office/word/2006/wordml" xmlns:wps="http://schemas.microsoft.com/office/word/2010/wordprocessingShape" mc:Ignorable="w14 w15 w16se w16cid wp14">
   <w:tbl>
     <w:tblPr>
       <w:tblStyle w:val="a7"/>
@@ -4193,7 +4242,16 @@
               <w:b/>
               <w:u w:val="single"/>
             </w:rPr>
-            <w:t>ОАО «ВЗЭП»</w:t>
+            <w:t>ОАО «ВЗЭП</w:t>
+          </w:r>
+          <w:proofErr w:type="gramStart"/>
+          <w:r>
+            <w:rPr>
+              <w:rFonts w:ascii="Arial Narrow" w:hAnsi="Arial Narrow" w:cs="Arial"/>
+              <w:b/>
+              <w:u w:val="single"/>
+            </w:rPr>
+            <w:t>»</w:t>
           </w:r>
           <w:r>
             <w:rPr>
@@ -4205,7 +4263,14 @@
             <w:rPr>
               <w:rFonts w:ascii="Arial Narrow" w:hAnsi="Arial Narrow" w:cs="Arial"/>
             </w:rPr>
-            <w:t xml:space="preserve">    </w:t>
+            <w:t xml:space="preserve">  </w:t>
+          </w:r>
+          <w:proofErr w:type="gramEnd"/>
+          <w:r>
+            <w:rPr>
+              <w:rFonts w:ascii="Arial Narrow" w:hAnsi="Arial Narrow" w:cs="Arial"/>
+            </w:rPr>
+            <w:t xml:space="preserve">  </w:t>
           </w:r>
           <w:r>
             <w:rPr>
@@ -4292,6 +4357,7 @@
             </w:rPr>
             <w:t xml:space="preserve">Дата начала </w:t>
           </w:r>
+          <w:proofErr w:type="gramStart"/>
           <w:r>
             <w:rPr>
               <w:rFonts w:ascii="Arial Narrow" w:hAnsi="Arial Narrow" w:cs="Arial"/>
@@ -4309,7 +4375,14 @@
             <w:rPr>
               <w:rFonts w:ascii="Arial Narrow" w:hAnsi="Arial Narrow" w:cs="Arial"/>
             </w:rPr>
-            <w:t xml:space="preserve">              </w:t>
+            <w:t xml:space="preserve">  </w:t>
+          </w:r>
+          <w:proofErr w:type="gramEnd"/>
+          <w:r>
+            <w:rPr>
+              <w:rFonts w:ascii="Arial Narrow" w:hAnsi="Arial Narrow" w:cs="Arial"/>
+            </w:rPr>
+            <w:t xml:space="preserve">            </w:t>
           </w:r>
           <w:r>
             <w:rPr>
@@ -4524,7 +4597,7 @@
 </file>
 
 <file path=word/styles.xml><?xml version="1.0" encoding="utf-8"?>
-<w:styles xmlns:mc="http://schemas.openxmlformats.org/markup-compatibility/2006" xmlns:r="http://schemas.openxmlformats.org/officeDocument/2006/relationships" xmlns:w="http://schemas.openxmlformats.org/wordprocessingml/2006/main" xmlns:w14="http://schemas.microsoft.com/office/word/2010/wordml" xmlns:w15="http://schemas.microsoft.com/office/word/2012/wordml" xmlns:w16cex="http://schemas.microsoft.com/office/word/2018/wordml/cex" xmlns:w16cid="http://schemas.microsoft.com/office/word/2016/wordml/cid" xmlns:w16="http://schemas.microsoft.com/office/word/2018/wordml" xmlns:w16du="http://schemas.microsoft.com/office/word/2023/wordml/word16du" xmlns:w16sdtdh="http://schemas.microsoft.com/office/word/2020/wordml/sdtdatahash" xmlns:w16sdtfl="http://schemas.microsoft.com/office/word/2024/wordml/sdtformatlock" xmlns:w16se="http://schemas.microsoft.com/office/word/2015/wordml/symex" mc:Ignorable="w14 w15 w16se w16cid w16 w16cex w16sdtdh w16sdtfl w16du">
+<w:styles xmlns:mc="http://schemas.openxmlformats.org/markup-compatibility/2006" xmlns:r="http://schemas.openxmlformats.org/officeDocument/2006/relationships" xmlns:w="http://schemas.openxmlformats.org/wordprocessingml/2006/main" xmlns:w14="http://schemas.microsoft.com/office/word/2010/wordml" xmlns:w15="http://schemas.microsoft.com/office/word/2012/wordml" xmlns:w16cid="http://schemas.microsoft.com/office/word/2016/wordml/cid" xmlns:w16se="http://schemas.microsoft.com/office/word/2015/wordml/symex" mc:Ignorable="w14 w15 w16se w16cid">
   <w:docDefaults>
     <w:rPrDefault>
       <w:rPr>
@@ -4540,7 +4613,7 @@
       </w:pPr>
     </w:pPrDefault>
   </w:docDefaults>
-  <w:latentStyles w:defLockedState="0" w:defUIPriority="99" w:defSemiHidden="0" w:defUnhideWhenUsed="0" w:defQFormat="0" w:count="376">
+  <w:latentStyles w:defLockedState="0" w:defUIPriority="99" w:defSemiHidden="0" w:defUnhideWhenUsed="0" w:defQFormat="0" w:count="375">
     <w:lsdException w:name="Normal" w:uiPriority="0" w:qFormat="1"/>
     <w:lsdException w:name="heading 1" w:uiPriority="9" w:qFormat="1"/>
     <w:lsdException w:name="heading 2" w:semiHidden="1" w:uiPriority="9" w:unhideWhenUsed="1" w:qFormat="1"/>
@@ -4916,7 +4989,6 @@
     <w:lsdException w:name="Smart Hyperlink" w:semiHidden="1" w:unhideWhenUsed="1"/>
     <w:lsdException w:name="Hashtag" w:semiHidden="1" w:unhideWhenUsed="1"/>
     <w:lsdException w:name="Unresolved Mention" w:semiHidden="1" w:unhideWhenUsed="1"/>
-    <w:lsdException w:name="Smart Link" w:semiHidden="1" w:unhideWhenUsed="1"/>
   </w:latentStyles>
   <w:style w:type="paragraph" w:default="1" w:styleId="a">
     <w:name w:val="Normal"/>
@@ -5350,7 +5422,7 @@
 </file>
 
 <file path=customXml/itemProps1.xml><?xml version="1.0" encoding="utf-8"?>
-<ds:datastoreItem xmlns:ds="http://schemas.openxmlformats.org/officeDocument/2006/customXml" ds:itemID="{7912CE9D-AD1D-422F-B349-2067B14A9371}">
+<ds:datastoreItem xmlns:ds="http://schemas.openxmlformats.org/officeDocument/2006/customXml" ds:itemID="{6E1CA553-C9D3-4AA2-A131-40CEEA126129}">
   <ds:schemaRefs>
     <ds:schemaRef ds:uri="http://schemas.openxmlformats.org/officeDocument/2006/bibliography"/>
   </ds:schemaRefs>

</xml_diff>

<commit_message>
fmea pu kp ri refactor
</commit_message>
<xml_diff>
--- a/src/main/resources/templates/FMEA.docx
+++ b/src/main/resources/templates/FMEA.docx
@@ -55,8 +55,6 @@
                 <w:rFonts w:ascii="Arial Narrow" w:hAnsi="Arial Narrow" w:cs="Tahoma"/>
               </w:rPr>
             </w:pPr>
-            <w:bookmarkStart w:id="0" w:name="_GoBack"/>
-            <w:bookmarkEnd w:id="0"/>
             <w:proofErr w:type="spellStart"/>
             <w:proofErr w:type="gramStart"/>
             <w:r>
@@ -1867,6 +1865,8 @@
           <w:rFonts w:ascii="Arial Narrow" w:hAnsi="Arial Narrow"/>
         </w:rPr>
       </w:pPr>
+      <w:bookmarkStart w:id="0" w:name="_GoBack"/>
+      <w:bookmarkEnd w:id="0"/>
     </w:p>
     <w:sectPr>
       <w:headerReference w:type="default" r:id="rId7"/>
@@ -2508,6 +2508,7 @@
               <w:rFonts w:ascii="Arial Narrow" w:hAnsi="Arial Narrow" w:cs="Arial"/>
               <w:b/>
               <w:szCs w:val="26"/>
+              <w:lang w:val="en-US"/>
             </w:rPr>
           </w:pPr>
           <w:r>
@@ -2521,8 +2522,9 @@
             <w:rPr>
               <w:rFonts w:ascii="Arial Narrow" w:hAnsi="Arial Narrow" w:cs="Arial"/>
               <w:b/>
-            </w:rPr>
-            <w:t>ФР8122, ФР8150</w:t>
+              <w:lang w:val="en-US"/>
+            </w:rPr>
+            <w:t>{{p}}</w:t>
           </w:r>
         </w:p>
       </w:tc>
@@ -5422,7 +5424,7 @@
 </file>
 
 <file path=customXml/itemProps1.xml><?xml version="1.0" encoding="utf-8"?>
-<ds:datastoreItem xmlns:ds="http://schemas.openxmlformats.org/officeDocument/2006/customXml" ds:itemID="{6E1CA553-C9D3-4AA2-A131-40CEEA126129}">
+<ds:datastoreItem xmlns:ds="http://schemas.openxmlformats.org/officeDocument/2006/customXml" ds:itemID="{FDF5F853-699D-4B20-85E4-6FA2E1EB008B}">
   <ds:schemaRefs>
     <ds:schemaRef ds:uri="http://schemas.openxmlformats.org/officeDocument/2006/bibliography"/>
   </ds:schemaRefs>

</xml_diff>

<commit_message>
lst edition without shpu
</commit_message>
<xml_diff>
--- a/src/main/resources/templates/FMEA.docx
+++ b/src/main/resources/templates/FMEA.docx
@@ -48,27 +48,14 @@
             <w:gridSpan w:val="2"/>
           </w:tcPr>
           <w:p>
-            <w:pPr>
-              <w:ind w:left="-85" w:right="-85"/>
-              <w:jc w:val="center"/>
-              <w:rPr>
-                <w:rFonts w:ascii="Arial Narrow" w:hAnsi="Arial Narrow" w:cs="Tahoma"/>
-              </w:rPr>
-            </w:pPr>
             <w:proofErr w:type="spellStart"/>
             <w:proofErr w:type="gramStart"/>
             <w:r>
-              <w:rPr>
-                <w:rFonts w:ascii="Arial Narrow" w:hAnsi="Arial Narrow" w:cs="Tahoma"/>
-              </w:rPr>
               <w:t>Посто-янное</w:t>
             </w:r>
             <w:proofErr w:type="spellEnd"/>
             <w:proofErr w:type="gramEnd"/>
             <w:r>
-              <w:rPr>
-                <w:rFonts w:ascii="Arial Narrow" w:hAnsi="Arial Narrow" w:cs="Tahoma"/>
-              </w:rPr>
               <w:t xml:space="preserve"> улучшение</w:t>
             </w:r>
           </w:p>
@@ -1885,9 +1872,6 @@
 <w:endnotes xmlns:wpc="http://schemas.microsoft.com/office/word/2010/wordprocessingCanvas" xmlns:cx="http://schemas.microsoft.com/office/drawing/2014/chartex" xmlns:cx1="http://schemas.microsoft.com/office/drawing/2015/9/8/chartex" xmlns:cx2="http://schemas.microsoft.com/office/drawing/2015/10/21/chartex" xmlns:cx3="http://schemas.microsoft.com/office/drawing/2016/5/9/chartex" xmlns:cx4="http://schemas.microsoft.com/office/drawing/2016/5/10/chartex" xmlns:cx5="http://schemas.microsoft.com/office/drawing/2016/5/11/chartex" xmlns:cx6="http://schemas.microsoft.com/office/drawing/2016/5/12/chartex" xmlns:cx7="http://schemas.microsoft.com/office/drawing/2016/5/13/chartex" xmlns:cx8="http://schemas.microsoft.com/office/drawing/2016/5/14/chartex" xmlns:mc="http://schemas.openxmlformats.org/markup-compatibility/2006" xmlns:aink="http://schemas.microsoft.com/office/drawing/2016/ink" xmlns:am3d="http://schemas.microsoft.com/office/drawing/2017/model3d" xmlns:o="urn:schemas-microsoft-com:office:office" xmlns:r="http://schemas.openxmlformats.org/officeDocument/2006/relationships" xmlns:m="http://schemas.openxmlformats.org/officeDocument/2006/math" xmlns:v="urn:schemas-microsoft-com:vml" xmlns:wp14="http://schemas.microsoft.com/office/word/2010/wordprocessingDrawing" xmlns:wp="http://schemas.openxmlformats.org/drawingml/2006/wordprocessingDrawing" xmlns:w10="urn:schemas-microsoft-com:office:word" xmlns:w="http://schemas.openxmlformats.org/wordprocessingml/2006/main" xmlns:w14="http://schemas.microsoft.com/office/word/2010/wordml" xmlns:w15="http://schemas.microsoft.com/office/word/2012/wordml" xmlns:w16cid="http://schemas.microsoft.com/office/word/2016/wordml/cid" xmlns:w16se="http://schemas.microsoft.com/office/word/2015/wordml/symex" xmlns:wpg="http://schemas.microsoft.com/office/word/2010/wordprocessingGroup" xmlns:wpi="http://schemas.microsoft.com/office/word/2010/wordprocessingInk" xmlns:wne="http://schemas.microsoft.com/office/word/2006/wordml" xmlns:wps="http://schemas.microsoft.com/office/word/2010/wordprocessingShape" mc:Ignorable="w14 w15 w16se w16cid wp14">
   <w:endnote w:type="separator" w:id="-1">
     <w:p>
-      <w:pPr>
-        <w:spacing w:after="0" w:line="240" w:lineRule="auto"/>
-      </w:pPr>
       <w:r>
         <w:separator/>
       </w:r>
@@ -1895,9 +1879,6 @@
   </w:endnote>
   <w:endnote w:type="continuationSeparator" w:id="0">
     <w:p>
-      <w:pPr>
-        <w:spacing w:after="0" w:line="240" w:lineRule="auto"/>
-      </w:pPr>
       <w:r>
         <w:continuationSeparator/>
       </w:r>
@@ -1910,9 +1891,6 @@
 <w:footnotes xmlns:wpc="http://schemas.microsoft.com/office/word/2010/wordprocessingCanvas" xmlns:cx="http://schemas.microsoft.com/office/drawing/2014/chartex" xmlns:cx1="http://schemas.microsoft.com/office/drawing/2015/9/8/chartex" xmlns:cx2="http://schemas.microsoft.com/office/drawing/2015/10/21/chartex" xmlns:cx3="http://schemas.microsoft.com/office/drawing/2016/5/9/chartex" xmlns:cx4="http://schemas.microsoft.com/office/drawing/2016/5/10/chartex" xmlns:cx5="http://schemas.microsoft.com/office/drawing/2016/5/11/chartex" xmlns:cx6="http://schemas.microsoft.com/office/drawing/2016/5/12/chartex" xmlns:cx7="http://schemas.microsoft.com/office/drawing/2016/5/13/chartex" xmlns:cx8="http://schemas.microsoft.com/office/drawing/2016/5/14/chartex" xmlns:mc="http://schemas.openxmlformats.org/markup-compatibility/2006" xmlns:aink="http://schemas.microsoft.com/office/drawing/2016/ink" xmlns:am3d="http://schemas.microsoft.com/office/drawing/2017/model3d" xmlns:o="urn:schemas-microsoft-com:office:office" xmlns:r="http://schemas.openxmlformats.org/officeDocument/2006/relationships" xmlns:m="http://schemas.openxmlformats.org/officeDocument/2006/math" xmlns:v="urn:schemas-microsoft-com:vml" xmlns:wp14="http://schemas.microsoft.com/office/word/2010/wordprocessingDrawing" xmlns:wp="http://schemas.openxmlformats.org/drawingml/2006/wordprocessingDrawing" xmlns:w10="urn:schemas-microsoft-com:office:word" xmlns:w="http://schemas.openxmlformats.org/wordprocessingml/2006/main" xmlns:w14="http://schemas.microsoft.com/office/word/2010/wordml" xmlns:w15="http://schemas.microsoft.com/office/word/2012/wordml" xmlns:w16cid="http://schemas.microsoft.com/office/word/2016/wordml/cid" xmlns:w16se="http://schemas.microsoft.com/office/word/2015/wordml/symex" xmlns:wpg="http://schemas.microsoft.com/office/word/2010/wordprocessingGroup" xmlns:wpi="http://schemas.microsoft.com/office/word/2010/wordprocessingInk" xmlns:wne="http://schemas.microsoft.com/office/word/2006/wordml" xmlns:wps="http://schemas.microsoft.com/office/word/2010/wordprocessingShape" mc:Ignorable="w14 w15 w16se w16cid wp14">
   <w:footnote w:type="separator" w:id="-1">
     <w:p>
-      <w:pPr>
-        <w:spacing w:after="0" w:line="240" w:lineRule="auto"/>
-      </w:pPr>
       <w:r>
         <w:separator/>
       </w:r>
@@ -1920,9 +1898,6 @@
   </w:footnote>
   <w:footnote w:type="continuationSeparator" w:id="0">
     <w:p>
-      <w:pPr>
-        <w:spacing w:after="0" w:line="240" w:lineRule="auto"/>
-      </w:pPr>
       <w:r>
         <w:continuationSeparator/>
       </w:r>
@@ -4056,6 +4031,31 @@
                     <w:b/>
                   </w:rPr>
                   <w:t xml:space="preserve"> </w:t>
+                </w:r>
+                <w:r>
+                  <w:rPr>
+                    <w:rFonts w:ascii="Arial Narrow" w:hAnsi="Arial Narrow" w:cs="Arial"/>
+                    <w:b/>
+                    <w:szCs w:val="26"/>
+                  </w:rPr>
+                  <w:t>{{</w:t>
+                </w:r>
+                <w:r>
+                  <w:rPr>
+                    <w:rFonts w:ascii="Arial Narrow" w:hAnsi="Arial Narrow" w:cs="Arial"/>
+                    <w:b/>
+                    <w:szCs w:val="26"/>
+                    <w:lang w:val="en-US"/>
+                  </w:rPr>
+                  <w:t>n</w:t>
+                </w:r>
+                <w:r>
+                  <w:rPr>
+                    <w:rFonts w:ascii="Arial Narrow" w:hAnsi="Arial Narrow" w:cs="Arial"/>
+                    <w:b/>
+                    <w:szCs w:val="26"/>
+                  </w:rPr>
+                  <w:t>}}</w:t>
                 </w:r>
               </w:p>
             </w:tc>
@@ -4438,6 +4438,53 @@
               <w:rFonts w:ascii="Arial Narrow" w:hAnsi="Arial Narrow" w:cs="Arial"/>
             </w:rPr>
           </w:pPr>
+          <w:proofErr w:type="spellStart"/>
+          <w:r>
+            <w:rPr>
+              <w:rFonts w:ascii="Arial Narrow" w:hAnsi="Arial Narrow" w:cs="Arial"/>
+            </w:rPr>
+            <w:t>Объект</w:t>
+          </w:r>
+          <w:proofErr w:type="spellEnd"/>
+          <w:r>
+            <w:rPr>
+              <w:rFonts w:ascii="Arial Narrow" w:hAnsi="Arial Narrow" w:cs="Arial"/>
+            </w:rPr>
+            <w:t xml:space="preserve">: </w:t>
+          </w:r>
+          <w:r>
+            <w:rPr>
+              <w:rFonts w:ascii="Arial Narrow" w:hAnsi="Arial Narrow" w:cs="Arial"/>
+              <w:b/>
+              <w:lang w:val="en-US"/>
+            </w:rPr>
+            <w:t>{{p}}</w:t>
+          </w:r>
+          <w:r>
+            <w:rPr>
+              <w:rFonts w:ascii="Arial Narrow" w:hAnsi="Arial Narrow" w:cs="Arial"/>
+            </w:rPr>
+            <w:tab/>
+          </w:r>
+          <w:r>
+            <w:rPr>
+              <w:rFonts w:ascii="Arial Narrow" w:hAnsi="Arial Narrow" w:cs="Arial"/>
+            </w:rPr>
+            <w:tab/>
+          </w:r>
+        </w:p>
+        <w:p>
+          <w:pPr>
+            <w:pStyle w:val="a3"/>
+            <w:tabs>
+              <w:tab w:val="clear" w:pos="4677"/>
+              <w:tab w:val="clear" w:pos="9355"/>
+            </w:tabs>
+            <w:ind w:right="-85"/>
+            <w:rPr>
+              <w:rFonts w:ascii="Arial Narrow" w:hAnsi="Arial Narrow" w:cs="Arial"/>
+            </w:rPr>
+          </w:pPr>
           <w:r>
             <w:rPr>
               <w:rFonts w:ascii="Arial Narrow" w:hAnsi="Arial Narrow" w:cs="Arial"/>
@@ -4447,6 +4494,29 @@
           <w:r>
             <w:rPr>
               <w:rFonts w:ascii="Arial Narrow" w:hAnsi="Arial Narrow" w:cs="Arial"/>
+              <w:szCs w:val="26"/>
+            </w:rPr>
+            <w:t>{{</w:t>
+          </w:r>
+          <w:r>
+            <w:rPr>
+              <w:rFonts w:ascii="Arial Narrow" w:hAnsi="Arial Narrow" w:cs="Arial"/>
+              <w:szCs w:val="26"/>
+              <w:lang w:val="en-US"/>
+            </w:rPr>
+            <w:t>d</w:t>
+          </w:r>
+          <w:r>
+            <w:rPr>
+              <w:rFonts w:ascii="Arial Narrow" w:hAnsi="Arial Narrow" w:cs="Arial"/>
+              <w:szCs w:val="26"/>
+            </w:rPr>
+            <w:t>}}</w:t>
+          </w:r>
+          <w:r>
+            <w:rPr>
+              <w:rFonts w:ascii="Arial Narrow" w:hAnsi="Arial Narrow" w:cs="Arial"/>
+              <w:szCs w:val="26"/>
             </w:rPr>
             <w:tab/>
           </w:r>
@@ -4454,7 +4524,6 @@
             <w:rPr>
               <w:rFonts w:ascii="Arial Narrow" w:hAnsi="Arial Narrow" w:cs="Arial"/>
             </w:rPr>
-            <w:tab/>
             <w:t>Уровень конфиденциальности:</w:t>
           </w:r>
           <w:r>
@@ -4995,7 +5064,10 @@
   <w:style w:type="paragraph" w:default="1" w:styleId="a">
     <w:name w:val="Normal"/>
     <w:qFormat/>
-    <w:rsid w:val="00E01918"/>
+    <w:rsid w:val="00497D66"/>
+    <w:pPr>
+      <w:spacing w:after="0" w:line="240" w:lineRule="auto"/>
+    </w:pPr>
   </w:style>
   <w:style w:type="character" w:default="1" w:styleId="a0">
     <w:name w:val="Default Paragraph Font"/>
@@ -5036,7 +5108,6 @@
         <w:tab w:val="center" w:pos="4677"/>
         <w:tab w:val="right" w:pos="9355"/>
       </w:tabs>
-      <w:spacing w:after="0" w:line="240" w:lineRule="auto"/>
     </w:pPr>
   </w:style>
   <w:style w:type="character" w:customStyle="1" w:styleId="a4">
@@ -5058,7 +5129,6 @@
         <w:tab w:val="center" w:pos="4677"/>
         <w:tab w:val="right" w:pos="9355"/>
       </w:tabs>
-      <w:spacing w:after="0" w:line="240" w:lineRule="auto"/>
     </w:pPr>
   </w:style>
   <w:style w:type="character" w:customStyle="1" w:styleId="a6">
@@ -5094,7 +5164,7 @@
     <w:unhideWhenUsed/>
     <w:rsid w:val="002E0C61"/>
     <w:pPr>
-      <w:spacing w:before="100" w:beforeAutospacing="1" w:after="119" w:line="240" w:lineRule="auto"/>
+      <w:spacing w:before="100" w:beforeAutospacing="1" w:after="119"/>
     </w:pPr>
     <w:rPr>
       <w:rFonts w:ascii="Times New Roman" w:eastAsia="Times New Roman" w:hAnsi="Times New Roman" w:cs="Times New Roman"/>
@@ -5111,9 +5181,6 @@
     <w:semiHidden/>
     <w:unhideWhenUsed/>
     <w:rsid w:val="00FB1922"/>
-    <w:pPr>
-      <w:spacing w:after="0" w:line="240" w:lineRule="auto"/>
-    </w:pPr>
     <w:rPr>
       <w:rFonts w:ascii="Tahoma" w:hAnsi="Tahoma" w:cs="Tahoma"/>
       <w:sz w:val="16"/>
@@ -5424,7 +5491,7 @@
 </file>
 
 <file path=customXml/itemProps1.xml><?xml version="1.0" encoding="utf-8"?>
-<ds:datastoreItem xmlns:ds="http://schemas.openxmlformats.org/officeDocument/2006/customXml" ds:itemID="{FDF5F853-699D-4B20-85E4-6FA2E1EB008B}">
+<ds:datastoreItem xmlns:ds="http://schemas.openxmlformats.org/officeDocument/2006/customXml" ds:itemID="{19AA5618-E494-4521-AE8F-9CF8AB4DC159}">
   <ds:schemaRefs>
     <ds:schemaRef ds:uri="http://schemas.openxmlformats.org/officeDocument/2006/bibliography"/>
   </ds:schemaRefs>

</xml_diff>

<commit_message>
Last version with config propertirs
</commit_message>
<xml_diff>
--- a/src/main/resources/templates/FMEA.docx
+++ b/src/main/resources/templates/FMEA.docx
@@ -1,14 +1,27 @@
 
 <file path=word/document.xml><?xml version="1.0" encoding="utf-8"?>
-<w:document xmlns:wpc="http://schemas.microsoft.com/office/word/2010/wordprocessingCanvas" xmlns:cx="http://schemas.microsoft.com/office/drawing/2014/chartex" xmlns:cx1="http://schemas.microsoft.com/office/drawing/2015/9/8/chartex" xmlns:cx2="http://schemas.microsoft.com/office/drawing/2015/10/21/chartex" xmlns:cx3="http://schemas.microsoft.com/office/drawing/2016/5/9/chartex" xmlns:cx4="http://schemas.microsoft.com/office/drawing/2016/5/10/chartex" xmlns:cx5="http://schemas.microsoft.com/office/drawing/2016/5/11/chartex" xmlns:cx6="http://schemas.microsoft.com/office/drawing/2016/5/12/chartex" xmlns:cx7="http://schemas.microsoft.com/office/drawing/2016/5/13/chartex" xmlns:cx8="http://schemas.microsoft.com/office/drawing/2016/5/14/chartex" xmlns:mc="http://schemas.openxmlformats.org/markup-compatibility/2006" xmlns:aink="http://schemas.microsoft.com/office/drawing/2016/ink" xmlns:am3d="http://schemas.microsoft.com/office/drawing/2017/model3d" xmlns:o="urn:schemas-microsoft-com:office:office" xmlns:r="http://schemas.openxmlformats.org/officeDocument/2006/relationships" xmlns:m="http://schemas.openxmlformats.org/officeDocument/2006/math" xmlns:v="urn:schemas-microsoft-com:vml" xmlns:wp14="http://schemas.microsoft.com/office/word/2010/wordprocessingDrawing" xmlns:wp="http://schemas.openxmlformats.org/drawingml/2006/wordprocessingDrawing" xmlns:w10="urn:schemas-microsoft-com:office:word" xmlns:w="http://schemas.openxmlformats.org/wordprocessingml/2006/main" xmlns:w14="http://schemas.microsoft.com/office/word/2010/wordml" xmlns:w15="http://schemas.microsoft.com/office/word/2012/wordml" xmlns:w16cid="http://schemas.microsoft.com/office/word/2016/wordml/cid" xmlns:w16se="http://schemas.microsoft.com/office/word/2015/wordml/symex" xmlns:wpg="http://schemas.microsoft.com/office/word/2010/wordprocessingGroup" xmlns:wpi="http://schemas.microsoft.com/office/word/2010/wordprocessingInk" xmlns:wne="http://schemas.microsoft.com/office/word/2006/wordml" xmlns:wps="http://schemas.microsoft.com/office/word/2010/wordprocessingShape" mc:Ignorable="w14 w15 w16se w16cid wp14">
+<w:document xmlns:wpc="http://schemas.microsoft.com/office/word/2010/wordprocessingCanvas" xmlns:mc="http://schemas.openxmlformats.org/markup-compatibility/2006" xmlns:o="urn:schemas-microsoft-com:office:office" xmlns:r="http://schemas.openxmlformats.org/officeDocument/2006/relationships" xmlns:m="http://schemas.openxmlformats.org/officeDocument/2006/math" xmlns:v="urn:schemas-microsoft-com:vml" xmlns:wp14="http://schemas.microsoft.com/office/word/2010/wordprocessingDrawing" xmlns:wp="http://schemas.openxmlformats.org/drawingml/2006/wordprocessingDrawing" xmlns:w="http://schemas.openxmlformats.org/wordprocessingml/2006/main" xmlns:w14="http://schemas.microsoft.com/office/word/2010/wordml" xmlns:w10="urn:schemas-microsoft-com:office:word" xmlns:w15="http://schemas.microsoft.com/office/word/2012/wordml" xmlns:wpg="http://schemas.microsoft.com/office/word/2010/wordprocessingGroup" xmlns:wpi="http://schemas.microsoft.com/office/word/2010/wordprocessingInk" xmlns:wne="http://schemas.microsoft.com/office/word/2006/wordml" xmlns:wps="http://schemas.microsoft.com/office/word/2010/wordprocessingShape" xmlns:wpsCustomData="http://www.wps.cn/officeDocument/2013/wpsCustomData" mc:Ignorable="w14 w15 wp14">
   <w:body>
     <w:tbl>
       <w:tblPr>
-        <w:tblStyle w:val="a7"/>
+        <w:tblStyle w:val="8"/>
         <w:tblW w:w="16018" w:type="dxa"/>
         <w:tblInd w:w="-34" w:type="dxa"/>
+        <w:tblBorders>
+          <w:top w:val="single" w:color="000000" w:themeColor="text1" w:sz="4" w:space="0"/>
+          <w:left w:val="single" w:color="000000" w:themeColor="text1" w:sz="4" w:space="0"/>
+          <w:bottom w:val="single" w:color="000000" w:themeColor="text1" w:sz="4" w:space="0"/>
+          <w:right w:val="single" w:color="000000" w:themeColor="text1" w:sz="4" w:space="0"/>
+          <w:insideH w:val="single" w:color="000000" w:themeColor="text1" w:sz="4" w:space="0"/>
+          <w:insideV w:val="single" w:color="000000" w:themeColor="text1" w:sz="4" w:space="0"/>
+        </w:tblBorders>
         <w:tblLayout w:type="fixed"/>
-        <w:tblLook w:val="04A0" w:firstRow="1" w:lastRow="0" w:firstColumn="1" w:lastColumn="0" w:noHBand="0" w:noVBand="1"/>
+        <w:tblCellMar>
+          <w:top w:w="0" w:type="dxa"/>
+          <w:left w:w="108" w:type="dxa"/>
+          <w:bottom w:w="0" w:type="dxa"/>
+          <w:right w:w="108" w:type="dxa"/>
+        </w:tblCellMar>
       </w:tblPr>
       <w:tblGrid>
         <w:gridCol w:w="284"/>
@@ -38,9 +51,25 @@
         <w:gridCol w:w="283"/>
       </w:tblGrid>
       <w:tr>
+        <w:tblPrEx>
+          <w:tblBorders>
+            <w:top w:val="single" w:color="000000" w:themeColor="text1" w:sz="4" w:space="0"/>
+            <w:left w:val="single" w:color="000000" w:themeColor="text1" w:sz="4" w:space="0"/>
+            <w:bottom w:val="single" w:color="000000" w:themeColor="text1" w:sz="4" w:space="0"/>
+            <w:right w:val="single" w:color="000000" w:themeColor="text1" w:sz="4" w:space="0"/>
+            <w:insideH w:val="single" w:color="000000" w:themeColor="text1" w:sz="4" w:space="0"/>
+            <w:insideV w:val="single" w:color="000000" w:themeColor="text1" w:sz="4" w:space="0"/>
+          </w:tblBorders>
+          <w:tblCellMar>
+            <w:top w:w="0" w:type="dxa"/>
+            <w:left w:w="108" w:type="dxa"/>
+            <w:bottom w:w="0" w:type="dxa"/>
+            <w:right w:w="108" w:type="dxa"/>
+          </w:tblCellMar>
+        </w:tblPrEx>
         <w:trPr>
           <w:cantSplit/>
-          <w:trHeight w:val="96"/>
+          <w:trHeight w:val="96" w:hRule="atLeast"/>
         </w:trPr>
         <w:tc>
           <w:tcPr>
@@ -48,15 +77,8 @@
             <w:gridSpan w:val="2"/>
           </w:tcPr>
           <w:p>
-            <w:proofErr w:type="spellStart"/>
-            <w:proofErr w:type="gramStart"/>
-            <w:r>
-              <w:t>Посто-янное</w:t>
-            </w:r>
-            <w:proofErr w:type="spellEnd"/>
-            <w:proofErr w:type="gramEnd"/>
-            <w:r>
-              <w:t xml:space="preserve"> улучшение</w:t>
+            <w:r>
+              <w:t>Посто-янное улучшение</w:t>
             </w:r>
           </w:p>
         </w:tc>
@@ -191,9 +213,25 @@
         </w:tc>
       </w:tr>
       <w:tr>
+        <w:tblPrEx>
+          <w:tblBorders>
+            <w:top w:val="single" w:color="000000" w:themeColor="text1" w:sz="4" w:space="0"/>
+            <w:left w:val="single" w:color="000000" w:themeColor="text1" w:sz="4" w:space="0"/>
+            <w:bottom w:val="single" w:color="000000" w:themeColor="text1" w:sz="4" w:space="0"/>
+            <w:right w:val="single" w:color="000000" w:themeColor="text1" w:sz="4" w:space="0"/>
+            <w:insideH w:val="single" w:color="000000" w:themeColor="text1" w:sz="4" w:space="0"/>
+            <w:insideV w:val="single" w:color="000000" w:themeColor="text1" w:sz="4" w:space="0"/>
+          </w:tblBorders>
+          <w:tblCellMar>
+            <w:top w:w="0" w:type="dxa"/>
+            <w:left w:w="108" w:type="dxa"/>
+            <w:bottom w:w="0" w:type="dxa"/>
+            <w:right w:w="108" w:type="dxa"/>
+          </w:tblCellMar>
+        </w:tblPrEx>
         <w:trPr>
           <w:cantSplit/>
-          <w:trHeight w:val="2927"/>
+          <w:trHeight w:val="2927" w:hRule="atLeast"/>
         </w:trPr>
         <w:tc>
           <w:tcPr>
@@ -264,53 +302,7 @@
                 <w:sz w:val="20"/>
                 <w:szCs w:val="20"/>
               </w:rPr>
-              <w:t xml:space="preserve">1. </w:t>
-            </w:r>
-            <w:proofErr w:type="gramStart"/>
-            <w:r>
-              <w:rPr>
-                <w:rFonts w:ascii="Arial Narrow" w:hAnsi="Arial Narrow" w:cs="Tahoma"/>
-                <w:sz w:val="20"/>
-                <w:szCs w:val="20"/>
-              </w:rPr>
-              <w:t>Едини-</w:t>
-            </w:r>
-            <w:proofErr w:type="spellStart"/>
-            <w:r>
-              <w:rPr>
-                <w:rFonts w:ascii="Arial Narrow" w:hAnsi="Arial Narrow" w:cs="Tahoma"/>
-                <w:sz w:val="20"/>
-                <w:szCs w:val="20"/>
-              </w:rPr>
-              <w:t>ца</w:t>
-            </w:r>
-            <w:proofErr w:type="spellEnd"/>
-            <w:proofErr w:type="gramEnd"/>
-            <w:r>
-              <w:rPr>
-                <w:rFonts w:ascii="Arial Narrow" w:hAnsi="Arial Narrow" w:cs="Tahoma"/>
-                <w:sz w:val="20"/>
-                <w:szCs w:val="20"/>
-              </w:rPr>
-              <w:t xml:space="preserve"> процесса система, </w:t>
-            </w:r>
-            <w:proofErr w:type="spellStart"/>
-            <w:r>
-              <w:rPr>
-                <w:rFonts w:ascii="Arial Narrow" w:hAnsi="Arial Narrow" w:cs="Tahoma"/>
-                <w:sz w:val="20"/>
-                <w:szCs w:val="20"/>
-              </w:rPr>
-              <w:t>подсис</w:t>
-            </w:r>
-            <w:proofErr w:type="spellEnd"/>
-            <w:r>
-              <w:rPr>
-                <w:rFonts w:ascii="Arial Narrow" w:hAnsi="Arial Narrow" w:cs="Tahoma"/>
-                <w:sz w:val="20"/>
-                <w:szCs w:val="20"/>
-              </w:rPr>
-              <w:t>-тема элемент части</w:t>
+              <w:t>1. Едини-ца процесса система, подсис-тема элемент части</w:t>
             </w:r>
           </w:p>
         </w:tc>
@@ -333,15 +325,7 @@
                 <w:sz w:val="20"/>
                 <w:szCs w:val="20"/>
               </w:rPr>
-              <w:t>2. Шаг процесса № станции и название элемента фокусировки</w:t>
-            </w:r>
-            <w:r>
-              <w:rPr>
-                <w:rFonts w:ascii="Arial Narrow" w:hAnsi="Arial Narrow" w:cs="Tahoma"/>
-                <w:sz w:val="20"/>
-                <w:szCs w:val="20"/>
-              </w:rPr>
-              <w:t>, № технологической операции</w:t>
+              <w:t>2. Шаг процесса № станции и название элемента фокусировки, № технологической операции</w:t>
             </w:r>
           </w:p>
         </w:tc>
@@ -364,35 +348,7 @@
                 <w:sz w:val="20"/>
                 <w:szCs w:val="20"/>
               </w:rPr>
-              <w:t xml:space="preserve">3.Эле мент </w:t>
-            </w:r>
-            <w:proofErr w:type="spellStart"/>
-            <w:proofErr w:type="gramStart"/>
-            <w:r>
-              <w:rPr>
-                <w:rFonts w:ascii="Arial Narrow" w:hAnsi="Arial Narrow" w:cs="Tahoma"/>
-                <w:sz w:val="20"/>
-                <w:szCs w:val="20"/>
-              </w:rPr>
-              <w:t>рабо</w:t>
-            </w:r>
-            <w:proofErr w:type="spellEnd"/>
-            <w:r>
-              <w:rPr>
-                <w:rFonts w:ascii="Arial Narrow" w:hAnsi="Arial Narrow" w:cs="Tahoma"/>
-                <w:sz w:val="20"/>
-                <w:szCs w:val="20"/>
-              </w:rPr>
-              <w:t>-ты</w:t>
-            </w:r>
-            <w:proofErr w:type="gramEnd"/>
-            <w:r>
-              <w:rPr>
-                <w:rFonts w:ascii="Arial Narrow" w:hAnsi="Arial Narrow" w:cs="Tahoma"/>
-                <w:sz w:val="20"/>
-                <w:szCs w:val="20"/>
-              </w:rPr>
-              <w:t xml:space="preserve"> процесса вида 4М</w:t>
+              <w:t>3.Эле мент рабо-ты процесса вида 4М</w:t>
             </w:r>
           </w:p>
         </w:tc>
@@ -415,35 +371,7 @@
                 <w:sz w:val="20"/>
                 <w:szCs w:val="20"/>
               </w:rPr>
-              <w:t xml:space="preserve">1. Функция единицы процесса. Функция системы, </w:t>
-            </w:r>
-            <w:proofErr w:type="spellStart"/>
-            <w:proofErr w:type="gramStart"/>
-            <w:r>
-              <w:rPr>
-                <w:rFonts w:ascii="Arial Narrow" w:hAnsi="Arial Narrow" w:cs="Tahoma"/>
-                <w:sz w:val="20"/>
-                <w:szCs w:val="20"/>
-              </w:rPr>
-              <w:t>подсисте</w:t>
-            </w:r>
-            <w:proofErr w:type="spellEnd"/>
-            <w:r>
-              <w:rPr>
-                <w:rFonts w:ascii="Arial Narrow" w:hAnsi="Arial Narrow" w:cs="Tahoma"/>
-                <w:sz w:val="20"/>
-                <w:szCs w:val="20"/>
-              </w:rPr>
-              <w:t>-мы</w:t>
-            </w:r>
-            <w:proofErr w:type="gramEnd"/>
-            <w:r>
-              <w:rPr>
-                <w:rFonts w:ascii="Arial Narrow" w:hAnsi="Arial Narrow" w:cs="Tahoma"/>
-                <w:sz w:val="20"/>
-                <w:szCs w:val="20"/>
-              </w:rPr>
-              <w:t>, элемента части или процесса</w:t>
+              <w:t>1. Функция единицы процесса. Функция системы, подсисте-мы, элемента части или процесса</w:t>
             </w:r>
           </w:p>
         </w:tc>
@@ -466,45 +394,7 @@
                 <w:sz w:val="20"/>
                 <w:szCs w:val="20"/>
               </w:rPr>
-              <w:t xml:space="preserve">2. Функция шага процесса и </w:t>
-            </w:r>
-            <w:proofErr w:type="spellStart"/>
-            <w:r>
-              <w:rPr>
-                <w:rFonts w:ascii="Arial Narrow" w:hAnsi="Arial Narrow" w:cs="Tahoma"/>
-                <w:sz w:val="20"/>
-                <w:szCs w:val="20"/>
-              </w:rPr>
-              <w:t>характе-ристика</w:t>
-            </w:r>
-            <w:proofErr w:type="spellEnd"/>
-            <w:r>
-              <w:rPr>
-                <w:rFonts w:ascii="Arial Narrow" w:hAnsi="Arial Narrow" w:cs="Tahoma"/>
-                <w:sz w:val="20"/>
-                <w:szCs w:val="20"/>
-              </w:rPr>
-              <w:t xml:space="preserve"> продукции (количественное значение не </w:t>
-            </w:r>
-            <w:proofErr w:type="spellStart"/>
-            <w:proofErr w:type="gramStart"/>
-            <w:r>
-              <w:rPr>
-                <w:rFonts w:ascii="Arial Narrow" w:hAnsi="Arial Narrow" w:cs="Tahoma"/>
-                <w:sz w:val="20"/>
-                <w:szCs w:val="20"/>
-              </w:rPr>
-              <w:t>обя-зательно</w:t>
-            </w:r>
-            <w:proofErr w:type="spellEnd"/>
-            <w:proofErr w:type="gramEnd"/>
-            <w:r>
-              <w:rPr>
-                <w:rFonts w:ascii="Arial Narrow" w:hAnsi="Arial Narrow" w:cs="Tahoma"/>
-                <w:sz w:val="20"/>
-                <w:szCs w:val="20"/>
-              </w:rPr>
-              <w:t>)</w:t>
+              <w:t>2. Функция шага процесса и характе-ристика продукции (количественное значение не обя-зательно)</w:t>
             </w:r>
           </w:p>
         </w:tc>
@@ -564,23 +454,13 @@
                 <w:lang w:val="en-US"/>
               </w:rPr>
             </w:pPr>
-            <w:proofErr w:type="spellStart"/>
-            <w:r>
-              <w:rPr>
-                <w:rFonts w:ascii="Arial Narrow" w:hAnsi="Arial Narrow" w:cs="Tahoma"/>
-                <w:sz w:val="20"/>
-                <w:szCs w:val="20"/>
-              </w:rPr>
-              <w:t>ствия</w:t>
-            </w:r>
-            <w:proofErr w:type="spellEnd"/>
-            <w:r>
-              <w:rPr>
-                <w:rFonts w:ascii="Arial Narrow" w:hAnsi="Arial Narrow" w:cs="Tahoma"/>
-                <w:sz w:val="20"/>
-                <w:szCs w:val="20"/>
-              </w:rPr>
-              <w:t xml:space="preserve"> отказа </w:t>
+            <w:r>
+              <w:rPr>
+                <w:rFonts w:ascii="Arial Narrow" w:hAnsi="Arial Narrow" w:cs="Tahoma"/>
+                <w:sz w:val="20"/>
+                <w:szCs w:val="20"/>
+              </w:rPr>
+              <w:t xml:space="preserve">ствия отказа </w:t>
             </w:r>
           </w:p>
           <w:p>
@@ -796,45 +676,7 @@
                 <w:sz w:val="20"/>
                 <w:szCs w:val="20"/>
               </w:rPr>
-              <w:t xml:space="preserve">Текущие меры управления по </w:t>
-            </w:r>
-            <w:proofErr w:type="spellStart"/>
-            <w:proofErr w:type="gramStart"/>
-            <w:r>
-              <w:rPr>
-                <w:rFonts w:ascii="Arial Narrow" w:hAnsi="Arial Narrow" w:cs="Tahoma"/>
-                <w:sz w:val="20"/>
-                <w:szCs w:val="20"/>
-              </w:rPr>
-              <w:t>обнаруже-нию</w:t>
-            </w:r>
-            <w:proofErr w:type="spellEnd"/>
-            <w:proofErr w:type="gramEnd"/>
-            <w:r>
-              <w:rPr>
-                <w:rFonts w:ascii="Arial Narrow" w:hAnsi="Arial Narrow" w:cs="Tahoma"/>
-                <w:sz w:val="20"/>
-                <w:szCs w:val="20"/>
-              </w:rPr>
-              <w:t xml:space="preserve"> (DC) FC или FM (действия по </w:t>
-            </w:r>
-            <w:proofErr w:type="spellStart"/>
-            <w:r>
-              <w:rPr>
-                <w:rFonts w:ascii="Arial Narrow" w:hAnsi="Arial Narrow" w:cs="Tahoma"/>
-                <w:sz w:val="20"/>
-                <w:szCs w:val="20"/>
-              </w:rPr>
-              <w:t>обнаруже-нию</w:t>
-            </w:r>
-            <w:proofErr w:type="spellEnd"/>
-            <w:r>
-              <w:rPr>
-                <w:rFonts w:ascii="Arial Narrow" w:hAnsi="Arial Narrow" w:cs="Tahoma"/>
-                <w:sz w:val="20"/>
-                <w:szCs w:val="20"/>
-              </w:rPr>
-              <w:t>)</w:t>
+              <w:t>Текущие меры управления по обнаруже-нию (DC) FC или FM (действия по обнаруже-нию)</w:t>
             </w:r>
           </w:p>
         </w:tc>
@@ -1055,53 +897,15 @@
                 <w:sz w:val="20"/>
                 <w:szCs w:val="20"/>
               </w:rPr>
-              <w:t xml:space="preserve">Предпринятые </w:t>
-            </w:r>
-            <w:proofErr w:type="spellStart"/>
-            <w:proofErr w:type="gramStart"/>
-            <w:r>
-              <w:rPr>
-                <w:rFonts w:ascii="Arial Narrow" w:hAnsi="Arial Narrow" w:cs="Tahoma"/>
-                <w:sz w:val="20"/>
-                <w:szCs w:val="20"/>
-              </w:rPr>
-              <w:t>дейст</w:t>
-            </w:r>
-            <w:proofErr w:type="spellEnd"/>
-            <w:r>
-              <w:rPr>
-                <w:rFonts w:ascii="Arial Narrow" w:hAnsi="Arial Narrow" w:cs="Tahoma"/>
-                <w:sz w:val="20"/>
-                <w:szCs w:val="20"/>
-              </w:rPr>
-              <w:t>-вия</w:t>
-            </w:r>
-            <w:proofErr w:type="gramEnd"/>
-            <w:r>
-              <w:rPr>
-                <w:rFonts w:ascii="Arial Narrow" w:hAnsi="Arial Narrow" w:cs="Tahoma"/>
-                <w:sz w:val="20"/>
-                <w:szCs w:val="20"/>
-              </w:rPr>
-              <w:t xml:space="preserve"> с указателем на </w:t>
-            </w:r>
-            <w:proofErr w:type="spellStart"/>
-            <w:r>
-              <w:rPr>
-                <w:rFonts w:ascii="Arial Narrow" w:hAnsi="Arial Narrow" w:cs="Tahoma"/>
-                <w:sz w:val="20"/>
-                <w:szCs w:val="20"/>
-              </w:rPr>
-              <w:t>сви-детельство</w:t>
-            </w:r>
-            <w:proofErr w:type="spellEnd"/>
+              <w:t>Предпринятые дейст-вия с указателем на сви-детельство</w:t>
+            </w:r>
           </w:p>
         </w:tc>
         <w:tc>
           <w:tcPr>
             <w:tcW w:w="284" w:type="dxa"/>
             <w:tcBorders>
-              <w:right w:val="single" w:sz="4" w:space="0" w:color="auto"/>
+              <w:right w:val="single" w:color="auto" w:sz="4" w:space="0"/>
             </w:tcBorders>
             <w:textDirection w:val="btLr"/>
             <w:vAlign w:val="center"/>
@@ -1130,7 +934,7 @@
           <w:tcPr>
             <w:tcW w:w="283" w:type="dxa"/>
             <w:tcBorders>
-              <w:left w:val="single" w:sz="4" w:space="0" w:color="auto"/>
+              <w:left w:val="single" w:color="auto" w:sz="4" w:space="0"/>
             </w:tcBorders>
             <w:textDirection w:val="btLr"/>
             <w:vAlign w:val="center"/>
@@ -1158,6 +962,22 @@
         </w:tc>
       </w:tr>
       <w:tr>
+        <w:tblPrEx>
+          <w:tblBorders>
+            <w:top w:val="single" w:color="000000" w:themeColor="text1" w:sz="4" w:space="0"/>
+            <w:left w:val="single" w:color="000000" w:themeColor="text1" w:sz="4" w:space="0"/>
+            <w:bottom w:val="single" w:color="000000" w:themeColor="text1" w:sz="4" w:space="0"/>
+            <w:right w:val="single" w:color="000000" w:themeColor="text1" w:sz="4" w:space="0"/>
+            <w:insideH w:val="single" w:color="000000" w:themeColor="text1" w:sz="4" w:space="0"/>
+            <w:insideV w:val="single" w:color="000000" w:themeColor="text1" w:sz="4" w:space="0"/>
+          </w:tblBorders>
+          <w:tblCellMar>
+            <w:top w:w="0" w:type="dxa"/>
+            <w:left w:w="108" w:type="dxa"/>
+            <w:bottom w:w="0" w:type="dxa"/>
+            <w:right w:w="108" w:type="dxa"/>
+          </w:tblCellMar>
+        </w:tblPrEx>
         <w:tc>
           <w:tcPr>
             <w:tcW w:w="284" w:type="dxa"/>
@@ -1700,7 +1520,7 @@
           <w:tcPr>
             <w:tcW w:w="284" w:type="dxa"/>
             <w:tcBorders>
-              <w:right w:val="single" w:sz="4" w:space="0" w:color="auto"/>
+              <w:right w:val="single" w:color="auto" w:sz="4" w:space="0"/>
             </w:tcBorders>
           </w:tcPr>
           <w:p>
@@ -1737,7 +1557,7 @@
           <w:tcPr>
             <w:tcW w:w="708" w:type="dxa"/>
             <w:tcBorders>
-              <w:left w:val="single" w:sz="4" w:space="0" w:color="auto"/>
+              <w:left w:val="single" w:color="auto" w:sz="4" w:space="0"/>
             </w:tcBorders>
           </w:tcPr>
           <w:p>
@@ -1774,7 +1594,7 @@
           <w:tcPr>
             <w:tcW w:w="284" w:type="dxa"/>
             <w:tcBorders>
-              <w:left w:val="single" w:sz="4" w:space="0" w:color="auto"/>
+              <w:left w:val="single" w:color="auto" w:sz="4" w:space="0"/>
             </w:tcBorders>
           </w:tcPr>
           <w:p>
@@ -1811,7 +1631,7 @@
           <w:tcPr>
             <w:tcW w:w="283" w:type="dxa"/>
             <w:tcBorders>
-              <w:left w:val="single" w:sz="4" w:space="0" w:color="auto"/>
+              <w:left w:val="single" w:color="auto" w:sz="4" w:space="0"/>
             </w:tcBorders>
           </w:tcPr>
           <w:p>
@@ -1856,29 +1676,35 @@
       <w:bookmarkEnd w:id="0"/>
     </w:p>
     <w:sectPr>
-      <w:headerReference w:type="default" r:id="rId7"/>
-      <w:headerReference w:type="first" r:id="rId8"/>
+      <w:headerReference r:id="rId6" w:type="first"/>
+      <w:headerReference r:id="rId5" w:type="default"/>
       <w:pgSz w:w="16838" w:h="11906" w:orient="landscape"/>
       <w:pgMar w:top="1701" w:right="567" w:bottom="567" w:left="567" w:header="709" w:footer="709" w:gutter="0"/>
-      <w:cols w:space="708"/>
+      <w:cols w:space="708" w:num="1"/>
       <w:titlePg/>
-      <w:docGrid w:linePitch="360"/>
+      <w:docGrid w:linePitch="360" w:charSpace="0"/>
     </w:sectPr>
   </w:body>
 </w:document>
 </file>
 
 <file path=word/endnotes.xml><?xml version="1.0" encoding="utf-8"?>
-<w:endnotes xmlns:wpc="http://schemas.microsoft.com/office/word/2010/wordprocessingCanvas" xmlns:cx="http://schemas.microsoft.com/office/drawing/2014/chartex" xmlns:cx1="http://schemas.microsoft.com/office/drawing/2015/9/8/chartex" xmlns:cx2="http://schemas.microsoft.com/office/drawing/2015/10/21/chartex" xmlns:cx3="http://schemas.microsoft.com/office/drawing/2016/5/9/chartex" xmlns:cx4="http://schemas.microsoft.com/office/drawing/2016/5/10/chartex" xmlns:cx5="http://schemas.microsoft.com/office/drawing/2016/5/11/chartex" xmlns:cx6="http://schemas.microsoft.com/office/drawing/2016/5/12/chartex" xmlns:cx7="http://schemas.microsoft.com/office/drawing/2016/5/13/chartex" xmlns:cx8="http://schemas.microsoft.com/office/drawing/2016/5/14/chartex" xmlns:mc="http://schemas.openxmlformats.org/markup-compatibility/2006" xmlns:aink="http://schemas.microsoft.com/office/drawing/2016/ink" xmlns:am3d="http://schemas.microsoft.com/office/drawing/2017/model3d" xmlns:o="urn:schemas-microsoft-com:office:office" xmlns:r="http://schemas.openxmlformats.org/officeDocument/2006/relationships" xmlns:m="http://schemas.openxmlformats.org/officeDocument/2006/math" xmlns:v="urn:schemas-microsoft-com:vml" xmlns:wp14="http://schemas.microsoft.com/office/word/2010/wordprocessingDrawing" xmlns:wp="http://schemas.openxmlformats.org/drawingml/2006/wordprocessingDrawing" xmlns:w10="urn:schemas-microsoft-com:office:word" xmlns:w="http://schemas.openxmlformats.org/wordprocessingml/2006/main" xmlns:w14="http://schemas.microsoft.com/office/word/2010/wordml" xmlns:w15="http://schemas.microsoft.com/office/word/2012/wordml" xmlns:w16cid="http://schemas.microsoft.com/office/word/2016/wordml/cid" xmlns:w16se="http://schemas.microsoft.com/office/word/2015/wordml/symex" xmlns:wpg="http://schemas.microsoft.com/office/word/2010/wordprocessingGroup" xmlns:wpi="http://schemas.microsoft.com/office/word/2010/wordprocessingInk" xmlns:wne="http://schemas.microsoft.com/office/word/2006/wordml" xmlns:wps="http://schemas.microsoft.com/office/word/2010/wordprocessingShape" mc:Ignorable="w14 w15 w16se w16cid wp14">
-  <w:endnote w:type="separator" w:id="-1">
+<w:endnotes xmlns:wpc="http://schemas.microsoft.com/office/word/2010/wordprocessingCanvas" xmlns:mc="http://schemas.openxmlformats.org/markup-compatibility/2006" xmlns:o="urn:schemas-microsoft-com:office:office" xmlns:r="http://schemas.openxmlformats.org/officeDocument/2006/relationships" xmlns:m="http://schemas.openxmlformats.org/officeDocument/2006/math" xmlns:v="urn:schemas-microsoft-com:vml" xmlns:wp14="http://schemas.microsoft.com/office/word/2010/wordprocessingDrawing" xmlns:wp="http://schemas.openxmlformats.org/drawingml/2006/wordprocessingDrawing" xmlns:w="http://schemas.openxmlformats.org/wordprocessingml/2006/main" xmlns:w14="http://schemas.microsoft.com/office/word/2010/wordml" xmlns:w15="http://schemas.microsoft.com/office/word/2012/wordml" xmlns:w10="urn:schemas-microsoft-com:office:word" xmlns:wpg="http://schemas.microsoft.com/office/word/2010/wordprocessingGroup" xmlns:wpi="http://schemas.microsoft.com/office/word/2010/wordprocessingInk" xmlns:wne="http://schemas.microsoft.com/office/word/2006/wordml" xmlns:wps="http://schemas.microsoft.com/office/word/2010/wordprocessingShape" xmlns:wpsCustomData="http://www.wps.cn/officeDocument/2013/wpsCustomData" mc:Ignorable="w14 w15 wp14">
+  <w:endnote w:type="separator" w:id="0">
     <w:p>
+      <w:pPr>
+        <w:spacing w:line="240" w:lineRule="auto"/>
+      </w:pPr>
       <w:r>
         <w:separator/>
       </w:r>
     </w:p>
   </w:endnote>
-  <w:endnote w:type="continuationSeparator" w:id="0">
+  <w:endnote w:type="continuationSeparator" w:id="1">
     <w:p>
+      <w:pPr>
+        <w:spacing w:line="240" w:lineRule="auto"/>
+      </w:pPr>
       <w:r>
         <w:continuationSeparator/>
       </w:r>
@@ -1888,16 +1714,22 @@
 </file>
 
 <file path=word/footnotes.xml><?xml version="1.0" encoding="utf-8"?>
-<w:footnotes xmlns:wpc="http://schemas.microsoft.com/office/word/2010/wordprocessingCanvas" xmlns:cx="http://schemas.microsoft.com/office/drawing/2014/chartex" xmlns:cx1="http://schemas.microsoft.com/office/drawing/2015/9/8/chartex" xmlns:cx2="http://schemas.microsoft.com/office/drawing/2015/10/21/chartex" xmlns:cx3="http://schemas.microsoft.com/office/drawing/2016/5/9/chartex" xmlns:cx4="http://schemas.microsoft.com/office/drawing/2016/5/10/chartex" xmlns:cx5="http://schemas.microsoft.com/office/drawing/2016/5/11/chartex" xmlns:cx6="http://schemas.microsoft.com/office/drawing/2016/5/12/chartex" xmlns:cx7="http://schemas.microsoft.com/office/drawing/2016/5/13/chartex" xmlns:cx8="http://schemas.microsoft.com/office/drawing/2016/5/14/chartex" xmlns:mc="http://schemas.openxmlformats.org/markup-compatibility/2006" xmlns:aink="http://schemas.microsoft.com/office/drawing/2016/ink" xmlns:am3d="http://schemas.microsoft.com/office/drawing/2017/model3d" xmlns:o="urn:schemas-microsoft-com:office:office" xmlns:r="http://schemas.openxmlformats.org/officeDocument/2006/relationships" xmlns:m="http://schemas.openxmlformats.org/officeDocument/2006/math" xmlns:v="urn:schemas-microsoft-com:vml" xmlns:wp14="http://schemas.microsoft.com/office/word/2010/wordprocessingDrawing" xmlns:wp="http://schemas.openxmlformats.org/drawingml/2006/wordprocessingDrawing" xmlns:w10="urn:schemas-microsoft-com:office:word" xmlns:w="http://schemas.openxmlformats.org/wordprocessingml/2006/main" xmlns:w14="http://schemas.microsoft.com/office/word/2010/wordml" xmlns:w15="http://schemas.microsoft.com/office/word/2012/wordml" xmlns:w16cid="http://schemas.microsoft.com/office/word/2016/wordml/cid" xmlns:w16se="http://schemas.microsoft.com/office/word/2015/wordml/symex" xmlns:wpg="http://schemas.microsoft.com/office/word/2010/wordprocessingGroup" xmlns:wpi="http://schemas.microsoft.com/office/word/2010/wordprocessingInk" xmlns:wne="http://schemas.microsoft.com/office/word/2006/wordml" xmlns:wps="http://schemas.microsoft.com/office/word/2010/wordprocessingShape" mc:Ignorable="w14 w15 w16se w16cid wp14">
-  <w:footnote w:type="separator" w:id="-1">
+<w:footnotes xmlns:wpc="http://schemas.microsoft.com/office/word/2010/wordprocessingCanvas" xmlns:mc="http://schemas.openxmlformats.org/markup-compatibility/2006" xmlns:o="urn:schemas-microsoft-com:office:office" xmlns:r="http://schemas.openxmlformats.org/officeDocument/2006/relationships" xmlns:m="http://schemas.openxmlformats.org/officeDocument/2006/math" xmlns:v="urn:schemas-microsoft-com:vml" xmlns:wp14="http://schemas.microsoft.com/office/word/2010/wordprocessingDrawing" xmlns:wp="http://schemas.openxmlformats.org/drawingml/2006/wordprocessingDrawing" xmlns:w="http://schemas.openxmlformats.org/wordprocessingml/2006/main" xmlns:w14="http://schemas.microsoft.com/office/word/2010/wordml" xmlns:w15="http://schemas.microsoft.com/office/word/2012/wordml" xmlns:w10="urn:schemas-microsoft-com:office:word" xmlns:wpg="http://schemas.microsoft.com/office/word/2010/wordprocessingGroup" xmlns:wpi="http://schemas.microsoft.com/office/word/2010/wordprocessingInk" xmlns:wne="http://schemas.microsoft.com/office/word/2006/wordml" xmlns:wps="http://schemas.microsoft.com/office/word/2010/wordprocessingShape" xmlns:wpsCustomData="http://www.wps.cn/officeDocument/2013/wpsCustomData" mc:Ignorable="w14 w15 wp14">
+  <w:footnote w:type="separator" w:id="0">
     <w:p>
+      <w:pPr>
+        <w:spacing w:before="0" w:after="0" w:line="240" w:lineRule="auto"/>
+      </w:pPr>
       <w:r>
         <w:separator/>
       </w:r>
     </w:p>
   </w:footnote>
-  <w:footnote w:type="continuationSeparator" w:id="0">
+  <w:footnote w:type="continuationSeparator" w:id="1">
     <w:p>
+      <w:pPr>
+        <w:spacing w:before="0" w:after="0" w:line="240" w:lineRule="auto"/>
+      </w:pPr>
       <w:r>
         <w:continuationSeparator/>
       </w:r>
@@ -1907,14 +1739,27 @@
 </file>
 
 <file path=word/header1.xml><?xml version="1.0" encoding="utf-8"?>
-<w:hdr xmlns:wpc="http://schemas.microsoft.com/office/word/2010/wordprocessingCanvas" xmlns:cx="http://schemas.microsoft.com/office/drawing/2014/chartex" xmlns:cx1="http://schemas.microsoft.com/office/drawing/2015/9/8/chartex" xmlns:cx2="http://schemas.microsoft.com/office/drawing/2015/10/21/chartex" xmlns:cx3="http://schemas.microsoft.com/office/drawing/2016/5/9/chartex" xmlns:cx4="http://schemas.microsoft.com/office/drawing/2016/5/10/chartex" xmlns:cx5="http://schemas.microsoft.com/office/drawing/2016/5/11/chartex" xmlns:cx6="http://schemas.microsoft.com/office/drawing/2016/5/12/chartex" xmlns:cx7="http://schemas.microsoft.com/office/drawing/2016/5/13/chartex" xmlns:cx8="http://schemas.microsoft.com/office/drawing/2016/5/14/chartex" xmlns:mc="http://schemas.openxmlformats.org/markup-compatibility/2006" xmlns:aink="http://schemas.microsoft.com/office/drawing/2016/ink" xmlns:am3d="http://schemas.microsoft.com/office/drawing/2017/model3d" xmlns:o="urn:schemas-microsoft-com:office:office" xmlns:r="http://schemas.openxmlformats.org/officeDocument/2006/relationships" xmlns:m="http://schemas.openxmlformats.org/officeDocument/2006/math" xmlns:v="urn:schemas-microsoft-com:vml" xmlns:wp14="http://schemas.microsoft.com/office/word/2010/wordprocessingDrawing" xmlns:wp="http://schemas.openxmlformats.org/drawingml/2006/wordprocessingDrawing" xmlns:w10="urn:schemas-microsoft-com:office:word" xmlns:w="http://schemas.openxmlformats.org/wordprocessingml/2006/main" xmlns:w14="http://schemas.microsoft.com/office/word/2010/wordml" xmlns:w15="http://schemas.microsoft.com/office/word/2012/wordml" xmlns:w16cid="http://schemas.microsoft.com/office/word/2016/wordml/cid" xmlns:w16se="http://schemas.microsoft.com/office/word/2015/wordml/symex" xmlns:wpg="http://schemas.microsoft.com/office/word/2010/wordprocessingGroup" xmlns:wpi="http://schemas.microsoft.com/office/word/2010/wordprocessingInk" xmlns:wne="http://schemas.microsoft.com/office/word/2006/wordml" xmlns:wps="http://schemas.microsoft.com/office/word/2010/wordprocessingShape" mc:Ignorable="w14 w15 w16se w16cid wp14">
+<w:hdr xmlns:wpc="http://schemas.microsoft.com/office/word/2010/wordprocessingCanvas" xmlns:mc="http://schemas.openxmlformats.org/markup-compatibility/2006" xmlns:o="urn:schemas-microsoft-com:office:office" xmlns:r="http://schemas.openxmlformats.org/officeDocument/2006/relationships" xmlns:m="http://schemas.openxmlformats.org/officeDocument/2006/math" xmlns:v="urn:schemas-microsoft-com:vml" xmlns:wp14="http://schemas.microsoft.com/office/word/2010/wordprocessingDrawing" xmlns:wp="http://schemas.openxmlformats.org/drawingml/2006/wordprocessingDrawing" xmlns:w10="urn:schemas-microsoft-com:office:word" xmlns:w="http://schemas.openxmlformats.org/wordprocessingml/2006/main" xmlns:w14="http://schemas.microsoft.com/office/word/2010/wordml" xmlns:w15="http://schemas.microsoft.com/office/word/2012/wordml" xmlns:wpg="http://schemas.microsoft.com/office/word/2010/wordprocessingGroup" xmlns:wpi="http://schemas.microsoft.com/office/word/2010/wordprocessingInk" xmlns:wne="http://schemas.microsoft.com/office/word/2006/wordml" xmlns:wps="http://schemas.microsoft.com/office/word/2010/wordprocessingShape" xmlns:wpsCustomData="http://www.wps.cn/officeDocument/2013/wpsCustomData" mc:Ignorable="w14 w15 wp14">
   <w:tbl>
     <w:tblPr>
-      <w:tblStyle w:val="a7"/>
+      <w:tblStyle w:val="8"/>
       <w:tblW w:w="16018" w:type="dxa"/>
       <w:tblInd w:w="-34" w:type="dxa"/>
+      <w:tblBorders>
+        <w:top w:val="single" w:color="000000" w:themeColor="text1" w:sz="4" w:space="0"/>
+        <w:left w:val="single" w:color="000000" w:themeColor="text1" w:sz="4" w:space="0"/>
+        <w:bottom w:val="single" w:color="000000" w:themeColor="text1" w:sz="4" w:space="0"/>
+        <w:right w:val="single" w:color="000000" w:themeColor="text1" w:sz="4" w:space="0"/>
+        <w:insideH w:val="single" w:color="000000" w:themeColor="text1" w:sz="4" w:space="0"/>
+        <w:insideV w:val="single" w:color="000000" w:themeColor="text1" w:sz="4" w:space="0"/>
+      </w:tblBorders>
       <w:tblLayout w:type="fixed"/>
-      <w:tblLook w:val="04A0" w:firstRow="1" w:lastRow="0" w:firstColumn="1" w:lastColumn="0" w:noHBand="0" w:noVBand="1"/>
+      <w:tblCellMar>
+        <w:top w:w="0" w:type="dxa"/>
+        <w:left w:w="108" w:type="dxa"/>
+        <w:bottom w:w="0" w:type="dxa"/>
+        <w:right w:w="108" w:type="dxa"/>
+      </w:tblCellMar>
     </w:tblPr>
     <w:tblGrid>
       <w:gridCol w:w="284"/>
@@ -1960,20 +1805,36 @@
       <w:gridCol w:w="283"/>
     </w:tblGrid>
     <w:tr>
+      <w:tblPrEx>
+        <w:tblBorders>
+          <w:top w:val="single" w:color="000000" w:themeColor="text1" w:sz="4" w:space="0"/>
+          <w:left w:val="single" w:color="000000" w:themeColor="text1" w:sz="4" w:space="0"/>
+          <w:bottom w:val="single" w:color="000000" w:themeColor="text1" w:sz="4" w:space="0"/>
+          <w:right w:val="single" w:color="000000" w:themeColor="text1" w:sz="4" w:space="0"/>
+          <w:insideH w:val="single" w:color="000000" w:themeColor="text1" w:sz="4" w:space="0"/>
+          <w:insideV w:val="single" w:color="000000" w:themeColor="text1" w:sz="4" w:space="0"/>
+        </w:tblBorders>
+        <w:tblCellMar>
+          <w:top w:w="0" w:type="dxa"/>
+          <w:left w:w="108" w:type="dxa"/>
+          <w:bottom w:w="0" w:type="dxa"/>
+          <w:right w:w="108" w:type="dxa"/>
+        </w:tblCellMar>
+      </w:tblPrEx>
       <w:tc>
         <w:tcPr>
           <w:tcW w:w="1004" w:type="dxa"/>
           <w:gridSpan w:val="3"/>
           <w:tcBorders>
-            <w:top w:val="single" w:sz="12" w:space="0" w:color="auto"/>
-            <w:left w:val="single" w:sz="12" w:space="0" w:color="auto"/>
-            <w:bottom w:val="single" w:sz="12" w:space="0" w:color="auto"/>
-            <w:right w:val="single" w:sz="12" w:space="0" w:color="auto"/>
-          </w:tcBorders>
-        </w:tcPr>
-        <w:p>
-          <w:pPr>
-            <w:pStyle w:val="a3"/>
+            <w:top w:val="single" w:color="auto" w:sz="12" w:space="0"/>
+            <w:left w:val="single" w:color="auto" w:sz="12" w:space="0"/>
+            <w:bottom w:val="single" w:color="auto" w:sz="12" w:space="0"/>
+            <w:right w:val="single" w:color="auto" w:sz="12" w:space="0"/>
+          </w:tcBorders>
+        </w:tcPr>
+        <w:p>
+          <w:pPr>
+            <w:pStyle w:val="5"/>
             <w:ind w:left="-85" w:right="-85"/>
             <w:rPr>
               <w:rFonts w:ascii="Arial" w:hAnsi="Arial" w:cs="Arial"/>
@@ -1981,23 +1842,13 @@
               <w:szCs w:val="20"/>
             </w:rPr>
           </w:pPr>
-          <w:proofErr w:type="spellStart"/>
           <w:r>
             <w:rPr>
               <w:rFonts w:ascii="Arial" w:hAnsi="Arial" w:cs="Arial"/>
               <w:sz w:val="20"/>
               <w:szCs w:val="20"/>
             </w:rPr>
-            <w:t>Инв</w:t>
-          </w:r>
-          <w:proofErr w:type="spellEnd"/>
-          <w:r>
-            <w:rPr>
-              <w:rFonts w:ascii="Arial" w:hAnsi="Arial" w:cs="Arial"/>
-              <w:sz w:val="20"/>
-              <w:szCs w:val="20"/>
-            </w:rPr>
-            <w:t xml:space="preserve"> №</w:t>
+            <w:t>Инв №</w:t>
           </w:r>
         </w:p>
       </w:tc>
@@ -2006,15 +1857,15 @@
           <w:tcW w:w="1265" w:type="dxa"/>
           <w:gridSpan w:val="2"/>
           <w:tcBorders>
-            <w:top w:val="single" w:sz="12" w:space="0" w:color="auto"/>
-            <w:left w:val="single" w:sz="12" w:space="0" w:color="auto"/>
-            <w:bottom w:val="single" w:sz="12" w:space="0" w:color="auto"/>
-            <w:right w:val="single" w:sz="12" w:space="0" w:color="auto"/>
-          </w:tcBorders>
-        </w:tcPr>
-        <w:p>
-          <w:pPr>
-            <w:pStyle w:val="a3"/>
+            <w:top w:val="single" w:color="auto" w:sz="12" w:space="0"/>
+            <w:left w:val="single" w:color="auto" w:sz="12" w:space="0"/>
+            <w:bottom w:val="single" w:color="auto" w:sz="12" w:space="0"/>
+            <w:right w:val="single" w:color="auto" w:sz="12" w:space="0"/>
+          </w:tcBorders>
+        </w:tcPr>
+        <w:p>
+          <w:pPr>
+            <w:pStyle w:val="5"/>
             <w:ind w:left="-85" w:right="-85"/>
             <w:jc w:val="center"/>
             <w:rPr>
@@ -2030,15 +1881,15 @@
           <w:tcW w:w="850" w:type="dxa"/>
           <w:gridSpan w:val="2"/>
           <w:tcBorders>
-            <w:top w:val="single" w:sz="12" w:space="0" w:color="auto"/>
-            <w:left w:val="single" w:sz="12" w:space="0" w:color="auto"/>
-            <w:bottom w:val="single" w:sz="12" w:space="0" w:color="auto"/>
-            <w:right w:val="single" w:sz="12" w:space="0" w:color="auto"/>
-          </w:tcBorders>
-        </w:tcPr>
-        <w:p>
-          <w:pPr>
-            <w:pStyle w:val="a3"/>
+            <w:top w:val="single" w:color="auto" w:sz="12" w:space="0"/>
+            <w:left w:val="single" w:color="auto" w:sz="12" w:space="0"/>
+            <w:bottom w:val="single" w:color="auto" w:sz="12" w:space="0"/>
+            <w:right w:val="single" w:color="auto" w:sz="12" w:space="0"/>
+          </w:tcBorders>
+        </w:tcPr>
+        <w:p>
+          <w:pPr>
+            <w:pStyle w:val="5"/>
             <w:ind w:left="-85" w:right="-85"/>
             <w:rPr>
               <w:rFonts w:ascii="Arial" w:hAnsi="Arial" w:cs="Arial"/>
@@ -2053,15 +1904,15 @@
           <w:tcW w:w="709" w:type="dxa"/>
           <w:gridSpan w:val="2"/>
           <w:tcBorders>
-            <w:top w:val="single" w:sz="12" w:space="0" w:color="auto"/>
-            <w:left w:val="single" w:sz="12" w:space="0" w:color="auto"/>
-            <w:bottom w:val="single" w:sz="12" w:space="0" w:color="auto"/>
-            <w:right w:val="single" w:sz="12" w:space="0" w:color="auto"/>
-          </w:tcBorders>
-        </w:tcPr>
-        <w:p>
-          <w:pPr>
-            <w:pStyle w:val="a3"/>
+            <w:top w:val="single" w:color="auto" w:sz="12" w:space="0"/>
+            <w:left w:val="single" w:color="auto" w:sz="12" w:space="0"/>
+            <w:bottom w:val="single" w:color="auto" w:sz="12" w:space="0"/>
+            <w:right w:val="single" w:color="auto" w:sz="12" w:space="0"/>
+          </w:tcBorders>
+        </w:tcPr>
+        <w:p>
+          <w:pPr>
+            <w:pStyle w:val="5"/>
             <w:ind w:left="-85" w:right="-85"/>
             <w:rPr>
               <w:rFonts w:ascii="Arial" w:hAnsi="Arial" w:cs="Arial"/>
@@ -2077,14 +1928,14 @@
           <w:gridSpan w:val="8"/>
           <w:tcBorders>
             <w:top w:val="nil"/>
-            <w:left w:val="single" w:sz="12" w:space="0" w:color="auto"/>
-            <w:bottom w:val="single" w:sz="12" w:space="0" w:color="auto"/>
-            <w:right w:val="single" w:sz="12" w:space="0" w:color="auto"/>
-          </w:tcBorders>
-        </w:tcPr>
-        <w:p>
-          <w:pPr>
-            <w:pStyle w:val="a3"/>
+            <w:left w:val="single" w:color="auto" w:sz="12" w:space="0"/>
+            <w:bottom w:val="single" w:color="auto" w:sz="12" w:space="0"/>
+            <w:right w:val="single" w:color="auto" w:sz="12" w:space="0"/>
+          </w:tcBorders>
+        </w:tcPr>
+        <w:p>
+          <w:pPr>
+            <w:pStyle w:val="5"/>
             <w:ind w:left="-85" w:right="-85"/>
             <w:rPr>
               <w:rFonts w:ascii="Arial" w:hAnsi="Arial" w:cs="Arial"/>
@@ -2099,15 +1950,15 @@
           <w:tcW w:w="559" w:type="dxa"/>
           <w:gridSpan w:val="2"/>
           <w:tcBorders>
-            <w:top w:val="single" w:sz="12" w:space="0" w:color="auto"/>
-            <w:left w:val="single" w:sz="12" w:space="0" w:color="auto"/>
-            <w:bottom w:val="single" w:sz="12" w:space="0" w:color="auto"/>
-            <w:right w:val="single" w:sz="12" w:space="0" w:color="auto"/>
-          </w:tcBorders>
-        </w:tcPr>
-        <w:p>
-          <w:pPr>
-            <w:pStyle w:val="a3"/>
+            <w:top w:val="single" w:color="auto" w:sz="12" w:space="0"/>
+            <w:left w:val="single" w:color="auto" w:sz="12" w:space="0"/>
+            <w:bottom w:val="single" w:color="auto" w:sz="12" w:space="0"/>
+            <w:right w:val="single" w:color="auto" w:sz="12" w:space="0"/>
+          </w:tcBorders>
+        </w:tcPr>
+        <w:p>
+          <w:pPr>
+            <w:pStyle w:val="5"/>
             <w:ind w:left="-85" w:right="-85"/>
             <w:jc w:val="center"/>
             <w:rPr>
@@ -2116,29 +1967,44 @@
               <w:szCs w:val="16"/>
             </w:rPr>
           </w:pPr>
-          <w:r>
+        </w:p>
+      </w:tc>
+      <w:tc>
+        <w:tcPr>
+          <w:tcW w:w="565" w:type="dxa"/>
+          <w:tcBorders>
+            <w:top w:val="single" w:color="auto" w:sz="12" w:space="0"/>
+            <w:left w:val="single" w:color="auto" w:sz="12" w:space="0"/>
+            <w:bottom w:val="single" w:color="auto" w:sz="12" w:space="0"/>
+            <w:right w:val="single" w:color="auto" w:sz="12" w:space="0"/>
+          </w:tcBorders>
+        </w:tcPr>
+        <w:p>
+          <w:pPr>
+            <w:pStyle w:val="5"/>
+            <w:ind w:left="-85" w:right="-85"/>
             <w:rPr>
               <w:rFonts w:ascii="Arial" w:hAnsi="Arial" w:cs="Arial"/>
               <w:sz w:val="16"/>
               <w:szCs w:val="16"/>
             </w:rPr>
-            <w:t>4</w:t>
-          </w:r>
-        </w:p>
-      </w:tc>
-      <w:tc>
-        <w:tcPr>
-          <w:tcW w:w="565" w:type="dxa"/>
-          <w:tcBorders>
-            <w:top w:val="single" w:sz="12" w:space="0" w:color="auto"/>
-            <w:left w:val="single" w:sz="12" w:space="0" w:color="auto"/>
-            <w:bottom w:val="single" w:sz="12" w:space="0" w:color="auto"/>
-            <w:right w:val="single" w:sz="12" w:space="0" w:color="auto"/>
-          </w:tcBorders>
-        </w:tcPr>
-        <w:p>
-          <w:pPr>
-            <w:pStyle w:val="a3"/>
+          </w:pPr>
+        </w:p>
+      </w:tc>
+      <w:tc>
+        <w:tcPr>
+          <w:tcW w:w="1128" w:type="dxa"/>
+          <w:gridSpan w:val="2"/>
+          <w:tcBorders>
+            <w:top w:val="single" w:color="auto" w:sz="12" w:space="0"/>
+            <w:left w:val="single" w:color="auto" w:sz="12" w:space="0"/>
+            <w:bottom w:val="single" w:color="auto" w:sz="12" w:space="0"/>
+            <w:right w:val="single" w:color="auto" w:sz="12" w:space="0"/>
+          </w:tcBorders>
+        </w:tcPr>
+        <w:p>
+          <w:pPr>
+            <w:pStyle w:val="5"/>
             <w:ind w:left="-85" w:right="-85"/>
             <w:rPr>
               <w:rFonts w:ascii="Arial" w:hAnsi="Arial" w:cs="Arial"/>
@@ -2152,24 +2018,24 @@
               <w:sz w:val="16"/>
               <w:szCs w:val="16"/>
             </w:rPr>
-            <w:t>Зам.</w:t>
-          </w:r>
-        </w:p>
-      </w:tc>
-      <w:tc>
-        <w:tcPr>
-          <w:tcW w:w="1128" w:type="dxa"/>
+            <w:t>ПМТ</w:t>
+          </w:r>
+        </w:p>
+      </w:tc>
+      <w:tc>
+        <w:tcPr>
+          <w:tcW w:w="611" w:type="dxa"/>
           <w:gridSpan w:val="2"/>
           <w:tcBorders>
-            <w:top w:val="single" w:sz="12" w:space="0" w:color="auto"/>
-            <w:left w:val="single" w:sz="12" w:space="0" w:color="auto"/>
-            <w:bottom w:val="single" w:sz="12" w:space="0" w:color="auto"/>
-            <w:right w:val="single" w:sz="12" w:space="0" w:color="auto"/>
-          </w:tcBorders>
-        </w:tcPr>
-        <w:p>
-          <w:pPr>
-            <w:pStyle w:val="a3"/>
+            <w:top w:val="single" w:color="auto" w:sz="12" w:space="0"/>
+            <w:left w:val="single" w:color="auto" w:sz="12" w:space="0"/>
+            <w:bottom w:val="single" w:color="auto" w:sz="12" w:space="0"/>
+            <w:right w:val="single" w:color="auto" w:sz="12" w:space="0"/>
+          </w:tcBorders>
+        </w:tcPr>
+        <w:p>
+          <w:pPr>
+            <w:pStyle w:val="5"/>
             <w:ind w:left="-85" w:right="-85"/>
             <w:rPr>
               <w:rFonts w:ascii="Arial" w:hAnsi="Arial" w:cs="Arial"/>
@@ -2177,123 +2043,36 @@
               <w:szCs w:val="16"/>
             </w:rPr>
           </w:pPr>
-          <w:r>
+        </w:p>
+      </w:tc>
+      <w:tc>
+        <w:tcPr>
+          <w:tcW w:w="825" w:type="dxa"/>
+          <w:gridSpan w:val="2"/>
+          <w:tcBorders>
+            <w:top w:val="single" w:color="auto" w:sz="12" w:space="0"/>
+            <w:left w:val="single" w:color="auto" w:sz="12" w:space="0"/>
+            <w:bottom w:val="single" w:color="auto" w:sz="12" w:space="0"/>
+            <w:right w:val="single" w:color="auto" w:sz="12" w:space="0"/>
+          </w:tcBorders>
+        </w:tcPr>
+        <w:p>
+          <w:pPr>
+            <w:pStyle w:val="5"/>
+            <w:ind w:left="-85" w:right="-85"/>
             <w:rPr>
               <w:rFonts w:ascii="Arial" w:hAnsi="Arial" w:cs="Arial"/>
               <w:sz w:val="16"/>
               <w:szCs w:val="16"/>
             </w:rPr>
-            <w:t>ПМТ</w:t>
-          </w:r>
+          </w:pPr>
           <w:r>
             <w:rPr>
               <w:rFonts w:ascii="Arial" w:hAnsi="Arial" w:cs="Arial"/>
               <w:sz w:val="16"/>
               <w:szCs w:val="16"/>
             </w:rPr>
-            <w:t>161</w:t>
-          </w:r>
-          <w:r>
-            <w:rPr>
-              <w:rFonts w:ascii="Arial" w:hAnsi="Arial" w:cs="Arial"/>
-              <w:sz w:val="16"/>
-              <w:szCs w:val="16"/>
-            </w:rPr>
             <w:t xml:space="preserve"> </w:t>
-          </w:r>
-          <w:r>
-            <w:rPr>
-              <w:rFonts w:ascii="Arial" w:hAnsi="Arial" w:cs="Arial"/>
-              <w:sz w:val="16"/>
-              <w:szCs w:val="16"/>
-            </w:rPr>
-            <w:t>-</w:t>
-          </w:r>
-          <w:r>
-            <w:rPr>
-              <w:rFonts w:ascii="Arial" w:hAnsi="Arial" w:cs="Arial"/>
-              <w:sz w:val="16"/>
-              <w:szCs w:val="16"/>
-            </w:rPr>
-            <w:t>20</w:t>
-          </w:r>
-          <w:r>
-            <w:rPr>
-              <w:rFonts w:ascii="Arial" w:hAnsi="Arial" w:cs="Arial"/>
-              <w:sz w:val="16"/>
-              <w:szCs w:val="16"/>
-            </w:rPr>
-            <w:t>2</w:t>
-          </w:r>
-          <w:r>
-            <w:rPr>
-              <w:rFonts w:ascii="Arial" w:hAnsi="Arial" w:cs="Arial"/>
-              <w:sz w:val="16"/>
-              <w:szCs w:val="16"/>
-            </w:rPr>
-            <w:t>4</w:t>
-          </w:r>
-        </w:p>
-      </w:tc>
-      <w:tc>
-        <w:tcPr>
-          <w:tcW w:w="611" w:type="dxa"/>
-          <w:gridSpan w:val="2"/>
-          <w:tcBorders>
-            <w:top w:val="single" w:sz="12" w:space="0" w:color="auto"/>
-            <w:left w:val="single" w:sz="12" w:space="0" w:color="auto"/>
-            <w:bottom w:val="single" w:sz="12" w:space="0" w:color="auto"/>
-            <w:right w:val="single" w:sz="12" w:space="0" w:color="auto"/>
-          </w:tcBorders>
-        </w:tcPr>
-        <w:p>
-          <w:pPr>
-            <w:pStyle w:val="a3"/>
-            <w:ind w:left="-85" w:right="-85"/>
-            <w:rPr>
-              <w:rFonts w:ascii="Arial" w:hAnsi="Arial" w:cs="Arial"/>
-              <w:sz w:val="16"/>
-              <w:szCs w:val="16"/>
-            </w:rPr>
-          </w:pPr>
-        </w:p>
-      </w:tc>
-      <w:tc>
-        <w:tcPr>
-          <w:tcW w:w="825" w:type="dxa"/>
-          <w:gridSpan w:val="2"/>
-          <w:tcBorders>
-            <w:top w:val="single" w:sz="12" w:space="0" w:color="auto"/>
-            <w:left w:val="single" w:sz="12" w:space="0" w:color="auto"/>
-            <w:bottom w:val="single" w:sz="12" w:space="0" w:color="auto"/>
-            <w:right w:val="single" w:sz="12" w:space="0" w:color="auto"/>
-          </w:tcBorders>
-        </w:tcPr>
-        <w:p>
-          <w:pPr>
-            <w:pStyle w:val="a3"/>
-            <w:ind w:left="-85" w:right="-85"/>
-            <w:rPr>
-              <w:rFonts w:ascii="Arial" w:hAnsi="Arial" w:cs="Arial"/>
-              <w:sz w:val="16"/>
-              <w:szCs w:val="16"/>
-            </w:rPr>
-          </w:pPr>
-          <w:r>
-            <w:rPr>
-              <w:rFonts w:ascii="Arial" w:hAnsi="Arial" w:cs="Arial"/>
-              <w:sz w:val="16"/>
-              <w:szCs w:val="16"/>
-            </w:rPr>
-            <w:t xml:space="preserve">   </w:t>
-          </w:r>
-          <w:r>
-            <w:rPr>
-              <w:rFonts w:ascii="Arial" w:hAnsi="Arial" w:cs="Arial"/>
-              <w:sz w:val="16"/>
-              <w:szCs w:val="16"/>
-            </w:rPr>
-            <w:t>12.07.24</w:t>
           </w:r>
         </w:p>
       </w:tc>
@@ -2302,15 +2081,15 @@
           <w:tcW w:w="684" w:type="dxa"/>
           <w:gridSpan w:val="3"/>
           <w:tcBorders>
-            <w:top w:val="single" w:sz="12" w:space="0" w:color="auto"/>
-            <w:left w:val="single" w:sz="12" w:space="0" w:color="auto"/>
-            <w:bottom w:val="single" w:sz="12" w:space="0" w:color="auto"/>
-            <w:right w:val="single" w:sz="12" w:space="0" w:color="auto"/>
-          </w:tcBorders>
-        </w:tcPr>
-        <w:p>
-          <w:pPr>
-            <w:pStyle w:val="a3"/>
+            <w:top w:val="single" w:color="auto" w:sz="12" w:space="0"/>
+            <w:left w:val="single" w:color="auto" w:sz="12" w:space="0"/>
+            <w:bottom w:val="single" w:color="auto" w:sz="12" w:space="0"/>
+            <w:right w:val="single" w:color="auto" w:sz="12" w:space="0"/>
+          </w:tcBorders>
+        </w:tcPr>
+        <w:p>
+          <w:pPr>
+            <w:pStyle w:val="5"/>
             <w:ind w:left="-85" w:right="-85"/>
             <w:rPr>
               <w:rFonts w:ascii="Arial" w:hAnsi="Arial" w:cs="Arial"/>
@@ -2325,15 +2104,15 @@
           <w:tcW w:w="709" w:type="dxa"/>
           <w:gridSpan w:val="3"/>
           <w:tcBorders>
-            <w:top w:val="single" w:sz="12" w:space="0" w:color="auto"/>
-            <w:left w:val="single" w:sz="12" w:space="0" w:color="auto"/>
-            <w:bottom w:val="single" w:sz="12" w:space="0" w:color="auto"/>
-            <w:right w:val="single" w:sz="12" w:space="0" w:color="auto"/>
-          </w:tcBorders>
-        </w:tcPr>
-        <w:p>
-          <w:pPr>
-            <w:pStyle w:val="a3"/>
+            <w:top w:val="single" w:color="auto" w:sz="12" w:space="0"/>
+            <w:left w:val="single" w:color="auto" w:sz="12" w:space="0"/>
+            <w:bottom w:val="single" w:color="auto" w:sz="12" w:space="0"/>
+            <w:right w:val="single" w:color="auto" w:sz="12" w:space="0"/>
+          </w:tcBorders>
+        </w:tcPr>
+        <w:p>
+          <w:pPr>
+            <w:pStyle w:val="5"/>
             <w:ind w:left="-85" w:right="-85"/>
             <w:rPr>
               <w:rFonts w:ascii="Arial" w:hAnsi="Arial" w:cs="Arial"/>
@@ -2348,15 +2127,15 @@
           <w:tcW w:w="807" w:type="dxa"/>
           <w:gridSpan w:val="2"/>
           <w:tcBorders>
-            <w:top w:val="single" w:sz="12" w:space="0" w:color="auto"/>
-            <w:left w:val="single" w:sz="12" w:space="0" w:color="auto"/>
-            <w:bottom w:val="single" w:sz="12" w:space="0" w:color="auto"/>
-            <w:right w:val="single" w:sz="12" w:space="0" w:color="auto"/>
-          </w:tcBorders>
-        </w:tcPr>
-        <w:p>
-          <w:pPr>
-            <w:pStyle w:val="a3"/>
+            <w:top w:val="single" w:color="auto" w:sz="12" w:space="0"/>
+            <w:left w:val="single" w:color="auto" w:sz="12" w:space="0"/>
+            <w:bottom w:val="single" w:color="auto" w:sz="12" w:space="0"/>
+            <w:right w:val="single" w:color="auto" w:sz="12" w:space="0"/>
+          </w:tcBorders>
+        </w:tcPr>
+        <w:p>
+          <w:pPr>
+            <w:pStyle w:val="5"/>
             <w:ind w:left="-85" w:right="-85"/>
             <w:rPr>
               <w:rFonts w:ascii="Arial" w:hAnsi="Arial" w:cs="Arial"/>
@@ -2371,15 +2150,15 @@
           <w:tcW w:w="894" w:type="dxa"/>
           <w:gridSpan w:val="4"/>
           <w:tcBorders>
-            <w:top w:val="single" w:sz="12" w:space="0" w:color="auto"/>
-            <w:left w:val="single" w:sz="12" w:space="0" w:color="auto"/>
-            <w:bottom w:val="single" w:sz="12" w:space="0" w:color="auto"/>
-            <w:right w:val="single" w:sz="12" w:space="0" w:color="auto"/>
-          </w:tcBorders>
-        </w:tcPr>
-        <w:p>
-          <w:pPr>
-            <w:pStyle w:val="a3"/>
+            <w:top w:val="single" w:color="auto" w:sz="12" w:space="0"/>
+            <w:left w:val="single" w:color="auto" w:sz="12" w:space="0"/>
+            <w:bottom w:val="single" w:color="auto" w:sz="12" w:space="0"/>
+            <w:right w:val="single" w:color="auto" w:sz="12" w:space="0"/>
+          </w:tcBorders>
+        </w:tcPr>
+        <w:p>
+          <w:pPr>
+            <w:pStyle w:val="5"/>
             <w:ind w:left="-85" w:right="-85"/>
             <w:rPr>
               <w:rFonts w:ascii="Arial" w:hAnsi="Arial" w:cs="Arial"/>
@@ -2394,15 +2173,15 @@
           <w:tcW w:w="992" w:type="dxa"/>
           <w:gridSpan w:val="3"/>
           <w:tcBorders>
-            <w:top w:val="single" w:sz="12" w:space="0" w:color="auto"/>
-            <w:left w:val="single" w:sz="12" w:space="0" w:color="auto"/>
-            <w:bottom w:val="single" w:sz="12" w:space="0" w:color="auto"/>
-            <w:right w:val="single" w:sz="12" w:space="0" w:color="auto"/>
-          </w:tcBorders>
-        </w:tcPr>
-        <w:p>
-          <w:pPr>
-            <w:pStyle w:val="a3"/>
+            <w:top w:val="single" w:color="auto" w:sz="12" w:space="0"/>
+            <w:left w:val="single" w:color="auto" w:sz="12" w:space="0"/>
+            <w:bottom w:val="single" w:color="auto" w:sz="12" w:space="0"/>
+            <w:right w:val="single" w:color="auto" w:sz="12" w:space="0"/>
+          </w:tcBorders>
+        </w:tcPr>
+        <w:p>
+          <w:pPr>
+            <w:pStyle w:val="5"/>
             <w:ind w:left="-85" w:right="-85"/>
             <w:rPr>
               <w:rFonts w:ascii="Arial" w:hAnsi="Arial" w:cs="Arial"/>
@@ -2414,20 +2193,36 @@
       </w:tc>
     </w:tr>
     <w:tr>
+      <w:tblPrEx>
+        <w:tblBorders>
+          <w:top w:val="single" w:color="000000" w:themeColor="text1" w:sz="4" w:space="0"/>
+          <w:left w:val="single" w:color="000000" w:themeColor="text1" w:sz="4" w:space="0"/>
+          <w:bottom w:val="single" w:color="000000" w:themeColor="text1" w:sz="4" w:space="0"/>
+          <w:right w:val="single" w:color="000000" w:themeColor="text1" w:sz="4" w:space="0"/>
+          <w:insideH w:val="single" w:color="000000" w:themeColor="text1" w:sz="4" w:space="0"/>
+          <w:insideV w:val="single" w:color="000000" w:themeColor="text1" w:sz="4" w:space="0"/>
+        </w:tblBorders>
+        <w:tblCellMar>
+          <w:top w:w="0" w:type="dxa"/>
+          <w:left w:w="108" w:type="dxa"/>
+          <w:bottom w:w="0" w:type="dxa"/>
+          <w:right w:w="108" w:type="dxa"/>
+        </w:tblCellMar>
+      </w:tblPrEx>
       <w:tc>
         <w:tcPr>
           <w:tcW w:w="1560" w:type="dxa"/>
           <w:gridSpan w:val="4"/>
           <w:tcBorders>
-            <w:top w:val="single" w:sz="12" w:space="0" w:color="auto"/>
-            <w:left w:val="single" w:sz="12" w:space="0" w:color="auto"/>
-            <w:bottom w:val="single" w:sz="12" w:space="0" w:color="auto"/>
-            <w:right w:val="single" w:sz="12" w:space="0" w:color="auto"/>
-          </w:tcBorders>
-        </w:tcPr>
-        <w:p>
-          <w:pPr>
-            <w:pStyle w:val="a3"/>
+            <w:top w:val="single" w:color="auto" w:sz="12" w:space="0"/>
+            <w:left w:val="single" w:color="auto" w:sz="12" w:space="0"/>
+            <w:bottom w:val="single" w:color="auto" w:sz="12" w:space="0"/>
+            <w:right w:val="single" w:color="auto" w:sz="12" w:space="0"/>
+          </w:tcBorders>
+        </w:tcPr>
+        <w:p>
+          <w:pPr>
+            <w:pStyle w:val="5"/>
             <w:ind w:left="-85" w:right="-85"/>
             <w:jc w:val="center"/>
             <w:rPr>
@@ -2439,7 +2234,7 @@
         </w:p>
         <w:p>
           <w:pPr>
-            <w:pStyle w:val="a3"/>
+            <w:pStyle w:val="5"/>
             <w:ind w:left="-85" w:right="-85"/>
             <w:jc w:val="center"/>
             <w:rPr>
@@ -2451,7 +2246,7 @@
         </w:p>
         <w:p>
           <w:pPr>
-            <w:pStyle w:val="a3"/>
+            <w:pStyle w:val="5"/>
             <w:ind w:left="-85" w:right="-85"/>
             <w:jc w:val="center"/>
             <w:rPr>
@@ -2467,16 +2262,16 @@
           <w:tcW w:w="3685" w:type="dxa"/>
           <w:gridSpan w:val="7"/>
           <w:tcBorders>
-            <w:top w:val="single" w:sz="12" w:space="0" w:color="auto"/>
-            <w:left w:val="single" w:sz="12" w:space="0" w:color="auto"/>
-            <w:bottom w:val="single" w:sz="12" w:space="0" w:color="auto"/>
-            <w:right w:val="single" w:sz="12" w:space="0" w:color="auto"/>
+            <w:top w:val="single" w:color="auto" w:sz="12" w:space="0"/>
+            <w:left w:val="single" w:color="auto" w:sz="12" w:space="0"/>
+            <w:bottom w:val="single" w:color="auto" w:sz="12" w:space="0"/>
+            <w:right w:val="single" w:color="auto" w:sz="12" w:space="0"/>
           </w:tcBorders>
           <w:vAlign w:val="center"/>
         </w:tcPr>
         <w:p>
           <w:pPr>
-            <w:pStyle w:val="a3"/>
+            <w:pStyle w:val="5"/>
             <w:ind w:left="-85" w:right="-85"/>
             <w:jc w:val="center"/>
             <w:rPr>
@@ -2508,16 +2303,16 @@
           <w:tcW w:w="993" w:type="dxa"/>
           <w:gridSpan w:val="2"/>
           <w:tcBorders>
-            <w:top w:val="single" w:sz="12" w:space="0" w:color="auto"/>
-            <w:left w:val="single" w:sz="12" w:space="0" w:color="auto"/>
-            <w:bottom w:val="single" w:sz="12" w:space="0" w:color="auto"/>
-            <w:right w:val="single" w:sz="12" w:space="0" w:color="auto"/>
+            <w:top w:val="single" w:color="auto" w:sz="12" w:space="0"/>
+            <w:left w:val="single" w:color="auto" w:sz="12" w:space="0"/>
+            <w:bottom w:val="single" w:color="auto" w:sz="12" w:space="0"/>
+            <w:right w:val="single" w:color="auto" w:sz="12" w:space="0"/>
           </w:tcBorders>
           <w:vAlign w:val="center"/>
         </w:tcPr>
         <w:p>
           <w:pPr>
-            <w:pStyle w:val="a3"/>
+            <w:pStyle w:val="5"/>
             <w:ind w:left="-85" w:right="-85"/>
             <w:jc w:val="center"/>
             <w:rPr>
@@ -2533,16 +2328,16 @@
           <w:tcW w:w="4961" w:type="dxa"/>
           <w:gridSpan w:val="12"/>
           <w:tcBorders>
-            <w:top w:val="single" w:sz="12" w:space="0" w:color="auto"/>
-            <w:left w:val="single" w:sz="12" w:space="0" w:color="auto"/>
-            <w:bottom w:val="single" w:sz="12" w:space="0" w:color="auto"/>
-            <w:right w:val="single" w:sz="12" w:space="0" w:color="auto"/>
+            <w:top w:val="single" w:color="auto" w:sz="12" w:space="0"/>
+            <w:left w:val="single" w:color="auto" w:sz="12" w:space="0"/>
+            <w:bottom w:val="single" w:color="auto" w:sz="12" w:space="0"/>
+            <w:right w:val="single" w:color="auto" w:sz="12" w:space="0"/>
           </w:tcBorders>
           <w:vAlign w:val="center"/>
         </w:tcPr>
         <w:p>
           <w:pPr>
-            <w:pStyle w:val="a3"/>
+            <w:pStyle w:val="5"/>
             <w:ind w:left="-85" w:right="-85"/>
             <w:jc w:val="center"/>
             <w:rPr>
@@ -2567,16 +2362,16 @@
           <w:tcW w:w="3260" w:type="dxa"/>
           <w:gridSpan w:val="11"/>
           <w:tcBorders>
-            <w:top w:val="single" w:sz="12" w:space="0" w:color="auto"/>
-            <w:left w:val="single" w:sz="12" w:space="0" w:color="auto"/>
-            <w:bottom w:val="single" w:sz="12" w:space="0" w:color="auto"/>
-            <w:right w:val="single" w:sz="12" w:space="0" w:color="auto"/>
+            <w:top w:val="single" w:color="auto" w:sz="12" w:space="0"/>
+            <w:left w:val="single" w:color="auto" w:sz="12" w:space="0"/>
+            <w:bottom w:val="single" w:color="auto" w:sz="12" w:space="0"/>
+            <w:right w:val="single" w:color="auto" w:sz="12" w:space="0"/>
           </w:tcBorders>
           <w:vAlign w:val="center"/>
         </w:tcPr>
         <w:p>
           <w:pPr>
-            <w:pStyle w:val="a3"/>
+            <w:pStyle w:val="5"/>
             <w:ind w:left="-85" w:right="-85"/>
             <w:jc w:val="center"/>
             <w:rPr>
@@ -2608,10 +2403,10 @@
           <w:tcW w:w="1559" w:type="dxa"/>
           <w:gridSpan w:val="5"/>
           <w:tcBorders>
-            <w:top w:val="single" w:sz="12" w:space="0" w:color="auto"/>
-            <w:left w:val="single" w:sz="12" w:space="0" w:color="auto"/>
-            <w:bottom w:val="single" w:sz="12" w:space="0" w:color="auto"/>
-            <w:right w:val="single" w:sz="12" w:space="0" w:color="auto"/>
+            <w:top w:val="single" w:color="auto" w:sz="12" w:space="0"/>
+            <w:left w:val="single" w:color="auto" w:sz="12" w:space="0"/>
+            <w:bottom w:val="single" w:color="auto" w:sz="12" w:space="0"/>
+            <w:right w:val="single" w:color="auto" w:sz="12" w:space="0"/>
           </w:tcBorders>
           <w:vAlign w:val="center"/>
         </w:tcPr>
@@ -2641,13 +2436,14 @@
               </w:rPr>
               <w:id w:val="4486106"/>
               <w:docPartObj>
-                <w:docPartGallery w:val="Page Numbers (Margins)"/>
-                <w:docPartUnique/>
+                <w:docPartGallery w:val="AutoText"/>
               </w:docPartObj>
             </w:sdtPr>
             <w:sdtEndPr>
               <w:rPr>
-                <w:rFonts w:cs="Arial"/>
+                <w:rFonts w:ascii="Arial Narrow" w:hAnsi="Arial Narrow" w:cs="Arial"/>
+                <w:b/>
+                <w:szCs w:val="26"/>
               </w:rPr>
             </w:sdtEndPr>
             <w:sdtContent>
@@ -2660,11 +2456,16 @@
                   </w:rPr>
                   <w:id w:val="107640144"/>
                   <w:docPartObj>
-                    <w:docPartGallery w:val="Page Numbers (Margins)"/>
-                    <w:docPartUnique/>
+                    <w:docPartGallery w:val="AutoText"/>
                   </w:docPartObj>
                 </w:sdtPr>
-                <w:sdtEndPr/>
+                <w:sdtEndPr>
+                  <w:rPr>
+                    <w:rFonts w:ascii="Arial Narrow" w:hAnsi="Arial Narrow" w:cs="Arial"/>
+                    <w:b/>
+                    <w:szCs w:val="26"/>
+                  </w:rPr>
+                </w:sdtEndPr>
                 <w:sdtContent>
                   <w:r>
                     <w:rPr>
@@ -2694,7 +2495,6 @@
                     <w:rPr>
                       <w:rFonts w:ascii="Arial Narrow" w:hAnsi="Arial Narrow" w:cs="Arial"/>
                       <w:b/>
-                      <w:noProof/>
                       <w:szCs w:val="26"/>
                     </w:rPr>
                     <w:t>52</w:t>
@@ -2715,23 +2515,39 @@
       </w:tc>
     </w:tr>
     <w:tr>
+      <w:tblPrEx>
+        <w:tblBorders>
+          <w:top w:val="single" w:color="000000" w:themeColor="text1" w:sz="4" w:space="0"/>
+          <w:left w:val="single" w:color="000000" w:themeColor="text1" w:sz="4" w:space="0"/>
+          <w:bottom w:val="single" w:color="000000" w:themeColor="text1" w:sz="4" w:space="0"/>
+          <w:right w:val="single" w:color="000000" w:themeColor="text1" w:sz="4" w:space="0"/>
+          <w:insideH w:val="single" w:color="000000" w:themeColor="text1" w:sz="4" w:space="0"/>
+          <w:insideV w:val="single" w:color="000000" w:themeColor="text1" w:sz="4" w:space="0"/>
+        </w:tblBorders>
+        <w:tblCellMar>
+          <w:top w:w="0" w:type="dxa"/>
+          <w:left w:w="108" w:type="dxa"/>
+          <w:bottom w:w="0" w:type="dxa"/>
+          <w:right w:w="108" w:type="dxa"/>
+        </w:tblCellMar>
+      </w:tblPrEx>
       <w:trPr>
-        <w:trHeight w:val="65"/>
+        <w:trHeight w:val="65" w:hRule="atLeast"/>
       </w:trPr>
       <w:tc>
         <w:tcPr>
           <w:tcW w:w="284" w:type="dxa"/>
           <w:tcBorders>
-            <w:top w:val="single" w:sz="12" w:space="0" w:color="auto"/>
-            <w:left w:val="single" w:sz="12" w:space="0" w:color="auto"/>
-            <w:bottom w:val="single" w:sz="12" w:space="0" w:color="auto"/>
-            <w:right w:val="single" w:sz="12" w:space="0" w:color="auto"/>
+            <w:top w:val="single" w:color="auto" w:sz="12" w:space="0"/>
+            <w:left w:val="single" w:color="auto" w:sz="12" w:space="0"/>
+            <w:bottom w:val="single" w:color="auto" w:sz="12" w:space="0"/>
+            <w:right w:val="single" w:color="auto" w:sz="12" w:space="0"/>
           </w:tcBorders>
           <w:vAlign w:val="center"/>
         </w:tcPr>
         <w:p>
           <w:pPr>
-            <w:pStyle w:val="a3"/>
+            <w:pStyle w:val="5"/>
             <w:ind w:left="-85" w:right="-85"/>
             <w:jc w:val="center"/>
             <w:rPr>
@@ -2754,16 +2570,16 @@
         <w:tcPr>
           <w:tcW w:w="425" w:type="dxa"/>
           <w:tcBorders>
-            <w:top w:val="single" w:sz="12" w:space="0" w:color="auto"/>
-            <w:left w:val="single" w:sz="12" w:space="0" w:color="auto"/>
-            <w:bottom w:val="single" w:sz="12" w:space="0" w:color="auto"/>
-            <w:right w:val="single" w:sz="12" w:space="0" w:color="auto"/>
+            <w:top w:val="single" w:color="auto" w:sz="12" w:space="0"/>
+            <w:left w:val="single" w:color="auto" w:sz="12" w:space="0"/>
+            <w:bottom w:val="single" w:color="auto" w:sz="12" w:space="0"/>
+            <w:right w:val="single" w:color="auto" w:sz="12" w:space="0"/>
           </w:tcBorders>
           <w:vAlign w:val="center"/>
         </w:tcPr>
         <w:p>
           <w:pPr>
-            <w:pStyle w:val="a3"/>
+            <w:pStyle w:val="5"/>
             <w:ind w:left="-85" w:right="-85"/>
             <w:jc w:val="center"/>
             <w:rPr>
@@ -2787,16 +2603,16 @@
           <w:tcW w:w="851" w:type="dxa"/>
           <w:gridSpan w:val="2"/>
           <w:tcBorders>
-            <w:top w:val="single" w:sz="12" w:space="0" w:color="auto"/>
-            <w:left w:val="single" w:sz="12" w:space="0" w:color="auto"/>
-            <w:bottom w:val="single" w:sz="12" w:space="0" w:color="auto"/>
-            <w:right w:val="single" w:sz="12" w:space="0" w:color="auto"/>
+            <w:top w:val="single" w:color="auto" w:sz="12" w:space="0"/>
+            <w:left w:val="single" w:color="auto" w:sz="12" w:space="0"/>
+            <w:bottom w:val="single" w:color="auto" w:sz="12" w:space="0"/>
+            <w:right w:val="single" w:color="auto" w:sz="12" w:space="0"/>
           </w:tcBorders>
           <w:vAlign w:val="center"/>
         </w:tcPr>
         <w:p>
           <w:pPr>
-            <w:pStyle w:val="a3"/>
+            <w:pStyle w:val="5"/>
             <w:ind w:left="-85" w:right="-85"/>
             <w:jc w:val="center"/>
             <w:rPr>
@@ -2820,16 +2636,16 @@
           <w:tcW w:w="1134" w:type="dxa"/>
           <w:gridSpan w:val="2"/>
           <w:tcBorders>
-            <w:top w:val="single" w:sz="12" w:space="0" w:color="auto"/>
-            <w:left w:val="single" w:sz="12" w:space="0" w:color="auto"/>
-            <w:bottom w:val="single" w:sz="12" w:space="0" w:color="auto"/>
-            <w:right w:val="single" w:sz="12" w:space="0" w:color="auto"/>
+            <w:top w:val="single" w:color="auto" w:sz="12" w:space="0"/>
+            <w:left w:val="single" w:color="auto" w:sz="12" w:space="0"/>
+            <w:bottom w:val="single" w:color="auto" w:sz="12" w:space="0"/>
+            <w:right w:val="single" w:color="auto" w:sz="12" w:space="0"/>
           </w:tcBorders>
           <w:vAlign w:val="center"/>
         </w:tcPr>
         <w:p>
           <w:pPr>
-            <w:pStyle w:val="a3"/>
+            <w:pStyle w:val="5"/>
             <w:ind w:left="-85" w:right="-85"/>
             <w:jc w:val="center"/>
             <w:rPr>
@@ -2853,16 +2669,16 @@
           <w:tcW w:w="567" w:type="dxa"/>
           <w:gridSpan w:val="2"/>
           <w:tcBorders>
-            <w:top w:val="single" w:sz="12" w:space="0" w:color="auto"/>
-            <w:left w:val="single" w:sz="12" w:space="0" w:color="auto"/>
-            <w:bottom w:val="single" w:sz="12" w:space="0" w:color="auto"/>
-            <w:right w:val="single" w:sz="12" w:space="0" w:color="auto"/>
+            <w:top w:val="single" w:color="auto" w:sz="12" w:space="0"/>
+            <w:left w:val="single" w:color="auto" w:sz="12" w:space="0"/>
+            <w:bottom w:val="single" w:color="auto" w:sz="12" w:space="0"/>
+            <w:right w:val="single" w:color="auto" w:sz="12" w:space="0"/>
           </w:tcBorders>
           <w:vAlign w:val="center"/>
         </w:tcPr>
         <w:p>
           <w:pPr>
-            <w:pStyle w:val="a3"/>
+            <w:pStyle w:val="5"/>
             <w:ind w:left="-85" w:right="-85"/>
             <w:jc w:val="center"/>
             <w:rPr>
@@ -2886,16 +2702,16 @@
           <w:tcW w:w="992" w:type="dxa"/>
           <w:gridSpan w:val="2"/>
           <w:tcBorders>
-            <w:top w:val="single" w:sz="12" w:space="0" w:color="auto"/>
-            <w:left w:val="single" w:sz="12" w:space="0" w:color="auto"/>
-            <w:bottom w:val="single" w:sz="12" w:space="0" w:color="auto"/>
-            <w:right w:val="single" w:sz="12" w:space="0" w:color="auto"/>
+            <w:top w:val="single" w:color="auto" w:sz="12" w:space="0"/>
+            <w:left w:val="single" w:color="auto" w:sz="12" w:space="0"/>
+            <w:bottom w:val="single" w:color="auto" w:sz="12" w:space="0"/>
+            <w:right w:val="single" w:color="auto" w:sz="12" w:space="0"/>
           </w:tcBorders>
           <w:vAlign w:val="center"/>
         </w:tcPr>
         <w:p>
           <w:pPr>
-            <w:pStyle w:val="a3"/>
+            <w:pStyle w:val="5"/>
             <w:ind w:left="-85" w:right="-85"/>
             <w:jc w:val="center"/>
             <w:rPr>
@@ -2919,16 +2735,16 @@
           <w:tcW w:w="1134" w:type="dxa"/>
           <w:gridSpan w:val="2"/>
           <w:tcBorders>
-            <w:top w:val="single" w:sz="12" w:space="0" w:color="auto"/>
-            <w:left w:val="single" w:sz="12" w:space="0" w:color="auto"/>
-            <w:bottom w:val="single" w:sz="12" w:space="0" w:color="auto"/>
-            <w:right w:val="single" w:sz="12" w:space="0" w:color="auto"/>
+            <w:top w:val="single" w:color="auto" w:sz="12" w:space="0"/>
+            <w:left w:val="single" w:color="auto" w:sz="12" w:space="0"/>
+            <w:bottom w:val="single" w:color="auto" w:sz="12" w:space="0"/>
+            <w:right w:val="single" w:color="auto" w:sz="12" w:space="0"/>
           </w:tcBorders>
           <w:vAlign w:val="center"/>
         </w:tcPr>
         <w:p>
           <w:pPr>
-            <w:pStyle w:val="a3"/>
+            <w:pStyle w:val="5"/>
             <w:ind w:left="-85" w:right="-85"/>
             <w:jc w:val="center"/>
             <w:rPr>
@@ -2952,16 +2768,16 @@
           <w:tcW w:w="1134" w:type="dxa"/>
           <w:gridSpan w:val="2"/>
           <w:tcBorders>
-            <w:top w:val="single" w:sz="12" w:space="0" w:color="auto"/>
-            <w:left w:val="single" w:sz="12" w:space="0" w:color="auto"/>
-            <w:bottom w:val="single" w:sz="12" w:space="0" w:color="auto"/>
-            <w:right w:val="single" w:sz="12" w:space="0" w:color="auto"/>
+            <w:top w:val="single" w:color="auto" w:sz="12" w:space="0"/>
+            <w:left w:val="single" w:color="auto" w:sz="12" w:space="0"/>
+            <w:bottom w:val="single" w:color="auto" w:sz="12" w:space="0"/>
+            <w:right w:val="single" w:color="auto" w:sz="12" w:space="0"/>
           </w:tcBorders>
           <w:vAlign w:val="center"/>
         </w:tcPr>
         <w:p>
           <w:pPr>
-            <w:pStyle w:val="a3"/>
+            <w:pStyle w:val="5"/>
             <w:ind w:left="-85" w:right="-85"/>
             <w:jc w:val="center"/>
             <w:rPr>
@@ -2984,16 +2800,16 @@
         <w:tcPr>
           <w:tcW w:w="851" w:type="dxa"/>
           <w:tcBorders>
-            <w:top w:val="single" w:sz="12" w:space="0" w:color="auto"/>
-            <w:left w:val="single" w:sz="12" w:space="0" w:color="auto"/>
-            <w:bottom w:val="single" w:sz="12" w:space="0" w:color="auto"/>
-            <w:right w:val="single" w:sz="12" w:space="0" w:color="auto"/>
+            <w:top w:val="single" w:color="auto" w:sz="12" w:space="0"/>
+            <w:left w:val="single" w:color="auto" w:sz="12" w:space="0"/>
+            <w:bottom w:val="single" w:color="auto" w:sz="12" w:space="0"/>
+            <w:right w:val="single" w:color="auto" w:sz="12" w:space="0"/>
           </w:tcBorders>
           <w:vAlign w:val="center"/>
         </w:tcPr>
         <w:p>
           <w:pPr>
-            <w:pStyle w:val="a3"/>
+            <w:pStyle w:val="5"/>
             <w:ind w:left="-85" w:right="-85"/>
             <w:jc w:val="center"/>
             <w:rPr>
@@ -3016,16 +2832,16 @@
         <w:tcPr>
           <w:tcW w:w="283" w:type="dxa"/>
           <w:tcBorders>
-            <w:top w:val="single" w:sz="12" w:space="0" w:color="auto"/>
-            <w:left w:val="single" w:sz="12" w:space="0" w:color="auto"/>
-            <w:bottom w:val="single" w:sz="12" w:space="0" w:color="auto"/>
-            <w:right w:val="single" w:sz="12" w:space="0" w:color="auto"/>
+            <w:top w:val="single" w:color="auto" w:sz="12" w:space="0"/>
+            <w:left w:val="single" w:color="auto" w:sz="12" w:space="0"/>
+            <w:bottom w:val="single" w:color="auto" w:sz="12" w:space="0"/>
+            <w:right w:val="single" w:color="auto" w:sz="12" w:space="0"/>
           </w:tcBorders>
           <w:vAlign w:val="center"/>
         </w:tcPr>
         <w:p>
           <w:pPr>
-            <w:pStyle w:val="a3"/>
+            <w:pStyle w:val="5"/>
             <w:ind w:left="-85" w:right="-85"/>
             <w:jc w:val="center"/>
             <w:rPr>
@@ -3049,16 +2865,16 @@
           <w:tcW w:w="851" w:type="dxa"/>
           <w:gridSpan w:val="2"/>
           <w:tcBorders>
-            <w:top w:val="single" w:sz="12" w:space="0" w:color="auto"/>
-            <w:left w:val="single" w:sz="12" w:space="0" w:color="auto"/>
-            <w:bottom w:val="single" w:sz="12" w:space="0" w:color="auto"/>
-            <w:right w:val="single" w:sz="12" w:space="0" w:color="auto"/>
+            <w:top w:val="single" w:color="auto" w:sz="12" w:space="0"/>
+            <w:left w:val="single" w:color="auto" w:sz="12" w:space="0"/>
+            <w:bottom w:val="single" w:color="auto" w:sz="12" w:space="0"/>
+            <w:right w:val="single" w:color="auto" w:sz="12" w:space="0"/>
           </w:tcBorders>
           <w:vAlign w:val="center"/>
         </w:tcPr>
         <w:p>
           <w:pPr>
-            <w:pStyle w:val="a3"/>
+            <w:pStyle w:val="5"/>
             <w:ind w:left="-85" w:right="-85"/>
             <w:jc w:val="center"/>
             <w:rPr>
@@ -3082,16 +2898,16 @@
           <w:tcW w:w="1275" w:type="dxa"/>
           <w:gridSpan w:val="3"/>
           <w:tcBorders>
-            <w:top w:val="single" w:sz="12" w:space="0" w:color="auto"/>
-            <w:left w:val="single" w:sz="12" w:space="0" w:color="auto"/>
-            <w:bottom w:val="single" w:sz="12" w:space="0" w:color="auto"/>
-            <w:right w:val="single" w:sz="12" w:space="0" w:color="auto"/>
+            <w:top w:val="single" w:color="auto" w:sz="12" w:space="0"/>
+            <w:left w:val="single" w:color="auto" w:sz="12" w:space="0"/>
+            <w:bottom w:val="single" w:color="auto" w:sz="12" w:space="0"/>
+            <w:right w:val="single" w:color="auto" w:sz="12" w:space="0"/>
           </w:tcBorders>
           <w:vAlign w:val="center"/>
         </w:tcPr>
         <w:p>
           <w:pPr>
-            <w:pStyle w:val="a3"/>
+            <w:pStyle w:val="5"/>
             <w:ind w:left="-85" w:right="-85"/>
             <w:jc w:val="center"/>
             <w:rPr>
@@ -3115,16 +2931,16 @@
           <w:tcW w:w="1134" w:type="dxa"/>
           <w:gridSpan w:val="2"/>
           <w:tcBorders>
-            <w:top w:val="single" w:sz="12" w:space="0" w:color="auto"/>
-            <w:left w:val="single" w:sz="12" w:space="0" w:color="auto"/>
-            <w:bottom w:val="single" w:sz="12" w:space="0" w:color="auto"/>
-            <w:right w:val="single" w:sz="12" w:space="0" w:color="auto"/>
+            <w:top w:val="single" w:color="auto" w:sz="12" w:space="0"/>
+            <w:left w:val="single" w:color="auto" w:sz="12" w:space="0"/>
+            <w:bottom w:val="single" w:color="auto" w:sz="12" w:space="0"/>
+            <w:right w:val="single" w:color="auto" w:sz="12" w:space="0"/>
           </w:tcBorders>
           <w:vAlign w:val="center"/>
         </w:tcPr>
         <w:p>
           <w:pPr>
-            <w:pStyle w:val="a3"/>
+            <w:pStyle w:val="5"/>
             <w:ind w:left="-85" w:right="-85"/>
             <w:jc w:val="center"/>
             <w:rPr>
@@ -3148,16 +2964,16 @@
           <w:tcW w:w="284" w:type="dxa"/>
           <w:gridSpan w:val="2"/>
           <w:tcBorders>
-            <w:top w:val="single" w:sz="12" w:space="0" w:color="auto"/>
-            <w:left w:val="single" w:sz="12" w:space="0" w:color="auto"/>
-            <w:bottom w:val="single" w:sz="12" w:space="0" w:color="auto"/>
-            <w:right w:val="single" w:sz="12" w:space="0" w:color="auto"/>
+            <w:top w:val="single" w:color="auto" w:sz="12" w:space="0"/>
+            <w:left w:val="single" w:color="auto" w:sz="12" w:space="0"/>
+            <w:bottom w:val="single" w:color="auto" w:sz="12" w:space="0"/>
+            <w:right w:val="single" w:color="auto" w:sz="12" w:space="0"/>
           </w:tcBorders>
           <w:vAlign w:val="center"/>
         </w:tcPr>
         <w:p>
           <w:pPr>
-            <w:pStyle w:val="a3"/>
+            <w:pStyle w:val="5"/>
             <w:ind w:left="-85" w:right="-85"/>
             <w:jc w:val="center"/>
             <w:rPr>
@@ -3181,16 +2997,16 @@
           <w:tcW w:w="992" w:type="dxa"/>
           <w:gridSpan w:val="2"/>
           <w:tcBorders>
-            <w:top w:val="single" w:sz="12" w:space="0" w:color="auto"/>
-            <w:left w:val="single" w:sz="12" w:space="0" w:color="auto"/>
-            <w:bottom w:val="single" w:sz="12" w:space="0" w:color="auto"/>
-            <w:right w:val="single" w:sz="12" w:space="0" w:color="auto"/>
+            <w:top w:val="single" w:color="auto" w:sz="12" w:space="0"/>
+            <w:left w:val="single" w:color="auto" w:sz="12" w:space="0"/>
+            <w:bottom w:val="single" w:color="auto" w:sz="12" w:space="0"/>
+            <w:right w:val="single" w:color="auto" w:sz="12" w:space="0"/>
           </w:tcBorders>
           <w:vAlign w:val="center"/>
         </w:tcPr>
         <w:p>
           <w:pPr>
-            <w:pStyle w:val="a3"/>
+            <w:pStyle w:val="5"/>
             <w:ind w:left="-85" w:right="-85"/>
             <w:jc w:val="center"/>
             <w:rPr>
@@ -3213,16 +3029,16 @@
         <w:tcPr>
           <w:tcW w:w="284" w:type="dxa"/>
           <w:tcBorders>
-            <w:top w:val="single" w:sz="12" w:space="0" w:color="auto"/>
-            <w:left w:val="single" w:sz="12" w:space="0" w:color="auto"/>
-            <w:bottom w:val="single" w:sz="12" w:space="0" w:color="auto"/>
-            <w:right w:val="single" w:sz="12" w:space="0" w:color="auto"/>
+            <w:top w:val="single" w:color="auto" w:sz="12" w:space="0"/>
+            <w:left w:val="single" w:color="auto" w:sz="12" w:space="0"/>
+            <w:bottom w:val="single" w:color="auto" w:sz="12" w:space="0"/>
+            <w:right w:val="single" w:color="auto" w:sz="12" w:space="0"/>
           </w:tcBorders>
           <w:vAlign w:val="center"/>
         </w:tcPr>
         <w:p>
           <w:pPr>
-            <w:pStyle w:val="a3"/>
+            <w:pStyle w:val="5"/>
             <w:ind w:left="-85" w:right="-85"/>
             <w:jc w:val="center"/>
             <w:rPr>
@@ -3246,16 +3062,16 @@
           <w:tcW w:w="283" w:type="dxa"/>
           <w:gridSpan w:val="2"/>
           <w:tcBorders>
-            <w:top w:val="single" w:sz="12" w:space="0" w:color="auto"/>
-            <w:left w:val="single" w:sz="12" w:space="0" w:color="auto"/>
-            <w:bottom w:val="single" w:sz="12" w:space="0" w:color="auto"/>
-            <w:right w:val="single" w:sz="12" w:space="0" w:color="auto"/>
+            <w:top w:val="single" w:color="auto" w:sz="12" w:space="0"/>
+            <w:left w:val="single" w:color="auto" w:sz="12" w:space="0"/>
+            <w:bottom w:val="single" w:color="auto" w:sz="12" w:space="0"/>
+            <w:right w:val="single" w:color="auto" w:sz="12" w:space="0"/>
           </w:tcBorders>
           <w:vAlign w:val="center"/>
         </w:tcPr>
         <w:p>
           <w:pPr>
-            <w:pStyle w:val="a3"/>
+            <w:pStyle w:val="5"/>
             <w:ind w:left="-85" w:right="-85"/>
             <w:jc w:val="center"/>
             <w:rPr>
@@ -3278,16 +3094,16 @@
         <w:tcPr>
           <w:tcW w:w="425" w:type="dxa"/>
           <w:tcBorders>
-            <w:top w:val="single" w:sz="12" w:space="0" w:color="auto"/>
-            <w:left w:val="single" w:sz="12" w:space="0" w:color="auto"/>
-            <w:bottom w:val="single" w:sz="12" w:space="0" w:color="auto"/>
-            <w:right w:val="single" w:sz="12" w:space="0" w:color="auto"/>
+            <w:top w:val="single" w:color="auto" w:sz="12" w:space="0"/>
+            <w:left w:val="single" w:color="auto" w:sz="12" w:space="0"/>
+            <w:bottom w:val="single" w:color="auto" w:sz="12" w:space="0"/>
+            <w:right w:val="single" w:color="auto" w:sz="12" w:space="0"/>
           </w:tcBorders>
           <w:vAlign w:val="center"/>
         </w:tcPr>
         <w:p>
           <w:pPr>
-            <w:pStyle w:val="a3"/>
+            <w:pStyle w:val="5"/>
             <w:ind w:left="-85" w:right="-85"/>
             <w:jc w:val="center"/>
             <w:rPr>
@@ -3311,16 +3127,16 @@
           <w:tcW w:w="284" w:type="dxa"/>
           <w:gridSpan w:val="2"/>
           <w:tcBorders>
-            <w:top w:val="single" w:sz="12" w:space="0" w:color="auto"/>
-            <w:left w:val="single" w:sz="12" w:space="0" w:color="auto"/>
-            <w:bottom w:val="single" w:sz="12" w:space="0" w:color="auto"/>
-            <w:right w:val="single" w:sz="8" w:space="0" w:color="auto"/>
+            <w:top w:val="single" w:color="auto" w:sz="12" w:space="0"/>
+            <w:left w:val="single" w:color="auto" w:sz="12" w:space="0"/>
+            <w:bottom w:val="single" w:color="auto" w:sz="12" w:space="0"/>
+            <w:right w:val="single" w:color="auto" w:sz="8" w:space="0"/>
           </w:tcBorders>
           <w:vAlign w:val="center"/>
         </w:tcPr>
         <w:p>
           <w:pPr>
-            <w:pStyle w:val="a3"/>
+            <w:pStyle w:val="5"/>
             <w:ind w:left="-85" w:right="-85"/>
             <w:jc w:val="center"/>
             <w:rPr>
@@ -3344,16 +3160,16 @@
           <w:tcW w:w="709" w:type="dxa"/>
           <w:gridSpan w:val="2"/>
           <w:tcBorders>
-            <w:top w:val="single" w:sz="12" w:space="0" w:color="auto"/>
-            <w:left w:val="single" w:sz="8" w:space="0" w:color="auto"/>
-            <w:bottom w:val="single" w:sz="12" w:space="0" w:color="auto"/>
-            <w:right w:val="single" w:sz="8" w:space="0" w:color="auto"/>
+            <w:top w:val="single" w:color="auto" w:sz="12" w:space="0"/>
+            <w:left w:val="single" w:color="auto" w:sz="8" w:space="0"/>
+            <w:bottom w:val="single" w:color="auto" w:sz="12" w:space="0"/>
+            <w:right w:val="single" w:color="auto" w:sz="8" w:space="0"/>
           </w:tcBorders>
           <w:vAlign w:val="center"/>
         </w:tcPr>
         <w:p>
           <w:pPr>
-            <w:pStyle w:val="a3"/>
+            <w:pStyle w:val="5"/>
             <w:ind w:left="-85" w:right="-85"/>
             <w:jc w:val="center"/>
             <w:rPr>
@@ -3376,16 +3192,16 @@
         <w:tcPr>
           <w:tcW w:w="283" w:type="dxa"/>
           <w:tcBorders>
-            <w:top w:val="single" w:sz="12" w:space="0" w:color="auto"/>
-            <w:left w:val="single" w:sz="8" w:space="0" w:color="auto"/>
-            <w:bottom w:val="single" w:sz="12" w:space="0" w:color="auto"/>
-            <w:right w:val="single" w:sz="8" w:space="0" w:color="auto"/>
+            <w:top w:val="single" w:color="auto" w:sz="12" w:space="0"/>
+            <w:left w:val="single" w:color="auto" w:sz="8" w:space="0"/>
+            <w:bottom w:val="single" w:color="auto" w:sz="12" w:space="0"/>
+            <w:right w:val="single" w:color="auto" w:sz="8" w:space="0"/>
           </w:tcBorders>
           <w:vAlign w:val="center"/>
         </w:tcPr>
         <w:p>
           <w:pPr>
-            <w:pStyle w:val="a3"/>
+            <w:pStyle w:val="5"/>
             <w:ind w:left="-85" w:right="-85"/>
             <w:jc w:val="center"/>
             <w:rPr>
@@ -3408,16 +3224,16 @@
         <w:tcPr>
           <w:tcW w:w="284" w:type="dxa"/>
           <w:tcBorders>
-            <w:top w:val="single" w:sz="12" w:space="0" w:color="auto"/>
-            <w:left w:val="single" w:sz="8" w:space="0" w:color="auto"/>
-            <w:bottom w:val="single" w:sz="12" w:space="0" w:color="auto"/>
-            <w:right w:val="single" w:sz="8" w:space="0" w:color="auto"/>
+            <w:top w:val="single" w:color="auto" w:sz="12" w:space="0"/>
+            <w:left w:val="single" w:color="auto" w:sz="8" w:space="0"/>
+            <w:bottom w:val="single" w:color="auto" w:sz="12" w:space="0"/>
+            <w:right w:val="single" w:color="auto" w:sz="8" w:space="0"/>
           </w:tcBorders>
           <w:vAlign w:val="center"/>
         </w:tcPr>
         <w:p>
           <w:pPr>
-            <w:pStyle w:val="a3"/>
+            <w:pStyle w:val="5"/>
             <w:ind w:left="-85" w:right="-85"/>
             <w:jc w:val="center"/>
             <w:rPr>
@@ -3441,16 +3257,16 @@
           <w:tcW w:w="708" w:type="dxa"/>
           <w:gridSpan w:val="2"/>
           <w:tcBorders>
-            <w:top w:val="single" w:sz="12" w:space="0" w:color="auto"/>
-            <w:left w:val="single" w:sz="8" w:space="0" w:color="auto"/>
-            <w:bottom w:val="single" w:sz="12" w:space="0" w:color="auto"/>
-            <w:right w:val="single" w:sz="8" w:space="0" w:color="auto"/>
+            <w:top w:val="single" w:color="auto" w:sz="12" w:space="0"/>
+            <w:left w:val="single" w:color="auto" w:sz="8" w:space="0"/>
+            <w:bottom w:val="single" w:color="auto" w:sz="12" w:space="0"/>
+            <w:right w:val="single" w:color="auto" w:sz="8" w:space="0"/>
           </w:tcBorders>
           <w:vAlign w:val="center"/>
         </w:tcPr>
         <w:p>
           <w:pPr>
-            <w:pStyle w:val="a3"/>
+            <w:pStyle w:val="5"/>
             <w:ind w:left="-85" w:right="-85"/>
             <w:jc w:val="center"/>
             <w:rPr>
@@ -3473,16 +3289,16 @@
         <w:tcPr>
           <w:tcW w:w="284" w:type="dxa"/>
           <w:tcBorders>
-            <w:top w:val="single" w:sz="12" w:space="0" w:color="auto"/>
-            <w:left w:val="single" w:sz="8" w:space="0" w:color="auto"/>
-            <w:bottom w:val="single" w:sz="12" w:space="0" w:color="auto"/>
-            <w:right w:val="single" w:sz="8" w:space="0" w:color="auto"/>
+            <w:top w:val="single" w:color="auto" w:sz="12" w:space="0"/>
+            <w:left w:val="single" w:color="auto" w:sz="8" w:space="0"/>
+            <w:bottom w:val="single" w:color="auto" w:sz="12" w:space="0"/>
+            <w:right w:val="single" w:color="auto" w:sz="8" w:space="0"/>
           </w:tcBorders>
           <w:vAlign w:val="center"/>
         </w:tcPr>
         <w:p>
           <w:pPr>
-            <w:pStyle w:val="a3"/>
+            <w:pStyle w:val="5"/>
             <w:ind w:left="-85" w:right="-85"/>
             <w:jc w:val="center"/>
             <w:rPr>
@@ -3505,16 +3321,16 @@
         <w:tcPr>
           <w:tcW w:w="283" w:type="dxa"/>
           <w:tcBorders>
-            <w:top w:val="single" w:sz="12" w:space="0" w:color="auto"/>
-            <w:left w:val="single" w:sz="8" w:space="0" w:color="auto"/>
-            <w:bottom w:val="single" w:sz="12" w:space="0" w:color="auto"/>
-            <w:right w:val="single" w:sz="8" w:space="0" w:color="auto"/>
+            <w:top w:val="single" w:color="auto" w:sz="12" w:space="0"/>
+            <w:left w:val="single" w:color="auto" w:sz="8" w:space="0"/>
+            <w:bottom w:val="single" w:color="auto" w:sz="12" w:space="0"/>
+            <w:right w:val="single" w:color="auto" w:sz="8" w:space="0"/>
           </w:tcBorders>
           <w:vAlign w:val="center"/>
         </w:tcPr>
         <w:p>
           <w:pPr>
-            <w:pStyle w:val="a3"/>
+            <w:pStyle w:val="5"/>
             <w:ind w:left="-85" w:right="-85"/>
             <w:jc w:val="center"/>
             <w:rPr>
@@ -3537,7 +3353,7 @@
   </w:tbl>
   <w:p>
     <w:pPr>
-      <w:pStyle w:val="a3"/>
+      <w:pStyle w:val="5"/>
       <w:rPr>
         <w:sz w:val="2"/>
         <w:szCs w:val="2"/>
@@ -3548,13 +3364,27 @@
 </file>
 
 <file path=word/header2.xml><?xml version="1.0" encoding="utf-8"?>
-<w:hdr xmlns:wpc="http://schemas.microsoft.com/office/word/2010/wordprocessingCanvas" xmlns:cx="http://schemas.microsoft.com/office/drawing/2014/chartex" xmlns:cx1="http://schemas.microsoft.com/office/drawing/2015/9/8/chartex" xmlns:cx2="http://schemas.microsoft.com/office/drawing/2015/10/21/chartex" xmlns:cx3="http://schemas.microsoft.com/office/drawing/2016/5/9/chartex" xmlns:cx4="http://schemas.microsoft.com/office/drawing/2016/5/10/chartex" xmlns:cx5="http://schemas.microsoft.com/office/drawing/2016/5/11/chartex" xmlns:cx6="http://schemas.microsoft.com/office/drawing/2016/5/12/chartex" xmlns:cx7="http://schemas.microsoft.com/office/drawing/2016/5/13/chartex" xmlns:cx8="http://schemas.microsoft.com/office/drawing/2016/5/14/chartex" xmlns:mc="http://schemas.openxmlformats.org/markup-compatibility/2006" xmlns:aink="http://schemas.microsoft.com/office/drawing/2016/ink" xmlns:am3d="http://schemas.microsoft.com/office/drawing/2017/model3d" xmlns:o="urn:schemas-microsoft-com:office:office" xmlns:r="http://schemas.openxmlformats.org/officeDocument/2006/relationships" xmlns:m="http://schemas.openxmlformats.org/officeDocument/2006/math" xmlns:v="urn:schemas-microsoft-com:vml" xmlns:wp14="http://schemas.microsoft.com/office/word/2010/wordprocessingDrawing" xmlns:wp="http://schemas.openxmlformats.org/drawingml/2006/wordprocessingDrawing" xmlns:w10="urn:schemas-microsoft-com:office:word" xmlns:w="http://schemas.openxmlformats.org/wordprocessingml/2006/main" xmlns:w14="http://schemas.microsoft.com/office/word/2010/wordml" xmlns:w15="http://schemas.microsoft.com/office/word/2012/wordml" xmlns:w16cid="http://schemas.microsoft.com/office/word/2016/wordml/cid" xmlns:w16se="http://schemas.microsoft.com/office/word/2015/wordml/symex" xmlns:wpg="http://schemas.microsoft.com/office/word/2010/wordprocessingGroup" xmlns:wpi="http://schemas.microsoft.com/office/word/2010/wordprocessingInk" xmlns:wne="http://schemas.microsoft.com/office/word/2006/wordml" xmlns:wps="http://schemas.microsoft.com/office/word/2010/wordprocessingShape" mc:Ignorable="w14 w15 w16se w16cid wp14">
+<w:hdr xmlns:wpc="http://schemas.microsoft.com/office/word/2010/wordprocessingCanvas" xmlns:mc="http://schemas.openxmlformats.org/markup-compatibility/2006" xmlns:o="urn:schemas-microsoft-com:office:office" xmlns:r="http://schemas.openxmlformats.org/officeDocument/2006/relationships" xmlns:m="http://schemas.openxmlformats.org/officeDocument/2006/math" xmlns:v="urn:schemas-microsoft-com:vml" xmlns:wp14="http://schemas.microsoft.com/office/word/2010/wordprocessingDrawing" xmlns:wp="http://schemas.openxmlformats.org/drawingml/2006/wordprocessingDrawing" xmlns:w10="urn:schemas-microsoft-com:office:word" xmlns:w="http://schemas.openxmlformats.org/wordprocessingml/2006/main" xmlns:w14="http://schemas.microsoft.com/office/word/2010/wordml" xmlns:w15="http://schemas.microsoft.com/office/word/2012/wordml" xmlns:wpg="http://schemas.microsoft.com/office/word/2010/wordprocessingGroup" xmlns:wpi="http://schemas.microsoft.com/office/word/2010/wordprocessingInk" xmlns:wne="http://schemas.microsoft.com/office/word/2006/wordml" xmlns:wps="http://schemas.microsoft.com/office/word/2010/wordprocessingShape" xmlns:wpsCustomData="http://www.wps.cn/officeDocument/2013/wpsCustomData" mc:Ignorable="w14 w15 wp14">
   <w:tbl>
     <w:tblPr>
-      <w:tblStyle w:val="a7"/>
+      <w:tblStyle w:val="8"/>
       <w:tblW w:w="15984" w:type="dxa"/>
+      <w:tblInd w:w="0" w:type="dxa"/>
+      <w:tblBorders>
+        <w:top w:val="single" w:color="000000" w:themeColor="text1" w:sz="4" w:space="0"/>
+        <w:left w:val="single" w:color="000000" w:themeColor="text1" w:sz="4" w:space="0"/>
+        <w:bottom w:val="single" w:color="000000" w:themeColor="text1" w:sz="4" w:space="0"/>
+        <w:right w:val="single" w:color="000000" w:themeColor="text1" w:sz="4" w:space="0"/>
+        <w:insideH w:val="single" w:color="000000" w:themeColor="text1" w:sz="4" w:space="0"/>
+        <w:insideV w:val="single" w:color="000000" w:themeColor="text1" w:sz="4" w:space="0"/>
+      </w:tblBorders>
       <w:tblLayout w:type="fixed"/>
-      <w:tblLook w:val="04A0" w:firstRow="1" w:lastRow="0" w:firstColumn="1" w:lastColumn="0" w:noHBand="0" w:noVBand="1"/>
+      <w:tblCellMar>
+        <w:top w:w="0" w:type="dxa"/>
+        <w:left w:w="108" w:type="dxa"/>
+        <w:bottom w:w="0" w:type="dxa"/>
+        <w:right w:w="108" w:type="dxa"/>
+      </w:tblCellMar>
     </w:tblPr>
     <w:tblGrid>
       <w:gridCol w:w="1099"/>
@@ -3574,19 +3404,35 @@
       <w:gridCol w:w="985"/>
     </w:tblGrid>
     <w:tr>
+      <w:tblPrEx>
+        <w:tblBorders>
+          <w:top w:val="single" w:color="000000" w:themeColor="text1" w:sz="4" w:space="0"/>
+          <w:left w:val="single" w:color="000000" w:themeColor="text1" w:sz="4" w:space="0"/>
+          <w:bottom w:val="single" w:color="000000" w:themeColor="text1" w:sz="4" w:space="0"/>
+          <w:right w:val="single" w:color="000000" w:themeColor="text1" w:sz="4" w:space="0"/>
+          <w:insideH w:val="single" w:color="000000" w:themeColor="text1" w:sz="4" w:space="0"/>
+          <w:insideV w:val="single" w:color="000000" w:themeColor="text1" w:sz="4" w:space="0"/>
+        </w:tblBorders>
+        <w:tblCellMar>
+          <w:top w:w="0" w:type="dxa"/>
+          <w:left w:w="108" w:type="dxa"/>
+          <w:bottom w:w="0" w:type="dxa"/>
+          <w:right w:w="108" w:type="dxa"/>
+        </w:tblCellMar>
+      </w:tblPrEx>
       <w:tc>
         <w:tcPr>
           <w:tcW w:w="1099" w:type="dxa"/>
           <w:tcBorders>
-            <w:top w:val="single" w:sz="12" w:space="0" w:color="auto"/>
-            <w:left w:val="single" w:sz="12" w:space="0" w:color="auto"/>
-            <w:bottom w:val="single" w:sz="12" w:space="0" w:color="auto"/>
-            <w:right w:val="single" w:sz="12" w:space="0" w:color="auto"/>
-          </w:tcBorders>
-        </w:tcPr>
-        <w:p>
-          <w:pPr>
-            <w:pStyle w:val="a3"/>
+            <w:top w:val="single" w:color="auto" w:sz="12" w:space="0"/>
+            <w:left w:val="single" w:color="auto" w:sz="12" w:space="0"/>
+            <w:bottom w:val="single" w:color="auto" w:sz="12" w:space="0"/>
+            <w:right w:val="single" w:color="auto" w:sz="12" w:space="0"/>
+          </w:tcBorders>
+        </w:tcPr>
+        <w:p>
+          <w:pPr>
+            <w:pStyle w:val="5"/>
             <w:ind w:left="-85" w:right="-85"/>
             <w:rPr>
               <w:rFonts w:ascii="Arial" w:hAnsi="Arial" w:cs="Arial"/>
@@ -3594,41 +3440,53 @@
               <w:szCs w:val="20"/>
             </w:rPr>
           </w:pPr>
-          <w:proofErr w:type="spellStart"/>
           <w:r>
             <w:rPr>
               <w:rFonts w:ascii="Arial" w:hAnsi="Arial" w:cs="Arial"/>
               <w:sz w:val="20"/>
               <w:szCs w:val="20"/>
             </w:rPr>
-            <w:t>Инв</w:t>
-          </w:r>
-          <w:proofErr w:type="spellEnd"/>
-          <w:r>
+            <w:t>Инв №</w:t>
+          </w:r>
+        </w:p>
+      </w:tc>
+      <w:tc>
+        <w:tcPr>
+          <w:tcW w:w="1277" w:type="dxa"/>
+          <w:tcBorders>
+            <w:top w:val="single" w:color="auto" w:sz="12" w:space="0"/>
+            <w:left w:val="single" w:color="auto" w:sz="12" w:space="0"/>
+            <w:bottom w:val="single" w:color="auto" w:sz="12" w:space="0"/>
+            <w:right w:val="single" w:color="auto" w:sz="12" w:space="0"/>
+          </w:tcBorders>
+        </w:tcPr>
+        <w:p>
+          <w:pPr>
+            <w:pStyle w:val="5"/>
+            <w:ind w:left="-85" w:right="-85"/>
+            <w:jc w:val="center"/>
             <w:rPr>
               <w:rFonts w:ascii="Arial" w:hAnsi="Arial" w:cs="Arial"/>
               <w:sz w:val="20"/>
               <w:szCs w:val="20"/>
             </w:rPr>
-            <w:t xml:space="preserve"> №</w:t>
-          </w:r>
-        </w:p>
-      </w:tc>
-      <w:tc>
-        <w:tcPr>
-          <w:tcW w:w="1277" w:type="dxa"/>
-          <w:tcBorders>
-            <w:top w:val="single" w:sz="12" w:space="0" w:color="auto"/>
-            <w:left w:val="single" w:sz="12" w:space="0" w:color="auto"/>
-            <w:bottom w:val="single" w:sz="12" w:space="0" w:color="auto"/>
-            <w:right w:val="single" w:sz="12" w:space="0" w:color="auto"/>
-          </w:tcBorders>
-        </w:tcPr>
-        <w:p>
-          <w:pPr>
-            <w:pStyle w:val="a3"/>
-            <w:ind w:left="-85" w:right="-85"/>
-            <w:jc w:val="center"/>
+          </w:pPr>
+        </w:p>
+      </w:tc>
+      <w:tc>
+        <w:tcPr>
+          <w:tcW w:w="1048" w:type="dxa"/>
+          <w:tcBorders>
+            <w:top w:val="single" w:color="auto" w:sz="12" w:space="0"/>
+            <w:left w:val="single" w:color="auto" w:sz="12" w:space="0"/>
+            <w:bottom w:val="single" w:color="auto" w:sz="12" w:space="0"/>
+            <w:right w:val="single" w:color="auto" w:sz="12" w:space="0"/>
+          </w:tcBorders>
+        </w:tcPr>
+        <w:p>
+          <w:pPr>
+            <w:pStyle w:val="5"/>
+            <w:ind w:left="-85" w:right="-85"/>
             <w:rPr>
               <w:rFonts w:ascii="Arial" w:hAnsi="Arial" w:cs="Arial"/>
               <w:sz w:val="20"/>
@@ -3639,17 +3497,17 @@
       </w:tc>
       <w:tc>
         <w:tcPr>
-          <w:tcW w:w="1048" w:type="dxa"/>
-          <w:tcBorders>
-            <w:top w:val="single" w:sz="12" w:space="0" w:color="auto"/>
-            <w:left w:val="single" w:sz="12" w:space="0" w:color="auto"/>
-            <w:bottom w:val="single" w:sz="12" w:space="0" w:color="auto"/>
-            <w:right w:val="single" w:sz="12" w:space="0" w:color="auto"/>
-          </w:tcBorders>
-        </w:tcPr>
-        <w:p>
-          <w:pPr>
-            <w:pStyle w:val="a3"/>
+          <w:tcW w:w="512" w:type="dxa"/>
+          <w:tcBorders>
+            <w:top w:val="single" w:color="auto" w:sz="12" w:space="0"/>
+            <w:left w:val="single" w:color="auto" w:sz="12" w:space="0"/>
+            <w:bottom w:val="single" w:color="auto" w:sz="12" w:space="0"/>
+            <w:right w:val="single" w:color="auto" w:sz="12" w:space="0"/>
+          </w:tcBorders>
+        </w:tcPr>
+        <w:p>
+          <w:pPr>
+            <w:pStyle w:val="5"/>
             <w:ind w:left="-85" w:right="-85"/>
             <w:rPr>
               <w:rFonts w:ascii="Arial" w:hAnsi="Arial" w:cs="Arial"/>
@@ -3661,17 +3519,17 @@
       </w:tc>
       <w:tc>
         <w:tcPr>
-          <w:tcW w:w="512" w:type="dxa"/>
-          <w:tcBorders>
-            <w:top w:val="single" w:sz="12" w:space="0" w:color="auto"/>
-            <w:left w:val="single" w:sz="12" w:space="0" w:color="auto"/>
-            <w:bottom w:val="single" w:sz="12" w:space="0" w:color="auto"/>
-            <w:right w:val="single" w:sz="12" w:space="0" w:color="auto"/>
-          </w:tcBorders>
-        </w:tcPr>
-        <w:p>
-          <w:pPr>
-            <w:pStyle w:val="a3"/>
+          <w:tcW w:w="4325" w:type="dxa"/>
+          <w:tcBorders>
+            <w:top w:val="nil"/>
+            <w:left w:val="single" w:color="auto" w:sz="12" w:space="0"/>
+            <w:bottom w:val="single" w:color="auto" w:sz="12" w:space="0"/>
+            <w:right w:val="single" w:color="auto" w:sz="12" w:space="0"/>
+          </w:tcBorders>
+        </w:tcPr>
+        <w:p>
+          <w:pPr>
+            <w:pStyle w:val="5"/>
             <w:ind w:left="-85" w:right="-85"/>
             <w:rPr>
               <w:rFonts w:ascii="Arial" w:hAnsi="Arial" w:cs="Arial"/>
@@ -3683,39 +3541,17 @@
       </w:tc>
       <w:tc>
         <w:tcPr>
-          <w:tcW w:w="4325" w:type="dxa"/>
-          <w:tcBorders>
-            <w:top w:val="nil"/>
-            <w:left w:val="single" w:sz="12" w:space="0" w:color="auto"/>
-            <w:bottom w:val="single" w:sz="12" w:space="0" w:color="auto"/>
-            <w:right w:val="single" w:sz="12" w:space="0" w:color="auto"/>
-          </w:tcBorders>
-        </w:tcPr>
-        <w:p>
-          <w:pPr>
-            <w:pStyle w:val="a3"/>
-            <w:ind w:left="-85" w:right="-85"/>
-            <w:rPr>
-              <w:rFonts w:ascii="Arial" w:hAnsi="Arial" w:cs="Arial"/>
-              <w:sz w:val="20"/>
-              <w:szCs w:val="20"/>
-            </w:rPr>
-          </w:pPr>
-        </w:p>
-      </w:tc>
-      <w:tc>
-        <w:tcPr>
           <w:tcW w:w="553" w:type="dxa"/>
           <w:tcBorders>
-            <w:top w:val="single" w:sz="12" w:space="0" w:color="auto"/>
-            <w:left w:val="single" w:sz="12" w:space="0" w:color="auto"/>
-            <w:bottom w:val="single" w:sz="12" w:space="0" w:color="auto"/>
-            <w:right w:val="single" w:sz="12" w:space="0" w:color="auto"/>
-          </w:tcBorders>
-        </w:tcPr>
-        <w:p>
-          <w:pPr>
-            <w:pStyle w:val="a3"/>
+            <w:top w:val="single" w:color="auto" w:sz="12" w:space="0"/>
+            <w:left w:val="single" w:color="auto" w:sz="12" w:space="0"/>
+            <w:bottom w:val="single" w:color="auto" w:sz="12" w:space="0"/>
+            <w:right w:val="single" w:color="auto" w:sz="12" w:space="0"/>
+          </w:tcBorders>
+        </w:tcPr>
+        <w:p>
+          <w:pPr>
+            <w:pStyle w:val="5"/>
             <w:ind w:left="-85" w:right="-85"/>
             <w:jc w:val="center"/>
             <w:rPr>
@@ -3730,15 +3566,15 @@
         <w:tcPr>
           <w:tcW w:w="563" w:type="dxa"/>
           <w:tcBorders>
-            <w:top w:val="single" w:sz="12" w:space="0" w:color="auto"/>
-            <w:left w:val="single" w:sz="12" w:space="0" w:color="auto"/>
-            <w:bottom w:val="single" w:sz="12" w:space="0" w:color="auto"/>
-            <w:right w:val="single" w:sz="12" w:space="0" w:color="auto"/>
-          </w:tcBorders>
-        </w:tcPr>
-        <w:p>
-          <w:pPr>
-            <w:pStyle w:val="a3"/>
+            <w:top w:val="single" w:color="auto" w:sz="12" w:space="0"/>
+            <w:left w:val="single" w:color="auto" w:sz="12" w:space="0"/>
+            <w:bottom w:val="single" w:color="auto" w:sz="12" w:space="0"/>
+            <w:right w:val="single" w:color="auto" w:sz="12" w:space="0"/>
+          </w:tcBorders>
+        </w:tcPr>
+        <w:p>
+          <w:pPr>
+            <w:pStyle w:val="5"/>
             <w:ind w:left="-85" w:right="-85"/>
             <w:rPr>
               <w:rFonts w:ascii="Arial" w:hAnsi="Arial" w:cs="Arial"/>
@@ -3752,15 +3588,15 @@
         <w:tcPr>
           <w:tcW w:w="1123" w:type="dxa"/>
           <w:tcBorders>
-            <w:top w:val="single" w:sz="12" w:space="0" w:color="auto"/>
-            <w:left w:val="single" w:sz="12" w:space="0" w:color="auto"/>
-            <w:bottom w:val="single" w:sz="12" w:space="0" w:color="auto"/>
-            <w:right w:val="single" w:sz="12" w:space="0" w:color="auto"/>
-          </w:tcBorders>
-        </w:tcPr>
-        <w:p>
-          <w:pPr>
-            <w:pStyle w:val="a3"/>
+            <w:top w:val="single" w:color="auto" w:sz="12" w:space="0"/>
+            <w:left w:val="single" w:color="auto" w:sz="12" w:space="0"/>
+            <w:bottom w:val="single" w:color="auto" w:sz="12" w:space="0"/>
+            <w:right w:val="single" w:color="auto" w:sz="12" w:space="0"/>
+          </w:tcBorders>
+        </w:tcPr>
+        <w:p>
+          <w:pPr>
+            <w:pStyle w:val="5"/>
             <w:ind w:left="-85" w:right="-85"/>
             <w:rPr>
               <w:rFonts w:ascii="Arial" w:hAnsi="Arial" w:cs="Arial"/>
@@ -3774,15 +3610,15 @@
         <w:tcPr>
           <w:tcW w:w="604" w:type="dxa"/>
           <w:tcBorders>
-            <w:top w:val="single" w:sz="12" w:space="0" w:color="auto"/>
-            <w:left w:val="single" w:sz="12" w:space="0" w:color="auto"/>
-            <w:bottom w:val="single" w:sz="12" w:space="0" w:color="auto"/>
-            <w:right w:val="single" w:sz="12" w:space="0" w:color="auto"/>
-          </w:tcBorders>
-        </w:tcPr>
-        <w:p>
-          <w:pPr>
-            <w:pStyle w:val="a3"/>
+            <w:top w:val="single" w:color="auto" w:sz="12" w:space="0"/>
+            <w:left w:val="single" w:color="auto" w:sz="12" w:space="0"/>
+            <w:bottom w:val="single" w:color="auto" w:sz="12" w:space="0"/>
+            <w:right w:val="single" w:color="auto" w:sz="12" w:space="0"/>
+          </w:tcBorders>
+        </w:tcPr>
+        <w:p>
+          <w:pPr>
+            <w:pStyle w:val="5"/>
             <w:ind w:left="-85" w:right="-85"/>
             <w:rPr>
               <w:rFonts w:ascii="Arial" w:hAnsi="Arial" w:cs="Arial"/>
@@ -3796,15 +3632,15 @@
         <w:tcPr>
           <w:tcW w:w="825" w:type="dxa"/>
           <w:tcBorders>
-            <w:top w:val="single" w:sz="12" w:space="0" w:color="auto"/>
-            <w:left w:val="single" w:sz="12" w:space="0" w:color="auto"/>
-            <w:bottom w:val="single" w:sz="12" w:space="0" w:color="auto"/>
-            <w:right w:val="single" w:sz="12" w:space="0" w:color="auto"/>
-          </w:tcBorders>
-        </w:tcPr>
-        <w:p>
-          <w:pPr>
-            <w:pStyle w:val="a3"/>
+            <w:top w:val="single" w:color="auto" w:sz="12" w:space="0"/>
+            <w:left w:val="single" w:color="auto" w:sz="12" w:space="0"/>
+            <w:bottom w:val="single" w:color="auto" w:sz="12" w:space="0"/>
+            <w:right w:val="single" w:color="auto" w:sz="12" w:space="0"/>
+          </w:tcBorders>
+        </w:tcPr>
+        <w:p>
+          <w:pPr>
+            <w:pStyle w:val="5"/>
             <w:ind w:left="-85" w:right="-85"/>
             <w:rPr>
               <w:rFonts w:ascii="Arial" w:hAnsi="Arial" w:cs="Arial"/>
@@ -3818,15 +3654,15 @@
         <w:tcPr>
           <w:tcW w:w="795" w:type="dxa"/>
           <w:tcBorders>
-            <w:top w:val="single" w:sz="12" w:space="0" w:color="auto"/>
-            <w:left w:val="single" w:sz="12" w:space="0" w:color="auto"/>
-            <w:bottom w:val="single" w:sz="12" w:space="0" w:color="auto"/>
-            <w:right w:val="single" w:sz="12" w:space="0" w:color="auto"/>
-          </w:tcBorders>
-        </w:tcPr>
-        <w:p>
-          <w:pPr>
-            <w:pStyle w:val="a3"/>
+            <w:top w:val="single" w:color="auto" w:sz="12" w:space="0"/>
+            <w:left w:val="single" w:color="auto" w:sz="12" w:space="0"/>
+            <w:bottom w:val="single" w:color="auto" w:sz="12" w:space="0"/>
+            <w:right w:val="single" w:color="auto" w:sz="12" w:space="0"/>
+          </w:tcBorders>
+        </w:tcPr>
+        <w:p>
+          <w:pPr>
+            <w:pStyle w:val="5"/>
             <w:ind w:left="-85" w:right="-85"/>
             <w:rPr>
               <w:rFonts w:ascii="Arial" w:hAnsi="Arial" w:cs="Arial"/>
@@ -3840,15 +3676,15 @@
         <w:tcPr>
           <w:tcW w:w="567" w:type="dxa"/>
           <w:tcBorders>
-            <w:top w:val="single" w:sz="12" w:space="0" w:color="auto"/>
-            <w:left w:val="single" w:sz="12" w:space="0" w:color="auto"/>
-            <w:bottom w:val="single" w:sz="12" w:space="0" w:color="auto"/>
-            <w:right w:val="single" w:sz="12" w:space="0" w:color="auto"/>
-          </w:tcBorders>
-        </w:tcPr>
-        <w:p>
-          <w:pPr>
-            <w:pStyle w:val="a3"/>
+            <w:top w:val="single" w:color="auto" w:sz="12" w:space="0"/>
+            <w:left w:val="single" w:color="auto" w:sz="12" w:space="0"/>
+            <w:bottom w:val="single" w:color="auto" w:sz="12" w:space="0"/>
+            <w:right w:val="single" w:color="auto" w:sz="12" w:space="0"/>
+          </w:tcBorders>
+        </w:tcPr>
+        <w:p>
+          <w:pPr>
+            <w:pStyle w:val="5"/>
             <w:ind w:left="-85" w:right="-85"/>
             <w:rPr>
               <w:rFonts w:ascii="Arial" w:hAnsi="Arial" w:cs="Arial"/>
@@ -3862,15 +3698,15 @@
         <w:tcPr>
           <w:tcW w:w="814" w:type="dxa"/>
           <w:tcBorders>
-            <w:top w:val="single" w:sz="12" w:space="0" w:color="auto"/>
-            <w:left w:val="single" w:sz="12" w:space="0" w:color="auto"/>
-            <w:bottom w:val="single" w:sz="12" w:space="0" w:color="auto"/>
-            <w:right w:val="single" w:sz="12" w:space="0" w:color="auto"/>
-          </w:tcBorders>
-        </w:tcPr>
-        <w:p>
-          <w:pPr>
-            <w:pStyle w:val="a3"/>
+            <w:top w:val="single" w:color="auto" w:sz="12" w:space="0"/>
+            <w:left w:val="single" w:color="auto" w:sz="12" w:space="0"/>
+            <w:bottom w:val="single" w:color="auto" w:sz="12" w:space="0"/>
+            <w:right w:val="single" w:color="auto" w:sz="12" w:space="0"/>
+          </w:tcBorders>
+        </w:tcPr>
+        <w:p>
+          <w:pPr>
+            <w:pStyle w:val="5"/>
             <w:ind w:left="-85" w:right="-85"/>
             <w:rPr>
               <w:rFonts w:ascii="Arial" w:hAnsi="Arial" w:cs="Arial"/>
@@ -3884,15 +3720,15 @@
         <w:tcPr>
           <w:tcW w:w="894" w:type="dxa"/>
           <w:tcBorders>
-            <w:top w:val="single" w:sz="12" w:space="0" w:color="auto"/>
-            <w:left w:val="single" w:sz="12" w:space="0" w:color="auto"/>
-            <w:bottom w:val="single" w:sz="12" w:space="0" w:color="auto"/>
-            <w:right w:val="single" w:sz="12" w:space="0" w:color="auto"/>
-          </w:tcBorders>
-        </w:tcPr>
-        <w:p>
-          <w:pPr>
-            <w:pStyle w:val="a3"/>
+            <w:top w:val="single" w:color="auto" w:sz="12" w:space="0"/>
+            <w:left w:val="single" w:color="auto" w:sz="12" w:space="0"/>
+            <w:bottom w:val="single" w:color="auto" w:sz="12" w:space="0"/>
+            <w:right w:val="single" w:color="auto" w:sz="12" w:space="0"/>
+          </w:tcBorders>
+        </w:tcPr>
+        <w:p>
+          <w:pPr>
+            <w:pStyle w:val="5"/>
             <w:ind w:left="-85" w:right="-85"/>
             <w:rPr>
               <w:rFonts w:ascii="Arial" w:hAnsi="Arial" w:cs="Arial"/>
@@ -3906,15 +3742,15 @@
         <w:tcPr>
           <w:tcW w:w="985" w:type="dxa"/>
           <w:tcBorders>
-            <w:top w:val="single" w:sz="12" w:space="0" w:color="auto"/>
-            <w:left w:val="single" w:sz="12" w:space="0" w:color="auto"/>
-            <w:bottom w:val="single" w:sz="12" w:space="0" w:color="auto"/>
-            <w:right w:val="single" w:sz="12" w:space="0" w:color="auto"/>
-          </w:tcBorders>
-        </w:tcPr>
-        <w:p>
-          <w:pPr>
-            <w:pStyle w:val="a3"/>
+            <w:top w:val="single" w:color="auto" w:sz="12" w:space="0"/>
+            <w:left w:val="single" w:color="auto" w:sz="12" w:space="0"/>
+            <w:bottom w:val="single" w:color="auto" w:sz="12" w:space="0"/>
+            <w:right w:val="single" w:color="auto" w:sz="12" w:space="0"/>
+          </w:tcBorders>
+        </w:tcPr>
+        <w:p>
+          <w:pPr>
+            <w:pStyle w:val="5"/>
             <w:ind w:left="-85" w:right="-85"/>
             <w:rPr>
               <w:rFonts w:ascii="Arial" w:hAnsi="Arial" w:cs="Arial"/>
@@ -3926,25 +3762,55 @@
       </w:tc>
     </w:tr>
     <w:tr>
+      <w:tblPrEx>
+        <w:tblBorders>
+          <w:top w:val="single" w:color="000000" w:themeColor="text1" w:sz="4" w:space="0"/>
+          <w:left w:val="single" w:color="000000" w:themeColor="text1" w:sz="4" w:space="0"/>
+          <w:bottom w:val="single" w:color="000000" w:themeColor="text1" w:sz="4" w:space="0"/>
+          <w:right w:val="single" w:color="000000" w:themeColor="text1" w:sz="4" w:space="0"/>
+          <w:insideH w:val="single" w:color="000000" w:themeColor="text1" w:sz="4" w:space="0"/>
+          <w:insideV w:val="single" w:color="000000" w:themeColor="text1" w:sz="4" w:space="0"/>
+        </w:tblBorders>
+        <w:tblCellMar>
+          <w:top w:w="0" w:type="dxa"/>
+          <w:left w:w="108" w:type="dxa"/>
+          <w:bottom w:w="0" w:type="dxa"/>
+          <w:right w:w="108" w:type="dxa"/>
+        </w:tblCellMar>
+      </w:tblPrEx>
       <w:trPr>
-        <w:trHeight w:val="2529"/>
+        <w:trHeight w:val="2529" w:hRule="atLeast"/>
       </w:trPr>
       <w:tc>
         <w:tcPr>
           <w:tcW w:w="15984" w:type="dxa"/>
           <w:gridSpan w:val="15"/>
           <w:tcBorders>
-            <w:top w:val="single" w:sz="12" w:space="0" w:color="auto"/>
-            <w:left w:val="single" w:sz="12" w:space="0" w:color="auto"/>
-            <w:right w:val="single" w:sz="12" w:space="0" w:color="auto"/>
+            <w:top w:val="single" w:color="auto" w:sz="12" w:space="0"/>
+            <w:left w:val="single" w:color="auto" w:sz="12" w:space="0"/>
+            <w:right w:val="single" w:color="auto" w:sz="12" w:space="0"/>
           </w:tcBorders>
         </w:tcPr>
         <w:tbl>
           <w:tblPr>
-            <w:tblStyle w:val="a7"/>
+            <w:tblStyle w:val="8"/>
             <w:tblW w:w="15735" w:type="dxa"/>
+            <w:tblInd w:w="0" w:type="dxa"/>
+            <w:tblBorders>
+              <w:top w:val="single" w:color="000000" w:themeColor="text1" w:sz="4" w:space="0"/>
+              <w:left w:val="single" w:color="000000" w:themeColor="text1" w:sz="4" w:space="0"/>
+              <w:bottom w:val="single" w:color="000000" w:themeColor="text1" w:sz="4" w:space="0"/>
+              <w:right w:val="single" w:color="000000" w:themeColor="text1" w:sz="4" w:space="0"/>
+              <w:insideH w:val="single" w:color="000000" w:themeColor="text1" w:sz="4" w:space="0"/>
+              <w:insideV w:val="single" w:color="000000" w:themeColor="text1" w:sz="4" w:space="0"/>
+            </w:tblBorders>
             <w:tblLayout w:type="fixed"/>
-            <w:tblLook w:val="04A0" w:firstRow="1" w:lastRow="0" w:firstColumn="1" w:lastColumn="0" w:noHBand="0" w:noVBand="1"/>
+            <w:tblCellMar>
+              <w:top w:w="0" w:type="dxa"/>
+              <w:left w:w="108" w:type="dxa"/>
+              <w:bottom w:w="0" w:type="dxa"/>
+              <w:right w:w="108" w:type="dxa"/>
+            </w:tblCellMar>
           </w:tblPr>
           <w:tblGrid>
             <w:gridCol w:w="7230"/>
@@ -3956,6 +3822,22 @@
             <w:gridCol w:w="709"/>
           </w:tblGrid>
           <w:tr>
+            <w:tblPrEx>
+              <w:tblBorders>
+                <w:top w:val="single" w:color="000000" w:themeColor="text1" w:sz="4" w:space="0"/>
+                <w:left w:val="single" w:color="000000" w:themeColor="text1" w:sz="4" w:space="0"/>
+                <w:bottom w:val="single" w:color="000000" w:themeColor="text1" w:sz="4" w:space="0"/>
+                <w:right w:val="single" w:color="000000" w:themeColor="text1" w:sz="4" w:space="0"/>
+                <w:insideH w:val="single" w:color="000000" w:themeColor="text1" w:sz="4" w:space="0"/>
+                <w:insideV w:val="single" w:color="000000" w:themeColor="text1" w:sz="4" w:space="0"/>
+              </w:tblBorders>
+              <w:tblCellMar>
+                <w:top w:w="0" w:type="dxa"/>
+                <w:left w:w="108" w:type="dxa"/>
+                <w:bottom w:w="0" w:type="dxa"/>
+                <w:right w:w="108" w:type="dxa"/>
+              </w:tblCellMar>
+            </w:tblPrEx>
             <w:tc>
               <w:tcPr>
                 <w:tcW w:w="7230" w:type="dxa"/>
@@ -3963,7 +3845,7 @@
                   <w:top w:val="nil"/>
                   <w:left w:val="nil"/>
                   <w:bottom w:val="nil"/>
-                  <w:right w:val="single" w:sz="4" w:space="0" w:color="auto"/>
+                  <w:right w:val="single" w:color="auto" w:sz="4" w:space="0"/>
                 </w:tcBorders>
                 <w:tcMar>
                   <w:left w:w="0" w:type="dxa"/>
@@ -3972,7 +3854,7 @@
               </w:tcPr>
               <w:p>
                 <w:pPr>
-                  <w:pStyle w:val="a3"/>
+                  <w:pStyle w:val="5"/>
                   <w:ind w:right="-85"/>
                   <w:rPr>
                     <w:rFonts w:ascii="Arial Narrow" w:hAnsi="Arial Narrow" w:cs="Arial"/>
@@ -3989,6 +3871,11 @@
                     <w:rFonts w:ascii="Arial Narrow" w:hAnsi="Arial Narrow" w:cs="Arial"/>
                   </w:rPr>
                   <w:tab/>
+                </w:r>
+                <w:r>
+                  <w:rPr>
+                    <w:rFonts w:ascii="Arial Narrow" w:hAnsi="Arial Narrow" w:cs="Arial"/>
+                  </w:rPr>
                   <w:t xml:space="preserve">     </w:t>
                 </w:r>
                 <w:r>
@@ -4063,15 +3950,15 @@
               <w:tcPr>
                 <w:tcW w:w="2126" w:type="dxa"/>
                 <w:tcBorders>
-                  <w:top w:val="single" w:sz="4" w:space="0" w:color="auto"/>
-                  <w:left w:val="single" w:sz="4" w:space="0" w:color="auto"/>
-                  <w:bottom w:val="single" w:sz="4" w:space="0" w:color="auto"/>
-                  <w:right w:val="single" w:sz="4" w:space="0" w:color="auto"/>
+                  <w:top w:val="single" w:color="auto" w:sz="4" w:space="0"/>
+                  <w:left w:val="single" w:color="auto" w:sz="4" w:space="0"/>
+                  <w:bottom w:val="single" w:color="auto" w:sz="4" w:space="0"/>
+                  <w:right w:val="single" w:color="auto" w:sz="4" w:space="0"/>
                 </w:tcBorders>
               </w:tcPr>
               <w:p>
                 <w:pPr>
-                  <w:pStyle w:val="a3"/>
+                  <w:pStyle w:val="5"/>
                   <w:ind w:right="-85"/>
                   <w:rPr>
                     <w:rFonts w:ascii="Arial Narrow" w:hAnsi="Arial Narrow" w:cs="Arial"/>
@@ -4089,12 +3976,12 @@
               <w:tcPr>
                 <w:tcW w:w="2126" w:type="dxa"/>
                 <w:tcBorders>
-                  <w:left w:val="single" w:sz="4" w:space="0" w:color="auto"/>
+                  <w:left w:val="single" w:color="auto" w:sz="4" w:space="0"/>
                 </w:tcBorders>
               </w:tcPr>
               <w:p>
                 <w:pPr>
-                  <w:pStyle w:val="a3"/>
+                  <w:pStyle w:val="5"/>
                   <w:ind w:right="-85"/>
                   <w:rPr>
                     <w:rFonts w:ascii="Arial Narrow" w:hAnsi="Arial Narrow" w:cs="Arial"/>
@@ -4112,12 +3999,12 @@
               <w:tcPr>
                 <w:tcW w:w="2552" w:type="dxa"/>
                 <w:tcBorders>
-                  <w:right w:val="single" w:sz="4" w:space="0" w:color="auto"/>
+                  <w:right w:val="single" w:color="auto" w:sz="4" w:space="0"/>
                 </w:tcBorders>
               </w:tcPr>
               <w:p>
                 <w:pPr>
-                  <w:pStyle w:val="a3"/>
+                  <w:pStyle w:val="5"/>
                   <w:ind w:right="-85"/>
                   <w:rPr>
                     <w:rFonts w:ascii="Arial Narrow" w:hAnsi="Arial Narrow" w:cs="Arial"/>
@@ -4136,14 +4023,14 @@
                 <w:tcW w:w="708" w:type="dxa"/>
                 <w:tcBorders>
                   <w:top w:val="nil"/>
-                  <w:left w:val="single" w:sz="4" w:space="0" w:color="auto"/>
+                  <w:left w:val="single" w:color="auto" w:sz="4" w:space="0"/>
                   <w:bottom w:val="nil"/>
                   <w:right w:val="nil"/>
                 </w:tcBorders>
               </w:tcPr>
               <w:p>
                 <w:pPr>
-                  <w:pStyle w:val="a3"/>
+                  <w:pStyle w:val="5"/>
                   <w:tabs>
                     <w:tab w:val="center" w:pos="430"/>
                     <w:tab w:val="right" w:pos="861"/>
@@ -4176,7 +4063,7 @@
               </w:tcPr>
               <w:p>
                 <w:pPr>
-                  <w:pStyle w:val="a3"/>
+                  <w:pStyle w:val="5"/>
                   <w:tabs>
                     <w:tab w:val="center" w:pos="430"/>
                     <w:tab w:val="right" w:pos="861"/>
@@ -4202,7 +4089,7 @@
               </w:tcPr>
               <w:p>
                 <w:pPr>
-                  <w:pStyle w:val="a3"/>
+                  <w:pStyle w:val="5"/>
                   <w:ind w:left="-85" w:right="-85"/>
                   <w:rPr>
                     <w:rFonts w:ascii="Arial Narrow" w:hAnsi="Arial Narrow" w:cs="Arial"/>
@@ -4222,7 +4109,7 @@
         </w:tbl>
         <w:p>
           <w:pPr>
-            <w:pStyle w:val="a3"/>
+            <w:pStyle w:val="5"/>
             <w:tabs>
               <w:tab w:val="clear" w:pos="4677"/>
               <w:tab w:val="clear" w:pos="9355"/>
@@ -4244,72 +4131,32 @@
               <w:b/>
               <w:u w:val="single"/>
             </w:rPr>
-            <w:t>ОАО «ВЗЭП</w:t>
-          </w:r>
-          <w:proofErr w:type="gramStart"/>
+            <w:t>ОАО «ВЗЭП»</w:t>
+          </w:r>
+          <w:r>
+            <w:rPr>
+              <w:rFonts w:ascii="Arial Narrow" w:hAnsi="Arial Narrow" w:cs="Arial"/>
+            </w:rPr>
+            <w:t xml:space="preserve">,     Место расположения завода: </w:t>
+          </w:r>
           <w:r>
             <w:rPr>
               <w:rFonts w:ascii="Arial Narrow" w:hAnsi="Arial Narrow" w:cs="Arial"/>
               <w:b/>
               <w:u w:val="single"/>
             </w:rPr>
-            <w:t>»</w:t>
-          </w:r>
-          <w:r>
-            <w:rPr>
-              <w:rFonts w:ascii="Arial Narrow" w:hAnsi="Arial Narrow" w:cs="Arial"/>
-            </w:rPr>
-            <w:t xml:space="preserve">, </w:t>
-          </w:r>
-          <w:r>
-            <w:rPr>
-              <w:rFonts w:ascii="Arial Narrow" w:hAnsi="Arial Narrow" w:cs="Arial"/>
-            </w:rPr>
-            <w:t xml:space="preserve">  </w:t>
-          </w:r>
-          <w:proofErr w:type="gramEnd"/>
-          <w:r>
-            <w:rPr>
-              <w:rFonts w:ascii="Arial Narrow" w:hAnsi="Arial Narrow" w:cs="Arial"/>
-            </w:rPr>
-            <w:t xml:space="preserve">  </w:t>
-          </w:r>
-          <w:r>
-            <w:rPr>
-              <w:rFonts w:ascii="Arial Narrow" w:hAnsi="Arial Narrow" w:cs="Arial"/>
-            </w:rPr>
-            <w:t xml:space="preserve">Место расположения завода: </w:t>
-          </w:r>
-          <w:r>
-            <w:rPr>
-              <w:rFonts w:ascii="Arial Narrow" w:hAnsi="Arial Narrow" w:cs="Arial"/>
-              <w:b/>
-              <w:u w:val="single"/>
-            </w:rPr>
             <w:t>г. Витебск, ул. Ильинского 19/18</w:t>
           </w:r>
           <w:r>
             <w:rPr>
               <w:rFonts w:ascii="Arial Narrow" w:hAnsi="Arial Narrow" w:cs="Arial"/>
             </w:rPr>
-            <w:t xml:space="preserve">, </w:t>
-          </w:r>
-          <w:r>
-            <w:rPr>
-              <w:rFonts w:ascii="Arial Narrow" w:hAnsi="Arial Narrow" w:cs="Arial"/>
-            </w:rPr>
-            <w:t xml:space="preserve">     </w:t>
-          </w:r>
-          <w:r>
-            <w:rPr>
-              <w:rFonts w:ascii="Arial Narrow" w:hAnsi="Arial Narrow" w:cs="Arial"/>
-            </w:rPr>
-            <w:t>Название потребителя:</w:t>
-          </w:r>
-        </w:p>
-        <w:p>
-          <w:pPr>
-            <w:pStyle w:val="a3"/>
+            <w:t>,      Название потребителя:</w:t>
+          </w:r>
+        </w:p>
+        <w:p>
+          <w:pPr>
+            <w:pStyle w:val="5"/>
             <w:tabs>
               <w:tab w:val="clear" w:pos="4677"/>
               <w:tab w:val="clear" w:pos="9355"/>
@@ -4325,17 +4172,24 @@
             <w:rPr>
               <w:rFonts w:ascii="Arial Narrow" w:hAnsi="Arial Narrow" w:cs="Arial"/>
             </w:rPr>
-            <w:t xml:space="preserve">Год модели/платформа </w:t>
-          </w:r>
-          <w:r>
-            <w:rPr>
-              <w:rFonts w:ascii="Arial Narrow" w:hAnsi="Arial Narrow" w:cs="Arial"/>
+            <w:t xml:space="preserve">Год модели/платформа  </w:t>
+          </w:r>
+          <w:r>
+            <w:rPr>
+              <w:rFonts w:ascii="Arial Narrow" w:hAnsi="Arial Narrow" w:cs="Arial"/>
+              <w:b/>
             </w:rPr>
             <w:t xml:space="preserve"> </w:t>
           </w:r>
           <w:r>
             <w:rPr>
               <w:rFonts w:ascii="Arial Narrow" w:hAnsi="Arial Narrow" w:cs="Arial"/>
+            </w:rPr>
+            <w:t xml:space="preserve">                    </w:t>
+          </w:r>
+          <w:r>
+            <w:rPr>
+              <w:rFonts w:ascii="Arial Narrow" w:hAnsi="Arial Narrow" w:cs="Arial"/>
               <w:b/>
             </w:rPr>
             <w:t xml:space="preserve"> </w:t>
@@ -4344,22 +4198,8 @@
             <w:rPr>
               <w:rFonts w:ascii="Arial Narrow" w:hAnsi="Arial Narrow" w:cs="Arial"/>
             </w:rPr>
-            <w:t xml:space="preserve">                    </w:t>
-          </w:r>
-          <w:r>
-            <w:rPr>
-              <w:rFonts w:ascii="Arial Narrow" w:hAnsi="Arial Narrow" w:cs="Arial"/>
-              <w:b/>
-            </w:rPr>
-            <w:t xml:space="preserve"> </w:t>
-          </w:r>
-          <w:r>
-            <w:rPr>
-              <w:rFonts w:ascii="Arial Narrow" w:hAnsi="Arial Narrow" w:cs="Arial"/>
-            </w:rPr>
             <w:t xml:space="preserve">Дата начала </w:t>
           </w:r>
-          <w:proofErr w:type="gramStart"/>
           <w:r>
             <w:rPr>
               <w:rFonts w:ascii="Arial Narrow" w:hAnsi="Arial Narrow" w:cs="Arial"/>
@@ -4371,26 +4211,18 @@
             <w:rPr>
               <w:rFonts w:ascii="Arial Narrow" w:hAnsi="Arial Narrow" w:cs="Arial"/>
             </w:rPr>
-            <w:t xml:space="preserve">: </w:t>
-          </w:r>
-          <w:r>
-            <w:rPr>
-              <w:rFonts w:ascii="Arial Narrow" w:hAnsi="Arial Narrow" w:cs="Arial"/>
-            </w:rPr>
-            <w:t xml:space="preserve">  </w:t>
-          </w:r>
-          <w:proofErr w:type="gramEnd"/>
-          <w:r>
-            <w:rPr>
-              <w:rFonts w:ascii="Arial Narrow" w:hAnsi="Arial Narrow" w:cs="Arial"/>
-            </w:rPr>
-            <w:t xml:space="preserve">            </w:t>
+            <w:t xml:space="preserve">:               </w:t>
           </w:r>
           <w:r>
             <w:rPr>
               <w:rFonts w:ascii="Arial Narrow" w:hAnsi="Arial Narrow" w:cs="Arial"/>
             </w:rPr>
             <w:tab/>
+          </w:r>
+          <w:r>
+            <w:rPr>
+              <w:rFonts w:ascii="Arial Narrow" w:hAnsi="Arial Narrow" w:cs="Arial"/>
+            </w:rPr>
             <w:t xml:space="preserve">Дата пересмотра </w:t>
           </w:r>
           <w:r>
@@ -4404,31 +4236,24 @@
             <w:rPr>
               <w:rFonts w:ascii="Arial Narrow" w:hAnsi="Arial Narrow" w:cs="Arial"/>
             </w:rPr>
-            <w:t>:</w:t>
-          </w:r>
-          <w:r>
-            <w:rPr>
-              <w:rFonts w:ascii="Arial Narrow" w:hAnsi="Arial Narrow" w:cs="Arial"/>
-            </w:rPr>
-            <w:t xml:space="preserve"> </w:t>
-          </w:r>
-          <w:r>
-            <w:rPr>
-              <w:rFonts w:ascii="Arial Narrow" w:hAnsi="Arial Narrow" w:cs="Arial"/>
-            </w:rPr>
-            <w:t xml:space="preserve">          </w:t>
+            <w:t xml:space="preserve">:           </w:t>
           </w:r>
           <w:r>
             <w:rPr>
               <w:rFonts w:ascii="Arial Narrow" w:hAnsi="Arial Narrow" w:cs="Arial"/>
             </w:rPr>
             <w:tab/>
+          </w:r>
+          <w:r>
+            <w:rPr>
+              <w:rFonts w:ascii="Arial Narrow" w:hAnsi="Arial Narrow" w:cs="Arial"/>
+            </w:rPr>
             <w:t xml:space="preserve">Ответственность за процесс: </w:t>
           </w:r>
         </w:p>
         <w:p>
           <w:pPr>
-            <w:pStyle w:val="a3"/>
+            <w:pStyle w:val="5"/>
             <w:tabs>
               <w:tab w:val="clear" w:pos="4677"/>
               <w:tab w:val="clear" w:pos="9355"/>
@@ -4438,19 +4263,11 @@
               <w:rFonts w:ascii="Arial Narrow" w:hAnsi="Arial Narrow" w:cs="Arial"/>
             </w:rPr>
           </w:pPr>
-          <w:proofErr w:type="spellStart"/>
-          <w:r>
-            <w:rPr>
-              <w:rFonts w:ascii="Arial Narrow" w:hAnsi="Arial Narrow" w:cs="Arial"/>
-            </w:rPr>
-            <w:t>Объект</w:t>
-          </w:r>
-          <w:proofErr w:type="spellEnd"/>
-          <w:r>
-            <w:rPr>
-              <w:rFonts w:ascii="Arial Narrow" w:hAnsi="Arial Narrow" w:cs="Arial"/>
-            </w:rPr>
-            <w:t xml:space="preserve">: </w:t>
+          <w:r>
+            <w:rPr>
+              <w:rFonts w:ascii="Arial Narrow" w:hAnsi="Arial Narrow" w:cs="Arial"/>
+            </w:rPr>
+            <w:t xml:space="preserve">Объект: </w:t>
           </w:r>
           <w:r>
             <w:rPr>
@@ -4475,7 +4292,7 @@
         </w:p>
         <w:p>
           <w:pPr>
-            <w:pStyle w:val="a3"/>
+            <w:pStyle w:val="5"/>
             <w:tabs>
               <w:tab w:val="clear" w:pos="4677"/>
               <w:tab w:val="clear" w:pos="9355"/>
@@ -4524,13 +4341,7 @@
             <w:rPr>
               <w:rFonts w:ascii="Arial Narrow" w:hAnsi="Arial Narrow" w:cs="Arial"/>
             </w:rPr>
-            <w:t>Уровень конфиденциальности:</w:t>
-          </w:r>
-          <w:r>
-            <w:rPr>
-              <w:rFonts w:ascii="Arial Narrow" w:hAnsi="Arial Narrow" w:cs="Arial"/>
-            </w:rPr>
-            <w:t xml:space="preserve"> </w:t>
+            <w:t xml:space="preserve">Уровень конфиденциальности: </w:t>
           </w:r>
           <w:r>
             <w:rPr>
@@ -4555,7 +4366,6 @@
               <w:u w:val="single"/>
             </w:rPr>
             <w:tab/>
-            <w:t>–</w:t>
           </w:r>
           <w:r>
             <w:rPr>
@@ -4563,7 +4373,7 @@
               <w:b/>
               <w:u w:val="single"/>
             </w:rPr>
-            <w:tab/>
+            <w:t>–</w:t>
           </w:r>
           <w:r>
             <w:rPr>
@@ -4576,13 +4386,21 @@
           <w:r>
             <w:rPr>
               <w:rFonts w:ascii="Arial Narrow" w:hAnsi="Arial Narrow" w:cs="Arial"/>
+              <w:b/>
+              <w:u w:val="single"/>
+            </w:rPr>
+            <w:tab/>
+          </w:r>
+          <w:r>
+            <w:rPr>
+              <w:rFonts w:ascii="Arial Narrow" w:hAnsi="Arial Narrow" w:cs="Arial"/>
             </w:rPr>
             <w:t>,</w:t>
           </w:r>
         </w:p>
         <w:p>
           <w:pPr>
-            <w:pStyle w:val="a3"/>
+            <w:pStyle w:val="5"/>
             <w:tabs>
               <w:tab w:val="clear" w:pos="4677"/>
               <w:tab w:val="clear" w:pos="9355"/>
@@ -4592,19 +4410,11 @@
               <w:rFonts w:ascii="Arial Narrow" w:hAnsi="Arial Narrow" w:cs="Arial"/>
             </w:rPr>
           </w:pPr>
-          <w:proofErr w:type="spellStart"/>
-          <w:r>
-            <w:rPr>
-              <w:rFonts w:ascii="Arial Narrow" w:hAnsi="Arial Narrow" w:cs="Arial"/>
-            </w:rPr>
-            <w:t>Межфункциональная</w:t>
-          </w:r>
-          <w:proofErr w:type="spellEnd"/>
-          <w:r>
-            <w:rPr>
-              <w:rFonts w:ascii="Arial Narrow" w:hAnsi="Arial Narrow" w:cs="Arial"/>
-            </w:rPr>
-            <w:t xml:space="preserve"> команда:</w:t>
+          <w:r>
+            <w:rPr>
+              <w:rFonts w:ascii="Arial Narrow" w:hAnsi="Arial Narrow" w:cs="Arial"/>
+            </w:rPr>
+            <w:t>Межфункциональная команда:</w:t>
           </w:r>
           <w:r>
             <w:rPr>
@@ -4617,19 +4427,12 @@
               <w:rFonts w:ascii="Arial Narrow" w:hAnsi="Arial Narrow" w:cs="Arial"/>
               <w:b/>
             </w:rPr>
-            <w:t xml:space="preserve">Руководитель </w:t>
-          </w:r>
-          <w:r>
-            <w:rPr>
-              <w:rFonts w:ascii="Arial Narrow" w:hAnsi="Arial Narrow" w:cs="Arial"/>
-              <w:b/>
-            </w:rPr>
-            <w:t>команды:</w:t>
-          </w:r>
-        </w:p>
-        <w:p>
-          <w:pPr>
-            <w:pStyle w:val="a3"/>
+            <w:t>Руководитель команды:</w:t>
+          </w:r>
+        </w:p>
+        <w:p>
+          <w:pPr>
+            <w:pStyle w:val="5"/>
             <w:ind w:right="-85"/>
             <w:rPr>
               <w:rFonts w:ascii="Arial" w:hAnsi="Arial" w:cs="Arial"/>
@@ -4656,7 +4459,7 @@
   </w:tbl>
   <w:p>
     <w:pPr>
-      <w:pStyle w:val="a3"/>
+      <w:pStyle w:val="5"/>
       <w:ind w:left="-85" w:right="-85"/>
       <w:rPr>
         <w:sz w:val="2"/>
@@ -4668,420 +4471,195 @@
 </file>
 
 <file path=word/styles.xml><?xml version="1.0" encoding="utf-8"?>
-<w:styles xmlns:mc="http://schemas.openxmlformats.org/markup-compatibility/2006" xmlns:r="http://schemas.openxmlformats.org/officeDocument/2006/relationships" xmlns:w="http://schemas.openxmlformats.org/wordprocessingml/2006/main" xmlns:w14="http://schemas.microsoft.com/office/word/2010/wordml" xmlns:w15="http://schemas.microsoft.com/office/word/2012/wordml" xmlns:w16cid="http://schemas.microsoft.com/office/word/2016/wordml/cid" xmlns:w16se="http://schemas.microsoft.com/office/word/2015/wordml/symex" mc:Ignorable="w14 w15 w16se w16cid">
+<w:styles xmlns:mc="http://schemas.openxmlformats.org/markup-compatibility/2006" xmlns:o="urn:schemas-microsoft-com:office:office" xmlns:r="http://schemas.openxmlformats.org/officeDocument/2006/relationships" xmlns:m="http://schemas.openxmlformats.org/officeDocument/2006/math" xmlns:v="urn:schemas-microsoft-com:vml" xmlns:w="http://schemas.openxmlformats.org/wordprocessingml/2006/main" xmlns:w14="http://schemas.microsoft.com/office/word/2010/wordml" xmlns:w10="urn:schemas-microsoft-com:office:word" xmlns:sl="http://schemas.openxmlformats.org/schemaLibrary/2006/main" xmlns:wpsCustomData="http://www.wps.cn/officeDocument/2013/wpsCustomData" mc:Ignorable="w14">
   <w:docDefaults>
     <w:rPrDefault>
       <w:rPr>
-        <w:rFonts w:asciiTheme="minorHAnsi" w:eastAsiaTheme="minorHAnsi" w:hAnsiTheme="minorHAnsi" w:cstheme="minorBidi"/>
-        <w:sz w:val="22"/>
-        <w:szCs w:val="22"/>
-        <w:lang w:val="ru-RU" w:eastAsia="en-US" w:bidi="ar-SA"/>
+        <w:rFonts w:asciiTheme="minorHAnsi" w:hAnsiTheme="minorHAnsi" w:eastAsiaTheme="minorHAnsi" w:cstheme="minorBidi"/>
       </w:rPr>
     </w:rPrDefault>
-    <w:pPrDefault>
-      <w:pPr>
-        <w:spacing w:after="200" w:line="276" w:lineRule="auto"/>
-      </w:pPr>
-    </w:pPrDefault>
+    <w:pPrDefault/>
   </w:docDefaults>
-  <w:latentStyles w:defLockedState="0" w:defUIPriority="99" w:defSemiHidden="0" w:defUnhideWhenUsed="0" w:defQFormat="0" w:count="375">
-    <w:lsdException w:name="Normal" w:uiPriority="0" w:qFormat="1"/>
-    <w:lsdException w:name="heading 1" w:uiPriority="9" w:qFormat="1"/>
-    <w:lsdException w:name="heading 2" w:semiHidden="1" w:uiPriority="9" w:unhideWhenUsed="1" w:qFormat="1"/>
-    <w:lsdException w:name="heading 3" w:semiHidden="1" w:uiPriority="9" w:unhideWhenUsed="1" w:qFormat="1"/>
-    <w:lsdException w:name="heading 4" w:semiHidden="1" w:uiPriority="9" w:unhideWhenUsed="1" w:qFormat="1"/>
-    <w:lsdException w:name="heading 5" w:semiHidden="1" w:uiPriority="9" w:unhideWhenUsed="1" w:qFormat="1"/>
-    <w:lsdException w:name="heading 6" w:semiHidden="1" w:uiPriority="9" w:unhideWhenUsed="1" w:qFormat="1"/>
-    <w:lsdException w:name="heading 7" w:semiHidden="1" w:uiPriority="9" w:unhideWhenUsed="1" w:qFormat="1"/>
-    <w:lsdException w:name="heading 8" w:semiHidden="1" w:uiPriority="9" w:unhideWhenUsed="1" w:qFormat="1"/>
-    <w:lsdException w:name="heading 9" w:semiHidden="1" w:uiPriority="9" w:unhideWhenUsed="1" w:qFormat="1"/>
-    <w:lsdException w:name="index 1" w:semiHidden="1" w:unhideWhenUsed="1"/>
-    <w:lsdException w:name="index 2" w:semiHidden="1" w:unhideWhenUsed="1"/>
-    <w:lsdException w:name="index 3" w:semiHidden="1" w:unhideWhenUsed="1"/>
-    <w:lsdException w:name="index 4" w:semiHidden="1" w:unhideWhenUsed="1"/>
-    <w:lsdException w:name="index 5" w:semiHidden="1" w:unhideWhenUsed="1"/>
-    <w:lsdException w:name="index 6" w:semiHidden="1" w:unhideWhenUsed="1"/>
-    <w:lsdException w:name="index 7" w:semiHidden="1" w:unhideWhenUsed="1"/>
-    <w:lsdException w:name="index 8" w:semiHidden="1" w:unhideWhenUsed="1"/>
-    <w:lsdException w:name="index 9" w:semiHidden="1" w:unhideWhenUsed="1"/>
-    <w:lsdException w:name="toc 1" w:semiHidden="1" w:uiPriority="39" w:unhideWhenUsed="1"/>
-    <w:lsdException w:name="toc 2" w:semiHidden="1" w:uiPriority="39" w:unhideWhenUsed="1"/>
-    <w:lsdException w:name="toc 3" w:semiHidden="1" w:uiPriority="39" w:unhideWhenUsed="1"/>
-    <w:lsdException w:name="toc 4" w:semiHidden="1" w:uiPriority="39" w:unhideWhenUsed="1"/>
-    <w:lsdException w:name="toc 5" w:semiHidden="1" w:uiPriority="39" w:unhideWhenUsed="1"/>
-    <w:lsdException w:name="toc 6" w:semiHidden="1" w:uiPriority="39" w:unhideWhenUsed="1"/>
-    <w:lsdException w:name="toc 7" w:semiHidden="1" w:uiPriority="39" w:unhideWhenUsed="1"/>
-    <w:lsdException w:name="toc 8" w:semiHidden="1" w:uiPriority="39" w:unhideWhenUsed="1"/>
-    <w:lsdException w:name="toc 9" w:semiHidden="1" w:uiPriority="39" w:unhideWhenUsed="1"/>
-    <w:lsdException w:name="Normal Indent" w:semiHidden="1" w:unhideWhenUsed="1"/>
-    <w:lsdException w:name="footnote text" w:semiHidden="1" w:unhideWhenUsed="1"/>
-    <w:lsdException w:name="annotation text" w:semiHidden="1" w:unhideWhenUsed="1"/>
-    <w:lsdException w:name="header" w:semiHidden="1" w:unhideWhenUsed="1"/>
-    <w:lsdException w:name="footer" w:semiHidden="1" w:unhideWhenUsed="1"/>
-    <w:lsdException w:name="index heading" w:semiHidden="1" w:unhideWhenUsed="1"/>
-    <w:lsdException w:name="caption" w:semiHidden="1" w:uiPriority="35" w:unhideWhenUsed="1" w:qFormat="1"/>
-    <w:lsdException w:name="table of figures" w:semiHidden="1" w:unhideWhenUsed="1"/>
-    <w:lsdException w:name="envelope address" w:semiHidden="1" w:unhideWhenUsed="1"/>
-    <w:lsdException w:name="envelope return" w:semiHidden="1" w:unhideWhenUsed="1"/>
-    <w:lsdException w:name="footnote reference" w:semiHidden="1" w:unhideWhenUsed="1"/>
-    <w:lsdException w:name="annotation reference" w:semiHidden="1" w:unhideWhenUsed="1"/>
-    <w:lsdException w:name="line number" w:semiHidden="1" w:unhideWhenUsed="1"/>
-    <w:lsdException w:name="page number" w:semiHidden="1" w:unhideWhenUsed="1"/>
-    <w:lsdException w:name="endnote reference" w:semiHidden="1" w:unhideWhenUsed="1"/>
-    <w:lsdException w:name="endnote text" w:semiHidden="1" w:unhideWhenUsed="1"/>
-    <w:lsdException w:name="table of authorities" w:semiHidden="1" w:unhideWhenUsed="1"/>
-    <w:lsdException w:name="macro" w:semiHidden="1" w:unhideWhenUsed="1"/>
-    <w:lsdException w:name="toa heading" w:semiHidden="1" w:unhideWhenUsed="1"/>
-    <w:lsdException w:name="List" w:semiHidden="1" w:unhideWhenUsed="1"/>
-    <w:lsdException w:name="List Bullet" w:semiHidden="1" w:unhideWhenUsed="1"/>
-    <w:lsdException w:name="List Number" w:semiHidden="1" w:unhideWhenUsed="1"/>
-    <w:lsdException w:name="List 2" w:semiHidden="1" w:unhideWhenUsed="1"/>
-    <w:lsdException w:name="List 3" w:semiHidden="1" w:unhideWhenUsed="1"/>
-    <w:lsdException w:name="List 4" w:semiHidden="1" w:unhideWhenUsed="1"/>
-    <w:lsdException w:name="List 5" w:semiHidden="1" w:unhideWhenUsed="1"/>
-    <w:lsdException w:name="List Bullet 2" w:semiHidden="1" w:unhideWhenUsed="1"/>
-    <w:lsdException w:name="List Bullet 3" w:semiHidden="1" w:unhideWhenUsed="1"/>
-    <w:lsdException w:name="List Bullet 4" w:semiHidden="1" w:unhideWhenUsed="1"/>
-    <w:lsdException w:name="List Bullet 5" w:semiHidden="1" w:unhideWhenUsed="1"/>
-    <w:lsdException w:name="List Number 2" w:semiHidden="1" w:unhideWhenUsed="1"/>
-    <w:lsdException w:name="List Number 3" w:semiHidden="1" w:unhideWhenUsed="1"/>
-    <w:lsdException w:name="List Number 4" w:semiHidden="1" w:unhideWhenUsed="1"/>
-    <w:lsdException w:name="List Number 5" w:semiHidden="1" w:unhideWhenUsed="1"/>
-    <w:lsdException w:name="Title" w:uiPriority="10" w:qFormat="1"/>
-    <w:lsdException w:name="Closing" w:semiHidden="1" w:unhideWhenUsed="1"/>
-    <w:lsdException w:name="Signature" w:semiHidden="1" w:unhideWhenUsed="1"/>
-    <w:lsdException w:name="Default Paragraph Font" w:semiHidden="1" w:uiPriority="1" w:unhideWhenUsed="1"/>
-    <w:lsdException w:name="Body Text" w:semiHidden="1" w:unhideWhenUsed="1"/>
-    <w:lsdException w:name="Body Text Indent" w:semiHidden="1" w:unhideWhenUsed="1"/>
-    <w:lsdException w:name="List Continue" w:semiHidden="1" w:unhideWhenUsed="1"/>
-    <w:lsdException w:name="List Continue 2" w:semiHidden="1" w:unhideWhenUsed="1"/>
-    <w:lsdException w:name="List Continue 3" w:semiHidden="1" w:unhideWhenUsed="1"/>
-    <w:lsdException w:name="List Continue 4" w:semiHidden="1" w:unhideWhenUsed="1"/>
-    <w:lsdException w:name="List Continue 5" w:semiHidden="1" w:unhideWhenUsed="1"/>
-    <w:lsdException w:name="Message Header" w:semiHidden="1" w:unhideWhenUsed="1"/>
-    <w:lsdException w:name="Subtitle" w:uiPriority="11" w:qFormat="1"/>
-    <w:lsdException w:name="Salutation" w:semiHidden="1" w:unhideWhenUsed="1"/>
-    <w:lsdException w:name="Date" w:semiHidden="1" w:unhideWhenUsed="1"/>
-    <w:lsdException w:name="Body Text First Indent" w:semiHidden="1" w:unhideWhenUsed="1"/>
-    <w:lsdException w:name="Body Text First Indent 2" w:semiHidden="1" w:unhideWhenUsed="1"/>
-    <w:lsdException w:name="Note Heading" w:semiHidden="1" w:unhideWhenUsed="1"/>
-    <w:lsdException w:name="Body Text 2" w:semiHidden="1" w:unhideWhenUsed="1"/>
-    <w:lsdException w:name="Body Text 3" w:semiHidden="1" w:unhideWhenUsed="1"/>
-    <w:lsdException w:name="Body Text Indent 2" w:semiHidden="1" w:unhideWhenUsed="1"/>
-    <w:lsdException w:name="Body Text Indent 3" w:semiHidden="1" w:unhideWhenUsed="1"/>
-    <w:lsdException w:name="Block Text" w:semiHidden="1" w:unhideWhenUsed="1"/>
-    <w:lsdException w:name="Hyperlink" w:semiHidden="1" w:unhideWhenUsed="1"/>
-    <w:lsdException w:name="FollowedHyperlink" w:semiHidden="1" w:unhideWhenUsed="1"/>
-    <w:lsdException w:name="Strong" w:uiPriority="22" w:qFormat="1"/>
-    <w:lsdException w:name="Emphasis" w:uiPriority="20" w:qFormat="1"/>
-    <w:lsdException w:name="Document Map" w:semiHidden="1" w:unhideWhenUsed="1"/>
-    <w:lsdException w:name="Plain Text" w:semiHidden="1" w:unhideWhenUsed="1"/>
-    <w:lsdException w:name="E-mail Signature" w:semiHidden="1" w:unhideWhenUsed="1"/>
-    <w:lsdException w:name="HTML Top of Form" w:semiHidden="1" w:unhideWhenUsed="1"/>
-    <w:lsdException w:name="HTML Bottom of Form" w:semiHidden="1" w:unhideWhenUsed="1"/>
-    <w:lsdException w:name="Normal (Web)" w:semiHidden="1" w:unhideWhenUsed="1"/>
-    <w:lsdException w:name="HTML Acronym" w:semiHidden="1" w:unhideWhenUsed="1"/>
-    <w:lsdException w:name="HTML Address" w:semiHidden="1" w:unhideWhenUsed="1"/>
-    <w:lsdException w:name="HTML Cite" w:semiHidden="1" w:unhideWhenUsed="1"/>
-    <w:lsdException w:name="HTML Code" w:semiHidden="1" w:unhideWhenUsed="1"/>
-    <w:lsdException w:name="HTML Definition" w:semiHidden="1" w:unhideWhenUsed="1"/>
-    <w:lsdException w:name="HTML Keyboard" w:semiHidden="1" w:unhideWhenUsed="1"/>
-    <w:lsdException w:name="HTML Preformatted" w:semiHidden="1" w:unhideWhenUsed="1"/>
-    <w:lsdException w:name="HTML Sample" w:semiHidden="1" w:unhideWhenUsed="1"/>
-    <w:lsdException w:name="HTML Typewriter" w:semiHidden="1" w:unhideWhenUsed="1"/>
-    <w:lsdException w:name="HTML Variable" w:semiHidden="1" w:unhideWhenUsed="1"/>
-    <w:lsdException w:name="Normal Table" w:semiHidden="1" w:unhideWhenUsed="1"/>
-    <w:lsdException w:name="annotation subject" w:semiHidden="1" w:unhideWhenUsed="1"/>
-    <w:lsdException w:name="No List" w:semiHidden="1" w:unhideWhenUsed="1"/>
-    <w:lsdException w:name="Outline List 1" w:semiHidden="1" w:unhideWhenUsed="1"/>
-    <w:lsdException w:name="Outline List 2" w:semiHidden="1" w:unhideWhenUsed="1"/>
-    <w:lsdException w:name="Outline List 3" w:semiHidden="1" w:unhideWhenUsed="1"/>
-    <w:lsdException w:name="Table Simple 1" w:semiHidden="1" w:unhideWhenUsed="1"/>
-    <w:lsdException w:name="Table Simple 2" w:semiHidden="1" w:unhideWhenUsed="1"/>
-    <w:lsdException w:name="Table Simple 3" w:semiHidden="1" w:unhideWhenUsed="1"/>
-    <w:lsdException w:name="Table Classic 1" w:semiHidden="1" w:unhideWhenUsed="1"/>
-    <w:lsdException w:name="Table Classic 2" w:semiHidden="1" w:unhideWhenUsed="1"/>
-    <w:lsdException w:name="Table Classic 3" w:semiHidden="1" w:unhideWhenUsed="1"/>
-    <w:lsdException w:name="Table Classic 4" w:semiHidden="1" w:unhideWhenUsed="1"/>
-    <w:lsdException w:name="Table Colorful 1" w:semiHidden="1" w:unhideWhenUsed="1"/>
-    <w:lsdException w:name="Table Colorful 2" w:semiHidden="1" w:unhideWhenUsed="1"/>
-    <w:lsdException w:name="Table Colorful 3" w:semiHidden="1" w:unhideWhenUsed="1"/>
-    <w:lsdException w:name="Table Columns 1" w:semiHidden="1" w:unhideWhenUsed="1"/>
-    <w:lsdException w:name="Table Columns 2" w:semiHidden="1" w:unhideWhenUsed="1"/>
-    <w:lsdException w:name="Table Columns 3" w:semiHidden="1" w:unhideWhenUsed="1"/>
-    <w:lsdException w:name="Table Columns 4" w:semiHidden="1" w:unhideWhenUsed="1"/>
-    <w:lsdException w:name="Table Columns 5" w:semiHidden="1" w:unhideWhenUsed="1"/>
-    <w:lsdException w:name="Table Grid 1" w:semiHidden="1" w:unhideWhenUsed="1"/>
-    <w:lsdException w:name="Table Grid 2" w:semiHidden="1" w:unhideWhenUsed="1"/>
-    <w:lsdException w:name="Table Grid 3" w:semiHidden="1" w:unhideWhenUsed="1"/>
-    <w:lsdException w:name="Table Grid 4" w:semiHidden="1" w:unhideWhenUsed="1"/>
-    <w:lsdException w:name="Table Grid 5" w:semiHidden="1" w:unhideWhenUsed="1"/>
-    <w:lsdException w:name="Table Grid 6" w:semiHidden="1" w:unhideWhenUsed="1"/>
-    <w:lsdException w:name="Table Grid 7" w:semiHidden="1" w:unhideWhenUsed="1"/>
-    <w:lsdException w:name="Table Grid 8" w:semiHidden="1" w:unhideWhenUsed="1"/>
-    <w:lsdException w:name="Table List 1" w:semiHidden="1" w:unhideWhenUsed="1"/>
-    <w:lsdException w:name="Table List 2" w:semiHidden="1" w:unhideWhenUsed="1"/>
-    <w:lsdException w:name="Table List 3" w:semiHidden="1" w:unhideWhenUsed="1"/>
-    <w:lsdException w:name="Table List 4" w:semiHidden="1" w:unhideWhenUsed="1"/>
-    <w:lsdException w:name="Table List 5" w:semiHidden="1" w:unhideWhenUsed="1"/>
-    <w:lsdException w:name="Table List 6" w:semiHidden="1" w:unhideWhenUsed="1"/>
-    <w:lsdException w:name="Table List 7" w:semiHidden="1" w:unhideWhenUsed="1"/>
-    <w:lsdException w:name="Table List 8" w:semiHidden="1" w:unhideWhenUsed="1"/>
-    <w:lsdException w:name="Table 3D effects 1" w:semiHidden="1" w:unhideWhenUsed="1"/>
-    <w:lsdException w:name="Table 3D effects 2" w:semiHidden="1" w:unhideWhenUsed="1"/>
-    <w:lsdException w:name="Table 3D effects 3" w:semiHidden="1" w:unhideWhenUsed="1"/>
-    <w:lsdException w:name="Table Contemporary" w:semiHidden="1" w:unhideWhenUsed="1"/>
-    <w:lsdException w:name="Table Elegant" w:semiHidden="1" w:unhideWhenUsed="1"/>
-    <w:lsdException w:name="Table Professional" w:semiHidden="1" w:unhideWhenUsed="1"/>
-    <w:lsdException w:name="Table Subtle 1" w:semiHidden="1" w:unhideWhenUsed="1"/>
-    <w:lsdException w:name="Table Subtle 2" w:semiHidden="1" w:unhideWhenUsed="1"/>
-    <w:lsdException w:name="Table Web 1" w:semiHidden="1" w:unhideWhenUsed="1"/>
-    <w:lsdException w:name="Table Web 2" w:semiHidden="1" w:unhideWhenUsed="1"/>
-    <w:lsdException w:name="Table Web 3" w:semiHidden="1" w:unhideWhenUsed="1"/>
-    <w:lsdException w:name="Balloon Text" w:semiHidden="1" w:unhideWhenUsed="1"/>
-    <w:lsdException w:name="Table Grid" w:uiPriority="59"/>
-    <w:lsdException w:name="Table Theme" w:semiHidden="1" w:unhideWhenUsed="1"/>
-    <w:lsdException w:name="Placeholder Text" w:semiHidden="1"/>
-    <w:lsdException w:name="No Spacing" w:uiPriority="1" w:qFormat="1"/>
-    <w:lsdException w:name="Light Shading" w:uiPriority="60"/>
-    <w:lsdException w:name="Light List" w:uiPriority="61"/>
-    <w:lsdException w:name="Light Grid" w:uiPriority="62"/>
-    <w:lsdException w:name="Medium Shading 1" w:uiPriority="63"/>
-    <w:lsdException w:name="Medium Shading 2" w:uiPriority="64"/>
-    <w:lsdException w:name="Medium List 1" w:uiPriority="65"/>
-    <w:lsdException w:name="Medium List 2" w:uiPriority="66"/>
-    <w:lsdException w:name="Medium Grid 1" w:uiPriority="67"/>
-    <w:lsdException w:name="Medium Grid 2" w:uiPriority="68"/>
-    <w:lsdException w:name="Medium Grid 3" w:uiPriority="69"/>
-    <w:lsdException w:name="Dark List" w:uiPriority="70"/>
-    <w:lsdException w:name="Colorful Shading" w:uiPriority="71"/>
-    <w:lsdException w:name="Colorful List" w:uiPriority="72"/>
-    <w:lsdException w:name="Colorful Grid" w:uiPriority="73"/>
-    <w:lsdException w:name="Light Shading Accent 1" w:uiPriority="60"/>
-    <w:lsdException w:name="Light List Accent 1" w:uiPriority="61"/>
-    <w:lsdException w:name="Light Grid Accent 1" w:uiPriority="62"/>
-    <w:lsdException w:name="Medium Shading 1 Accent 1" w:uiPriority="63"/>
-    <w:lsdException w:name="Medium Shading 2 Accent 1" w:uiPriority="64"/>
-    <w:lsdException w:name="Medium List 1 Accent 1" w:uiPriority="65"/>
-    <w:lsdException w:name="Revision" w:semiHidden="1"/>
-    <w:lsdException w:name="List Paragraph" w:uiPriority="34" w:qFormat="1"/>
-    <w:lsdException w:name="Quote" w:uiPriority="29" w:qFormat="1"/>
-    <w:lsdException w:name="Intense Quote" w:uiPriority="30" w:qFormat="1"/>
-    <w:lsdException w:name="Medium List 2 Accent 1" w:uiPriority="66"/>
-    <w:lsdException w:name="Medium Grid 1 Accent 1" w:uiPriority="67"/>
-    <w:lsdException w:name="Medium Grid 2 Accent 1" w:uiPriority="68"/>
-    <w:lsdException w:name="Medium Grid 3 Accent 1" w:uiPriority="69"/>
-    <w:lsdException w:name="Dark List Accent 1" w:uiPriority="70"/>
-    <w:lsdException w:name="Colorful Shading Accent 1" w:uiPriority="71"/>
-    <w:lsdException w:name="Colorful List Accent 1" w:uiPriority="72"/>
-    <w:lsdException w:name="Colorful Grid Accent 1" w:uiPriority="73"/>
-    <w:lsdException w:name="Light Shading Accent 2" w:uiPriority="60"/>
-    <w:lsdException w:name="Light List Accent 2" w:uiPriority="61"/>
-    <w:lsdException w:name="Light Grid Accent 2" w:uiPriority="62"/>
-    <w:lsdException w:name="Medium Shading 1 Accent 2" w:uiPriority="63"/>
-    <w:lsdException w:name="Medium Shading 2 Accent 2" w:uiPriority="64"/>
-    <w:lsdException w:name="Medium List 1 Accent 2" w:uiPriority="65"/>
-    <w:lsdException w:name="Medium List 2 Accent 2" w:uiPriority="66"/>
-    <w:lsdException w:name="Medium Grid 1 Accent 2" w:uiPriority="67"/>
-    <w:lsdException w:name="Medium Grid 2 Accent 2" w:uiPriority="68"/>
-    <w:lsdException w:name="Medium Grid 3 Accent 2" w:uiPriority="69"/>
-    <w:lsdException w:name="Dark List Accent 2" w:uiPriority="70"/>
-    <w:lsdException w:name="Colorful Shading Accent 2" w:uiPriority="71"/>
-    <w:lsdException w:name="Colorful List Accent 2" w:uiPriority="72"/>
-    <w:lsdException w:name="Colorful Grid Accent 2" w:uiPriority="73"/>
-    <w:lsdException w:name="Light Shading Accent 3" w:uiPriority="60"/>
-    <w:lsdException w:name="Light List Accent 3" w:uiPriority="61"/>
-    <w:lsdException w:name="Light Grid Accent 3" w:uiPriority="62"/>
-    <w:lsdException w:name="Medium Shading 1 Accent 3" w:uiPriority="63"/>
-    <w:lsdException w:name="Medium Shading 2 Accent 3" w:uiPriority="64"/>
-    <w:lsdException w:name="Medium List 1 Accent 3" w:uiPriority="65"/>
-    <w:lsdException w:name="Medium List 2 Accent 3" w:uiPriority="66"/>
-    <w:lsdException w:name="Medium Grid 1 Accent 3" w:uiPriority="67"/>
-    <w:lsdException w:name="Medium Grid 2 Accent 3" w:uiPriority="68"/>
-    <w:lsdException w:name="Medium Grid 3 Accent 3" w:uiPriority="69"/>
-    <w:lsdException w:name="Dark List Accent 3" w:uiPriority="70"/>
-    <w:lsdException w:name="Colorful Shading Accent 3" w:uiPriority="71"/>
-    <w:lsdException w:name="Colorful List Accent 3" w:uiPriority="72"/>
-    <w:lsdException w:name="Colorful Grid Accent 3" w:uiPriority="73"/>
-    <w:lsdException w:name="Light Shading Accent 4" w:uiPriority="60"/>
-    <w:lsdException w:name="Light List Accent 4" w:uiPriority="61"/>
-    <w:lsdException w:name="Light Grid Accent 4" w:uiPriority="62"/>
-    <w:lsdException w:name="Medium Shading 1 Accent 4" w:uiPriority="63"/>
-    <w:lsdException w:name="Medium Shading 2 Accent 4" w:uiPriority="64"/>
-    <w:lsdException w:name="Medium List 1 Accent 4" w:uiPriority="65"/>
-    <w:lsdException w:name="Medium List 2 Accent 4" w:uiPriority="66"/>
-    <w:lsdException w:name="Medium Grid 1 Accent 4" w:uiPriority="67"/>
-    <w:lsdException w:name="Medium Grid 2 Accent 4" w:uiPriority="68"/>
-    <w:lsdException w:name="Medium Grid 3 Accent 4" w:uiPriority="69"/>
-    <w:lsdException w:name="Dark List Accent 4" w:uiPriority="70"/>
-    <w:lsdException w:name="Colorful Shading Accent 4" w:uiPriority="71"/>
-    <w:lsdException w:name="Colorful List Accent 4" w:uiPriority="72"/>
-    <w:lsdException w:name="Colorful Grid Accent 4" w:uiPriority="73"/>
-    <w:lsdException w:name="Light Shading Accent 5" w:uiPriority="60"/>
-    <w:lsdException w:name="Light List Accent 5" w:uiPriority="61"/>
-    <w:lsdException w:name="Light Grid Accent 5" w:uiPriority="62"/>
-    <w:lsdException w:name="Medium Shading 1 Accent 5" w:uiPriority="63"/>
-    <w:lsdException w:name="Medium Shading 2 Accent 5" w:uiPriority="64"/>
-    <w:lsdException w:name="Medium List 1 Accent 5" w:uiPriority="65"/>
-    <w:lsdException w:name="Medium List 2 Accent 5" w:uiPriority="66"/>
-    <w:lsdException w:name="Medium Grid 1 Accent 5" w:uiPriority="67"/>
-    <w:lsdException w:name="Medium Grid 2 Accent 5" w:uiPriority="68"/>
-    <w:lsdException w:name="Medium Grid 3 Accent 5" w:uiPriority="69"/>
-    <w:lsdException w:name="Dark List Accent 5" w:uiPriority="70"/>
-    <w:lsdException w:name="Colorful Shading Accent 5" w:uiPriority="71"/>
-    <w:lsdException w:name="Colorful List Accent 5" w:uiPriority="72"/>
-    <w:lsdException w:name="Colorful Grid Accent 5" w:uiPriority="73"/>
-    <w:lsdException w:name="Light Shading Accent 6" w:uiPriority="60"/>
-    <w:lsdException w:name="Light List Accent 6" w:uiPriority="61"/>
-    <w:lsdException w:name="Light Grid Accent 6" w:uiPriority="62"/>
-    <w:lsdException w:name="Medium Shading 1 Accent 6" w:uiPriority="63"/>
-    <w:lsdException w:name="Medium Shading 2 Accent 6" w:uiPriority="64"/>
-    <w:lsdException w:name="Medium List 1 Accent 6" w:uiPriority="65"/>
-    <w:lsdException w:name="Medium List 2 Accent 6" w:uiPriority="66"/>
-    <w:lsdException w:name="Medium Grid 1 Accent 6" w:uiPriority="67"/>
-    <w:lsdException w:name="Medium Grid 2 Accent 6" w:uiPriority="68"/>
-    <w:lsdException w:name="Medium Grid 3 Accent 6" w:uiPriority="69"/>
-    <w:lsdException w:name="Dark List Accent 6" w:uiPriority="70"/>
-    <w:lsdException w:name="Colorful Shading Accent 6" w:uiPriority="71"/>
-    <w:lsdException w:name="Colorful List Accent 6" w:uiPriority="72"/>
-    <w:lsdException w:name="Colorful Grid Accent 6" w:uiPriority="73"/>
-    <w:lsdException w:name="Subtle Emphasis" w:uiPriority="19" w:qFormat="1"/>
-    <w:lsdException w:name="Intense Emphasis" w:uiPriority="21" w:qFormat="1"/>
-    <w:lsdException w:name="Subtle Reference" w:uiPriority="31" w:qFormat="1"/>
-    <w:lsdException w:name="Intense Reference" w:uiPriority="32" w:qFormat="1"/>
-    <w:lsdException w:name="Book Title" w:uiPriority="33" w:qFormat="1"/>
-    <w:lsdException w:name="Bibliography" w:semiHidden="1" w:uiPriority="37" w:unhideWhenUsed="1"/>
-    <w:lsdException w:name="TOC Heading" w:semiHidden="1" w:uiPriority="39" w:unhideWhenUsed="1" w:qFormat="1"/>
-    <w:lsdException w:name="Plain Table 1" w:uiPriority="41"/>
-    <w:lsdException w:name="Plain Table 2" w:uiPriority="42"/>
-    <w:lsdException w:name="Plain Table 3" w:uiPriority="43"/>
-    <w:lsdException w:name="Plain Table 4" w:uiPriority="44"/>
-    <w:lsdException w:name="Plain Table 5" w:uiPriority="45"/>
-    <w:lsdException w:name="Grid Table Light" w:uiPriority="40"/>
-    <w:lsdException w:name="Grid Table 1 Light" w:uiPriority="46"/>
-    <w:lsdException w:name="Grid Table 2" w:uiPriority="47"/>
-    <w:lsdException w:name="Grid Table 3" w:uiPriority="48"/>
-    <w:lsdException w:name="Grid Table 4" w:uiPriority="49"/>
-    <w:lsdException w:name="Grid Table 5 Dark" w:uiPriority="50"/>
-    <w:lsdException w:name="Grid Table 6 Colorful" w:uiPriority="51"/>
-    <w:lsdException w:name="Grid Table 7 Colorful" w:uiPriority="52"/>
-    <w:lsdException w:name="Grid Table 1 Light Accent 1" w:uiPriority="46"/>
-    <w:lsdException w:name="Grid Table 2 Accent 1" w:uiPriority="47"/>
-    <w:lsdException w:name="Grid Table 3 Accent 1" w:uiPriority="48"/>
-    <w:lsdException w:name="Grid Table 4 Accent 1" w:uiPriority="49"/>
-    <w:lsdException w:name="Grid Table 5 Dark Accent 1" w:uiPriority="50"/>
-    <w:lsdException w:name="Grid Table 6 Colorful Accent 1" w:uiPriority="51"/>
-    <w:lsdException w:name="Grid Table 7 Colorful Accent 1" w:uiPriority="52"/>
-    <w:lsdException w:name="Grid Table 1 Light Accent 2" w:uiPriority="46"/>
-    <w:lsdException w:name="Grid Table 2 Accent 2" w:uiPriority="47"/>
-    <w:lsdException w:name="Grid Table 3 Accent 2" w:uiPriority="48"/>
-    <w:lsdException w:name="Grid Table 4 Accent 2" w:uiPriority="49"/>
-    <w:lsdException w:name="Grid Table 5 Dark Accent 2" w:uiPriority="50"/>
-    <w:lsdException w:name="Grid Table 6 Colorful Accent 2" w:uiPriority="51"/>
-    <w:lsdException w:name="Grid Table 7 Colorful Accent 2" w:uiPriority="52"/>
-    <w:lsdException w:name="Grid Table 1 Light Accent 3" w:uiPriority="46"/>
-    <w:lsdException w:name="Grid Table 2 Accent 3" w:uiPriority="47"/>
-    <w:lsdException w:name="Grid Table 3 Accent 3" w:uiPriority="48"/>
-    <w:lsdException w:name="Grid Table 4 Accent 3" w:uiPriority="49"/>
-    <w:lsdException w:name="Grid Table 5 Dark Accent 3" w:uiPriority="50"/>
-    <w:lsdException w:name="Grid Table 6 Colorful Accent 3" w:uiPriority="51"/>
-    <w:lsdException w:name="Grid Table 7 Colorful Accent 3" w:uiPriority="52"/>
-    <w:lsdException w:name="Grid Table 1 Light Accent 4" w:uiPriority="46"/>
-    <w:lsdException w:name="Grid Table 2 Accent 4" w:uiPriority="47"/>
-    <w:lsdException w:name="Grid Table 3 Accent 4" w:uiPriority="48"/>
-    <w:lsdException w:name="Grid Table 4 Accent 4" w:uiPriority="49"/>
-    <w:lsdException w:name="Grid Table 5 Dark Accent 4" w:uiPriority="50"/>
-    <w:lsdException w:name="Grid Table 6 Colorful Accent 4" w:uiPriority="51"/>
-    <w:lsdException w:name="Grid Table 7 Colorful Accent 4" w:uiPriority="52"/>
-    <w:lsdException w:name="Grid Table 1 Light Accent 5" w:uiPriority="46"/>
-    <w:lsdException w:name="Grid Table 2 Accent 5" w:uiPriority="47"/>
-    <w:lsdException w:name="Grid Table 3 Accent 5" w:uiPriority="48"/>
-    <w:lsdException w:name="Grid Table 4 Accent 5" w:uiPriority="49"/>
-    <w:lsdException w:name="Grid Table 5 Dark Accent 5" w:uiPriority="50"/>
-    <w:lsdException w:name="Grid Table 6 Colorful Accent 5" w:uiPriority="51"/>
-    <w:lsdException w:name="Grid Table 7 Colorful Accent 5" w:uiPriority="52"/>
-    <w:lsdException w:name="Grid Table 1 Light Accent 6" w:uiPriority="46"/>
-    <w:lsdException w:name="Grid Table 2 Accent 6" w:uiPriority="47"/>
-    <w:lsdException w:name="Grid Table 3 Accent 6" w:uiPriority="48"/>
-    <w:lsdException w:name="Grid Table 4 Accent 6" w:uiPriority="49"/>
-    <w:lsdException w:name="Grid Table 5 Dark Accent 6" w:uiPriority="50"/>
-    <w:lsdException w:name="Grid Table 6 Colorful Accent 6" w:uiPriority="51"/>
-    <w:lsdException w:name="Grid Table 7 Colorful Accent 6" w:uiPriority="52"/>
-    <w:lsdException w:name="List Table 1 Light" w:uiPriority="46"/>
-    <w:lsdException w:name="List Table 2" w:uiPriority="47"/>
-    <w:lsdException w:name="List Table 3" w:uiPriority="48"/>
-    <w:lsdException w:name="List Table 4" w:uiPriority="49"/>
-    <w:lsdException w:name="List Table 5 Dark" w:uiPriority="50"/>
-    <w:lsdException w:name="List Table 6 Colorful" w:uiPriority="51"/>
-    <w:lsdException w:name="List Table 7 Colorful" w:uiPriority="52"/>
-    <w:lsdException w:name="List Table 1 Light Accent 1" w:uiPriority="46"/>
-    <w:lsdException w:name="List Table 2 Accent 1" w:uiPriority="47"/>
-    <w:lsdException w:name="List Table 3 Accent 1" w:uiPriority="48"/>
-    <w:lsdException w:name="List Table 4 Accent 1" w:uiPriority="49"/>
-    <w:lsdException w:name="List Table 5 Dark Accent 1" w:uiPriority="50"/>
-    <w:lsdException w:name="List Table 6 Colorful Accent 1" w:uiPriority="51"/>
-    <w:lsdException w:name="List Table 7 Colorful Accent 1" w:uiPriority="52"/>
-    <w:lsdException w:name="List Table 1 Light Accent 2" w:uiPriority="46"/>
-    <w:lsdException w:name="List Table 2 Accent 2" w:uiPriority="47"/>
-    <w:lsdException w:name="List Table 3 Accent 2" w:uiPriority="48"/>
-    <w:lsdException w:name="List Table 4 Accent 2" w:uiPriority="49"/>
-    <w:lsdException w:name="List Table 5 Dark Accent 2" w:uiPriority="50"/>
-    <w:lsdException w:name="List Table 6 Colorful Accent 2" w:uiPriority="51"/>
-    <w:lsdException w:name="List Table 7 Colorful Accent 2" w:uiPriority="52"/>
-    <w:lsdException w:name="List Table 1 Light Accent 3" w:uiPriority="46"/>
-    <w:lsdException w:name="List Table 2 Accent 3" w:uiPriority="47"/>
-    <w:lsdException w:name="List Table 3 Accent 3" w:uiPriority="48"/>
-    <w:lsdException w:name="List Table 4 Accent 3" w:uiPriority="49"/>
-    <w:lsdException w:name="List Table 5 Dark Accent 3" w:uiPriority="50"/>
-    <w:lsdException w:name="List Table 6 Colorful Accent 3" w:uiPriority="51"/>
-    <w:lsdException w:name="List Table 7 Colorful Accent 3" w:uiPriority="52"/>
-    <w:lsdException w:name="List Table 1 Light Accent 4" w:uiPriority="46"/>
-    <w:lsdException w:name="List Table 2 Accent 4" w:uiPriority="47"/>
-    <w:lsdException w:name="List Table 3 Accent 4" w:uiPriority="48"/>
-    <w:lsdException w:name="List Table 4 Accent 4" w:uiPriority="49"/>
-    <w:lsdException w:name="List Table 5 Dark Accent 4" w:uiPriority="50"/>
-    <w:lsdException w:name="List Table 6 Colorful Accent 4" w:uiPriority="51"/>
-    <w:lsdException w:name="List Table 7 Colorful Accent 4" w:uiPriority="52"/>
-    <w:lsdException w:name="List Table 1 Light Accent 5" w:uiPriority="46"/>
-    <w:lsdException w:name="List Table 2 Accent 5" w:uiPriority="47"/>
-    <w:lsdException w:name="List Table 3 Accent 5" w:uiPriority="48"/>
-    <w:lsdException w:name="List Table 4 Accent 5" w:uiPriority="49"/>
-    <w:lsdException w:name="List Table 5 Dark Accent 5" w:uiPriority="50"/>
-    <w:lsdException w:name="List Table 6 Colorful Accent 5" w:uiPriority="51"/>
-    <w:lsdException w:name="List Table 7 Colorful Accent 5" w:uiPriority="52"/>
-    <w:lsdException w:name="List Table 1 Light Accent 6" w:uiPriority="46"/>
-    <w:lsdException w:name="List Table 2 Accent 6" w:uiPriority="47"/>
-    <w:lsdException w:name="List Table 3 Accent 6" w:uiPriority="48"/>
-    <w:lsdException w:name="List Table 4 Accent 6" w:uiPriority="49"/>
-    <w:lsdException w:name="List Table 5 Dark Accent 6" w:uiPriority="50"/>
-    <w:lsdException w:name="List Table 6 Colorful Accent 6" w:uiPriority="51"/>
-    <w:lsdException w:name="List Table 7 Colorful Accent 6" w:uiPriority="52"/>
-    <w:lsdException w:name="Mention" w:semiHidden="1" w:unhideWhenUsed="1"/>
-    <w:lsdException w:name="Smart Hyperlink" w:semiHidden="1" w:unhideWhenUsed="1"/>
-    <w:lsdException w:name="Hashtag" w:semiHidden="1" w:unhideWhenUsed="1"/>
-    <w:lsdException w:name="Unresolved Mention" w:semiHidden="1" w:unhideWhenUsed="1"/>
+  <w:latentStyles w:count="260" w:defQFormat="0" w:defUnhideWhenUsed="1" w:defSemiHidden="1" w:defUIPriority="99" w:defLockedState="0">
+    <w:lsdException w:qFormat="1" w:unhideWhenUsed="0" w:uiPriority="0" w:semiHidden="0" w:name="Normal"/>
+    <w:lsdException w:qFormat="1" w:unhideWhenUsed="0" w:uiPriority="9" w:semiHidden="0" w:name="heading 1"/>
+    <w:lsdException w:qFormat="1" w:uiPriority="9" w:name="heading 2"/>
+    <w:lsdException w:qFormat="1" w:uiPriority="9" w:name="heading 3"/>
+    <w:lsdException w:qFormat="1" w:uiPriority="9" w:name="heading 4"/>
+    <w:lsdException w:qFormat="1" w:uiPriority="9" w:name="heading 5"/>
+    <w:lsdException w:qFormat="1" w:uiPriority="9" w:name="heading 6"/>
+    <w:lsdException w:qFormat="1" w:uiPriority="9" w:name="heading 7"/>
+    <w:lsdException w:qFormat="1" w:uiPriority="9" w:name="heading 8"/>
+    <w:lsdException w:qFormat="1" w:uiPriority="9" w:name="heading 9"/>
+    <w:lsdException w:uiPriority="99" w:name="index 1"/>
+    <w:lsdException w:uiPriority="99" w:name="index 2"/>
+    <w:lsdException w:uiPriority="99" w:name="index 3"/>
+    <w:lsdException w:uiPriority="99" w:name="index 4"/>
+    <w:lsdException w:uiPriority="99" w:name="index 5"/>
+    <w:lsdException w:uiPriority="99" w:name="index 6"/>
+    <w:lsdException w:uiPriority="99" w:name="index 7"/>
+    <w:lsdException w:uiPriority="99" w:name="index 8"/>
+    <w:lsdException w:uiPriority="99" w:name="index 9"/>
+    <w:lsdException w:uiPriority="39" w:name="toc 1"/>
+    <w:lsdException w:uiPriority="39" w:name="toc 2"/>
+    <w:lsdException w:uiPriority="39" w:name="toc 3"/>
+    <w:lsdException w:uiPriority="39" w:name="toc 4"/>
+    <w:lsdException w:uiPriority="39" w:name="toc 5"/>
+    <w:lsdException w:uiPriority="39" w:name="toc 6"/>
+    <w:lsdException w:uiPriority="39" w:name="toc 7"/>
+    <w:lsdException w:uiPriority="39" w:name="toc 8"/>
+    <w:lsdException w:uiPriority="39" w:name="toc 9"/>
+    <w:lsdException w:uiPriority="99" w:name="Normal Indent"/>
+    <w:lsdException w:uiPriority="99" w:name="footnote text"/>
+    <w:lsdException w:uiPriority="99" w:name="annotation text"/>
+    <w:lsdException w:qFormat="1" w:uiPriority="99" w:semiHidden="0" w:name="header"/>
+    <w:lsdException w:qFormat="1" w:uiPriority="99" w:semiHidden="0" w:name="footer"/>
+    <w:lsdException w:uiPriority="99" w:name="index heading"/>
+    <w:lsdException w:qFormat="1" w:uiPriority="35" w:name="caption"/>
+    <w:lsdException w:uiPriority="99" w:name="table of figures"/>
+    <w:lsdException w:uiPriority="99" w:name="envelope address"/>
+    <w:lsdException w:uiPriority="99" w:name="envelope return"/>
+    <w:lsdException w:uiPriority="99" w:name="footnote reference"/>
+    <w:lsdException w:uiPriority="99" w:name="annotation reference"/>
+    <w:lsdException w:uiPriority="99" w:name="line number"/>
+    <w:lsdException w:uiPriority="99" w:name="page number"/>
+    <w:lsdException w:uiPriority="99" w:name="endnote reference"/>
+    <w:lsdException w:uiPriority="99" w:name="endnote text"/>
+    <w:lsdException w:uiPriority="99" w:name="table of authorities"/>
+    <w:lsdException w:uiPriority="99" w:name="macro"/>
+    <w:lsdException w:uiPriority="99" w:name="toa heading"/>
+    <w:lsdException w:uiPriority="99" w:name="List"/>
+    <w:lsdException w:uiPriority="99" w:name="List Bullet"/>
+    <w:lsdException w:uiPriority="99" w:name="List Number"/>
+    <w:lsdException w:uiPriority="99" w:name="List 2"/>
+    <w:lsdException w:uiPriority="99" w:name="List 3"/>
+    <w:lsdException w:uiPriority="99" w:name="List 4"/>
+    <w:lsdException w:uiPriority="99" w:name="List 5"/>
+    <w:lsdException w:uiPriority="99" w:name="List Bullet 2"/>
+    <w:lsdException w:uiPriority="99" w:name="List Bullet 3"/>
+    <w:lsdException w:uiPriority="99" w:name="List Bullet 4"/>
+    <w:lsdException w:uiPriority="99" w:name="List Bullet 5"/>
+    <w:lsdException w:uiPriority="99" w:name="List Number 2"/>
+    <w:lsdException w:uiPriority="99" w:name="List Number 3"/>
+    <w:lsdException w:uiPriority="99" w:name="List Number 4"/>
+    <w:lsdException w:uiPriority="99" w:name="List Number 5"/>
+    <w:lsdException w:qFormat="1" w:unhideWhenUsed="0" w:uiPriority="10" w:semiHidden="0" w:name="Title"/>
+    <w:lsdException w:uiPriority="99" w:name="Closing"/>
+    <w:lsdException w:uiPriority="99" w:name="Signature"/>
+    <w:lsdException w:qFormat="1" w:uiPriority="1" w:name="Default Paragraph Font"/>
+    <w:lsdException w:uiPriority="99" w:name="Body Text"/>
+    <w:lsdException w:uiPriority="99" w:name="Body Text Indent"/>
+    <w:lsdException w:uiPriority="99" w:name="List Continue"/>
+    <w:lsdException w:uiPriority="99" w:name="List Continue 2"/>
+    <w:lsdException w:uiPriority="99" w:name="List Continue 3"/>
+    <w:lsdException w:uiPriority="99" w:name="List Continue 4"/>
+    <w:lsdException w:uiPriority="99" w:name="List Continue 5"/>
+    <w:lsdException w:uiPriority="99" w:name="Message Header"/>
+    <w:lsdException w:qFormat="1" w:unhideWhenUsed="0" w:uiPriority="11" w:semiHidden="0" w:name="Subtitle"/>
+    <w:lsdException w:uiPriority="99" w:name="Salutation"/>
+    <w:lsdException w:uiPriority="99" w:name="Date"/>
+    <w:lsdException w:uiPriority="99" w:name="Body Text First Indent"/>
+    <w:lsdException w:uiPriority="99" w:name="Body Text First Indent 2"/>
+    <w:lsdException w:uiPriority="99" w:name="Note Heading"/>
+    <w:lsdException w:uiPriority="99" w:name="Body Text 2"/>
+    <w:lsdException w:uiPriority="99" w:name="Body Text 3"/>
+    <w:lsdException w:uiPriority="99" w:name="Body Text Indent 2"/>
+    <w:lsdException w:uiPriority="99" w:name="Body Text Indent 3"/>
+    <w:lsdException w:uiPriority="99" w:name="Block Text"/>
+    <w:lsdException w:uiPriority="99" w:name="Hyperlink"/>
+    <w:lsdException w:uiPriority="99" w:name="FollowedHyperlink"/>
+    <w:lsdException w:qFormat="1" w:unhideWhenUsed="0" w:uiPriority="22" w:semiHidden="0" w:name="Strong"/>
+    <w:lsdException w:qFormat="1" w:unhideWhenUsed="0" w:uiPriority="20" w:semiHidden="0" w:name="Emphasis"/>
+    <w:lsdException w:uiPriority="99" w:name="Document Map"/>
+    <w:lsdException w:uiPriority="99" w:name="Plain Text"/>
+    <w:lsdException w:uiPriority="99" w:name="E-mail Signature"/>
+    <w:lsdException w:qFormat="1" w:uiPriority="99" w:semiHidden="0" w:name="Normal (Web)"/>
+    <w:lsdException w:uiPriority="99" w:name="HTML Acronym"/>
+    <w:lsdException w:uiPriority="99" w:name="HTML Address"/>
+    <w:lsdException w:uiPriority="99" w:name="HTML Cite"/>
+    <w:lsdException w:uiPriority="99" w:name="HTML Code"/>
+    <w:lsdException w:uiPriority="99" w:name="HTML Definition"/>
+    <w:lsdException w:uiPriority="99" w:name="HTML Keyboard"/>
+    <w:lsdException w:uiPriority="99" w:name="HTML Preformatted"/>
+    <w:lsdException w:uiPriority="99" w:name="HTML Sample"/>
+    <w:lsdException w:uiPriority="99" w:name="HTML Typewriter"/>
+    <w:lsdException w:uiPriority="99" w:name="HTML Variable"/>
+    <w:lsdException w:qFormat="1" w:uiPriority="99" w:name="Normal Table"/>
+    <w:lsdException w:uiPriority="99" w:name="annotation subject"/>
+    <w:lsdException w:uiPriority="99" w:name="Table Simple 1"/>
+    <w:lsdException w:uiPriority="99" w:name="Table Simple 2"/>
+    <w:lsdException w:uiPriority="99" w:name="Table Simple 3"/>
+    <w:lsdException w:uiPriority="99" w:name="Table Classic 1"/>
+    <w:lsdException w:uiPriority="99" w:name="Table Classic 2"/>
+    <w:lsdException w:uiPriority="99" w:name="Table Classic 3"/>
+    <w:lsdException w:uiPriority="99" w:name="Table Classic 4"/>
+    <w:lsdException w:uiPriority="99" w:name="Table Colorful 1"/>
+    <w:lsdException w:uiPriority="99" w:name="Table Colorful 2"/>
+    <w:lsdException w:uiPriority="99" w:name="Table Colorful 3"/>
+    <w:lsdException w:uiPriority="99" w:name="Table Columns 1"/>
+    <w:lsdException w:uiPriority="99" w:name="Table Columns 2"/>
+    <w:lsdException w:uiPriority="99" w:name="Table Columns 3"/>
+    <w:lsdException w:uiPriority="99" w:name="Table Columns 4"/>
+    <w:lsdException w:uiPriority="99" w:name="Table Columns 5"/>
+    <w:lsdException w:uiPriority="99" w:name="Table Grid 1"/>
+    <w:lsdException w:uiPriority="99" w:name="Table Grid 2"/>
+    <w:lsdException w:uiPriority="99" w:name="Table Grid 3"/>
+    <w:lsdException w:uiPriority="99" w:name="Table Grid 4"/>
+    <w:lsdException w:uiPriority="99" w:name="Table Grid 5"/>
+    <w:lsdException w:uiPriority="99" w:name="Table Grid 6"/>
+    <w:lsdException w:uiPriority="99" w:name="Table Grid 7"/>
+    <w:lsdException w:uiPriority="99" w:name="Table Grid 8"/>
+    <w:lsdException w:uiPriority="99" w:name="Table List 1"/>
+    <w:lsdException w:uiPriority="99" w:name="Table List 2"/>
+    <w:lsdException w:uiPriority="99" w:name="Table List 3"/>
+    <w:lsdException w:uiPriority="99" w:name="Table List 4"/>
+    <w:lsdException w:uiPriority="99" w:name="Table List 5"/>
+    <w:lsdException w:uiPriority="99" w:name="Table List 6"/>
+    <w:lsdException w:uiPriority="99" w:name="Table List 7"/>
+    <w:lsdException w:uiPriority="99" w:name="Table List 8"/>
+    <w:lsdException w:uiPriority="99" w:name="Table 3D effects 1"/>
+    <w:lsdException w:uiPriority="99" w:name="Table 3D effects 2"/>
+    <w:lsdException w:uiPriority="99" w:name="Table 3D effects 3"/>
+    <w:lsdException w:uiPriority="99" w:name="Table Contemporary"/>
+    <w:lsdException w:uiPriority="99" w:name="Table Elegant"/>
+    <w:lsdException w:uiPriority="99" w:name="Table Professional"/>
+    <w:lsdException w:uiPriority="99" w:name="Table Subtle 1"/>
+    <w:lsdException w:uiPriority="99" w:name="Table Subtle 2"/>
+    <w:lsdException w:uiPriority="99" w:name="Table Web 1"/>
+    <w:lsdException w:uiPriority="99" w:name="Table Web 2"/>
+    <w:lsdException w:uiPriority="99" w:name="Table Web 3"/>
+    <w:lsdException w:qFormat="1" w:uiPriority="99" w:name="Balloon Text"/>
+    <w:lsdException w:qFormat="1" w:unhideWhenUsed="0" w:uiPriority="59" w:semiHidden="0" w:name="Table Grid"/>
+    <w:lsdException w:uiPriority="99" w:name="Table Theme"/>
   </w:latentStyles>
-  <w:style w:type="paragraph" w:default="1" w:styleId="a">
+  <w:style w:type="paragraph" w:default="1" w:styleId="1">
     <w:name w:val="Normal"/>
     <w:qFormat/>
-    <w:rsid w:val="00497D66"/>
+    <w:uiPriority w:val="0"/>
     <w:pPr>
       <w:spacing w:after="0" w:line="240" w:lineRule="auto"/>
     </w:pPr>
+    <w:rPr>
+      <w:rFonts w:asciiTheme="minorHAnsi" w:hAnsiTheme="minorHAnsi" w:eastAsiaTheme="minorHAnsi" w:cstheme="minorBidi"/>
+      <w:sz w:val="22"/>
+      <w:szCs w:val="22"/>
+      <w:lang w:val="ru-RU" w:eastAsia="en-US" w:bidi="ar-SA"/>
+    </w:rPr>
   </w:style>
-  <w:style w:type="character" w:default="1" w:styleId="a0">
+  <w:style w:type="character" w:default="1" w:styleId="2">
     <w:name w:val="Default Paragraph Font"/>
-    <w:uiPriority w:val="1"/>
     <w:semiHidden/>
     <w:unhideWhenUsed/>
+    <w:qFormat/>
+    <w:uiPriority w:val="1"/>
   </w:style>
-  <w:style w:type="table" w:default="1" w:styleId="a1">
+  <w:style w:type="table" w:default="1" w:styleId="3">
     <w:name w:val="Normal Table"/>
-    <w:uiPriority w:val="99"/>
     <w:semiHidden/>
     <w:unhideWhenUsed/>
+    <w:qFormat/>
+    <w:uiPriority w:val="99"/>
     <w:tblPr>
-      <w:tblInd w:w="0" w:type="dxa"/>
       <w:tblCellMar>
         <w:top w:w="0" w:type="dxa"/>
         <w:left w:w="108" w:type="dxa"/>
@@ -5090,19 +4668,27 @@
       </w:tblCellMar>
     </w:tblPr>
   </w:style>
-  <w:style w:type="numbering" w:default="1" w:styleId="a2">
-    <w:name w:val="No List"/>
-    <w:uiPriority w:val="99"/>
+  <w:style w:type="paragraph" w:styleId="4">
+    <w:name w:val="Balloon Text"/>
+    <w:basedOn w:val="1"/>
+    <w:link w:val="11"/>
     <w:semiHidden/>
     <w:unhideWhenUsed/>
+    <w:qFormat/>
+    <w:uiPriority w:val="99"/>
+    <w:rPr>
+      <w:rFonts w:ascii="Tahoma" w:hAnsi="Tahoma" w:cs="Tahoma"/>
+      <w:sz w:val="16"/>
+      <w:szCs w:val="16"/>
+    </w:rPr>
   </w:style>
-  <w:style w:type="paragraph" w:styleId="a3">
+  <w:style w:type="paragraph" w:styleId="5">
     <w:name w:val="header"/>
-    <w:basedOn w:val="a"/>
-    <w:link w:val="a4"/>
+    <w:basedOn w:val="1"/>
+    <w:link w:val="9"/>
+    <w:unhideWhenUsed/>
+    <w:qFormat/>
     <w:uiPriority w:val="99"/>
-    <w:unhideWhenUsed/>
-    <w:rsid w:val="00DD4EB9"/>
     <w:pPr>
       <w:tabs>
         <w:tab w:val="center" w:pos="4677"/>
@@ -5110,20 +4696,13 @@
       </w:tabs>
     </w:pPr>
   </w:style>
-  <w:style w:type="character" w:customStyle="1" w:styleId="a4">
-    <w:name w:val="Верхний колонтитул Знак"/>
-    <w:basedOn w:val="a0"/>
-    <w:link w:val="a3"/>
+  <w:style w:type="paragraph" w:styleId="6">
+    <w:name w:val="footer"/>
+    <w:basedOn w:val="1"/>
+    <w:link w:val="10"/>
+    <w:unhideWhenUsed/>
+    <w:qFormat/>
     <w:uiPriority w:val="99"/>
-    <w:rsid w:val="00DD4EB9"/>
-  </w:style>
-  <w:style w:type="paragraph" w:styleId="a5">
-    <w:name w:val="footer"/>
-    <w:basedOn w:val="a"/>
-    <w:link w:val="a6"/>
-    <w:uiPriority w:val="99"/>
-    <w:unhideWhenUsed/>
-    <w:rsid w:val="00DD4EB9"/>
     <w:pPr>
       <w:tabs>
         <w:tab w:val="center" w:pos="4677"/>
@@ -5131,69 +4710,62 @@
       </w:tabs>
     </w:pPr>
   </w:style>
-  <w:style w:type="character" w:customStyle="1" w:styleId="a6">
-    <w:name w:val="Нижний колонтитул Знак"/>
-    <w:basedOn w:val="a0"/>
-    <w:link w:val="a5"/>
+  <w:style w:type="paragraph" w:styleId="7">
+    <w:name w:val="Normal (Web)"/>
+    <w:basedOn w:val="1"/>
+    <w:unhideWhenUsed/>
+    <w:qFormat/>
     <w:uiPriority w:val="99"/>
-    <w:rsid w:val="00DD4EB9"/>
+    <w:pPr>
+      <w:spacing w:before="100" w:beforeAutospacing="1" w:after="119"/>
+    </w:pPr>
+    <w:rPr>
+      <w:rFonts w:ascii="Times New Roman" w:hAnsi="Times New Roman" w:eastAsia="Times New Roman" w:cs="Times New Roman"/>
+      <w:sz w:val="24"/>
+      <w:szCs w:val="24"/>
+      <w:lang w:eastAsia="ru-RU"/>
+    </w:rPr>
   </w:style>
-  <w:style w:type="table" w:styleId="a7">
+  <w:style w:type="table" w:styleId="8">
     <w:name w:val="Table Grid"/>
-    <w:basedOn w:val="a1"/>
+    <w:basedOn w:val="3"/>
+    <w:qFormat/>
     <w:uiPriority w:val="59"/>
-    <w:rsid w:val="00DD4EB9"/>
     <w:pPr>
       <w:spacing w:after="0" w:line="240" w:lineRule="auto"/>
     </w:pPr>
     <w:tblPr>
       <w:tblBorders>
-        <w:top w:val="single" w:sz="4" w:space="0" w:color="000000" w:themeColor="text1"/>
-        <w:left w:val="single" w:sz="4" w:space="0" w:color="000000" w:themeColor="text1"/>
-        <w:bottom w:val="single" w:sz="4" w:space="0" w:color="000000" w:themeColor="text1"/>
-        <w:right w:val="single" w:sz="4" w:space="0" w:color="000000" w:themeColor="text1"/>
-        <w:insideH w:val="single" w:sz="4" w:space="0" w:color="000000" w:themeColor="text1"/>
-        <w:insideV w:val="single" w:sz="4" w:space="0" w:color="000000" w:themeColor="text1"/>
+        <w:top w:val="single" w:color="000000" w:themeColor="text1" w:sz="4" w:space="0"/>
+        <w:left w:val="single" w:color="000000" w:themeColor="text1" w:sz="4" w:space="0"/>
+        <w:bottom w:val="single" w:color="000000" w:themeColor="text1" w:sz="4" w:space="0"/>
+        <w:right w:val="single" w:color="000000" w:themeColor="text1" w:sz="4" w:space="0"/>
+        <w:insideH w:val="single" w:color="000000" w:themeColor="text1" w:sz="4" w:space="0"/>
+        <w:insideV w:val="single" w:color="000000" w:themeColor="text1" w:sz="4" w:space="0"/>
       </w:tblBorders>
     </w:tblPr>
   </w:style>
-  <w:style w:type="paragraph" w:styleId="a8">
-    <w:name w:val="Normal (Web)"/>
-    <w:basedOn w:val="a"/>
+  <w:style w:type="character" w:customStyle="1" w:styleId="9">
+    <w:name w:val="Верхний колонтитул Знак"/>
+    <w:basedOn w:val="2"/>
+    <w:link w:val="5"/>
+    <w:qFormat/>
     <w:uiPriority w:val="99"/>
-    <w:unhideWhenUsed/>
-    <w:rsid w:val="002E0C61"/>
-    <w:pPr>
-      <w:spacing w:before="100" w:beforeAutospacing="1" w:after="119"/>
-    </w:pPr>
-    <w:rPr>
-      <w:rFonts w:ascii="Times New Roman" w:eastAsia="Times New Roman" w:hAnsi="Times New Roman" w:cs="Times New Roman"/>
-      <w:sz w:val="24"/>
-      <w:szCs w:val="24"/>
-      <w:lang w:eastAsia="ru-RU"/>
-    </w:rPr>
   </w:style>
-  <w:style w:type="paragraph" w:styleId="a9">
-    <w:name w:val="Balloon Text"/>
-    <w:basedOn w:val="a"/>
-    <w:link w:val="aa"/>
+  <w:style w:type="character" w:customStyle="1" w:styleId="10">
+    <w:name w:val="Нижний колонтитул Знак"/>
+    <w:basedOn w:val="2"/>
+    <w:link w:val="6"/>
+    <w:qFormat/>
     <w:uiPriority w:val="99"/>
+  </w:style>
+  <w:style w:type="character" w:customStyle="1" w:styleId="11">
+    <w:name w:val="Текст выноски Знак"/>
+    <w:basedOn w:val="2"/>
+    <w:link w:val="4"/>
     <w:semiHidden/>
-    <w:unhideWhenUsed/>
-    <w:rsid w:val="00FB1922"/>
-    <w:rPr>
-      <w:rFonts w:ascii="Tahoma" w:hAnsi="Tahoma" w:cs="Tahoma"/>
-      <w:sz w:val="16"/>
-      <w:szCs w:val="16"/>
-    </w:rPr>
-  </w:style>
-  <w:style w:type="character" w:customStyle="1" w:styleId="aa">
-    <w:name w:val="Текст выноски Знак"/>
-    <w:basedOn w:val="a0"/>
-    <w:link w:val="a9"/>
+    <w:qFormat/>
     <w:uiPriority w:val="99"/>
-    <w:semiHidden/>
-    <w:rsid w:val="00FB1922"/>
     <w:rPr>
       <w:rFonts w:ascii="Tahoma" w:hAnsi="Tahoma" w:cs="Tahoma"/>
       <w:sz w:val="16"/>
@@ -5482,7 +5054,6 @@
     </a:fmtScheme>
   </a:themeElements>
   <a:objectDefaults/>
-  <a:extraClrSchemeLst/>
 </a:theme>
 </file>
 
@@ -5492,8 +5063,6 @@
 
 <file path=customXml/itemProps1.xml><?xml version="1.0" encoding="utf-8"?>
 <ds:datastoreItem xmlns:ds="http://schemas.openxmlformats.org/officeDocument/2006/customXml" ds:itemID="{19AA5618-E494-4521-AE8F-9CF8AB4DC159}">
-  <ds:schemaRefs>
-    <ds:schemaRef ds:uri="http://schemas.openxmlformats.org/officeDocument/2006/bibliography"/>
-  </ds:schemaRefs>
+  <ds:schemaRefs/>
 </ds:datastoreItem>
 </file>
</xml_diff>